<commit_message>
Ajusta textos de homologação e desenvolvedores
</commit_message>
<xml_diff>
--- a/plataforma_projetos/output/Plano_de_Testes_Plataforma_PROPEG.docx
+++ b/plataforma_projetos/output/Plano_de_Testes_Plataforma_PROPEG.docx
@@ -241,7 +241,7 @@
           </w:tcPr>
           <w:p>
             <w:r>
-              <w:t>Desenvolvimento local com base demonstrativa</w:t>
+              <w:t>Desenvolvimento local com base de homologação</w:t>
             </w:r>
           </w:p>
         </w:tc>
@@ -253,7 +253,7 @@
         <w:jc w:val="both"/>
       </w:pPr>
       <w:r>
-        <w:t>Este documento orienta a homologação manual de toda a plataforma, desde o cadastro e o login até a criação, tramitação, execução, finalização e consulta de projetos. Os casos utilizam a base demonstrativa criada no projeto e cobrem os perfis Coordenador, Aluno, Gestor e o acesso restrito do Centro de Estudos.</w:t>
+        <w:t>Este documento orienta a homologação manual de toda a plataforma, desde o cadastro e o login até a criação, tramitação, execução, finalização e consulta de projetos. Os casos utilizam a base de homologação criada no projeto e cobrem os perfis Coordenador, Aluno, Gestor e o acesso restrito do Centro de Estudos.</w:t>
       </w:r>
     </w:p>
     <w:p>
@@ -311,7 +311,7 @@
         <w:ind w:left="403" w:hanging="317"/>
       </w:pPr>
       <w:r>
-        <w:t>•  As contas e senhas abaixo são exclusivas do ambiente de demonstração.</w:t>
+        <w:t>•  As contas e senhas abaixo são exclusivas do ambiente de homologação.</w:t>
       </w:r>
     </w:p>
     <w:p>
@@ -508,7 +508,7 @@
         <w:pStyle w:val="Heading1"/>
       </w:pPr>
       <w:r>
-        <w:t>Credenciais da base demonstrativa</w:t>
+        <w:t>Credenciais da base de homologação</w:t>
       </w:r>
     </w:p>
     <w:p>
@@ -2533,7 +2533,7 @@
           </w:tcPr>
           <w:p>
             <w:r>
-              <w:t>Inteligência Artificial para Apoio à Gestão Acadêmica</w:t>
+              <w:t>Sistema de Indicadores para Gestão Acadêmica</w:t>
             </w:r>
           </w:p>
         </w:tc>
@@ -2681,7 +2681,7 @@
           </w:tcPr>
           <w:p>
             <w:r>
-              <w:t>Projeto aplicado ao apoio de decisões acadêmicas com uso responsável de inteligência artificial.</w:t>
+              <w:t>Projeto aplicado ao apoio de decisões acadêmicas por meio da organização e análise de indicadores.</w:t>
             </w:r>
           </w:p>
         </w:tc>
@@ -2941,7 +2941,7 @@
           </w:tcPr>
           <w:p>
             <w:r>
-              <w:t>inteligência artificial, gestão acadêmica, inovação</w:t>
+              <w:t>indicadores, gestão acadêmica, inovação</w:t>
             </w:r>
           </w:p>
         </w:tc>
@@ -3476,7 +3476,7 @@
         <w:t xml:space="preserve">Pré-condições: </w:t>
       </w:r>
       <w:r>
-        <w:t>Base demonstrativa carregada.</w:t>
+        <w:t>Base de homologação carregada.</w:t>
       </w:r>
     </w:p>
     <w:p>
@@ -3616,7 +3616,7 @@
         <w:t xml:space="preserve">Pré-condições: </w:t>
       </w:r>
       <w:r>
-        <w:t>Base demonstrativa carregada.</w:t>
+        <w:t>Base de homologação carregada.</w:t>
       </w:r>
     </w:p>
     <w:p>
@@ -4703,7 +4703,7 @@
         <w:t xml:space="preserve">Pré-condições: </w:t>
       </w:r>
       <w:r>
-        <w:t>Base demonstrativa carregada.</w:t>
+        <w:t>Base de homologação carregada.</w:t>
       </w:r>
     </w:p>
     <w:p>
@@ -7702,7 +7702,7 @@
         <w:t xml:space="preserve">Pré-condições: </w:t>
       </w:r>
       <w:r>
-        <w:t>Usar o link demonstrativo antes de consumi-lo.</w:t>
+        <w:t>Usar o link de homologação antes de consumi-lo.</w:t>
       </w:r>
     </w:p>
     <w:p>
@@ -8391,7 +8391,7 @@
         <w:ind w:left="403" w:hanging="317"/>
       </w:pPr>
       <w:r>
-        <w:t>•  Os totais refletem a base demonstrativa.</w:t>
+        <w:t>•  Os totais refletem a base de homologação.</w:t>
       </w:r>
     </w:p>
     <w:p>
@@ -8459,7 +8459,7 @@
         <w:t xml:space="preserve">Pré-condições: </w:t>
       </w:r>
       <w:r>
-        <w:t>Base demonstrativa carregada.</w:t>
+        <w:t>Base de homologação carregada.</w:t>
       </w:r>
     </w:p>
     <w:p>
@@ -8593,7 +8593,7 @@
         <w:t xml:space="preserve">Pré-condições: </w:t>
       </w:r>
       <w:r>
-        <w:t>Usuário de demonstração selecionado.</w:t>
+        <w:t>Usuário de homologação selecionado.</w:t>
       </w:r>
     </w:p>
     <w:p>
@@ -8727,7 +8727,7 @@
         <w:t xml:space="preserve">Pré-condições: </w:t>
       </w:r>
       <w:r>
-        <w:t>Criar uma conta temporária sem projetos; manter usuários demonstrativos vinculados.</w:t>
+        <w:t>Criar uma conta temporária sem projetos; manter os usuários de homologação vinculados.</w:t>
       </w:r>
     </w:p>
     <w:p>
@@ -9625,7 +9625,7 @@
         <w:t xml:space="preserve">Pré-condições: </w:t>
       </w:r>
       <w:r>
-        <w:t>Base demonstrativa carregada.</w:t>
+        <w:t>Base de homologação carregada.</w:t>
       </w:r>
     </w:p>
     <w:p>
@@ -11692,7 +11692,7 @@
         <w:t xml:space="preserve">Pré-condições: </w:t>
       </w:r>
       <w:r>
-        <w:t>Usuário possui a notificação demonstrativa.</w:t>
+        <w:t>Usuário possui a notificação de homologação.</w:t>
       </w:r>
     </w:p>
     <w:p>
@@ -12491,7 +12491,7 @@
         <w:t xml:space="preserve">Pré-condições: </w:t>
       </w:r>
       <w:r>
-        <w:t>Link demonstrativo disponível.</w:t>
+        <w:t>Link de homologação disponível.</w:t>
       </w:r>
     </w:p>
     <w:p>
@@ -13222,7 +13222,7 @@
           </w:tcPr>
           <w:p>
             <w:r>
-              <w:t>Restaurar demonstração</w:t>
+              <w:t>Restaurar base de homologação</w:t>
             </w:r>
           </w:p>
         </w:tc>

</xml_diff>

<commit_message>
Adiciona amostra segura e atualiza plano de testes de produção
</commit_message>
<xml_diff>
--- a/plataforma_projetos/output/Plano_de_Testes_Plataforma_PROPEG.docx
+++ b/plataforma_projetos/output/Plano_de_Testes_Plataforma_PROPEG.docx
@@ -61,7 +61,7 @@
           <w:b/>
           <w:sz w:val="30"/>
         </w:rPr>
-        <w:t>Roteiro de homologação funcional por perfil e fluxo</w:t>
+        <w:t>Roteiro de validação funcional no ambiente de produção</w:t>
       </w:r>
     </w:p>
     <w:tbl>
@@ -85,6 +85,9 @@
         <w:gridCol w:w="5040"/>
       </w:tblGrid>
       <w:tr>
+        <w:trPr>
+          <w:cantSplit w:val="true"/>
+        </w:trPr>
         <w:tc>
           <w:tcPr>
             <w:tcW w:type="dxa" w:w="2232"/>
@@ -126,6 +129,9 @@
         </w:tc>
       </w:tr>
       <w:tr>
+        <w:trPr>
+          <w:cantSplit w:val="true"/>
+        </w:trPr>
         <w:tc>
           <w:tcPr>
             <w:tcW w:type="dxa" w:w="2232"/>
@@ -160,12 +166,15 @@
           </w:tcPr>
           <w:p>
             <w:r>
-              <w:t>1.0</w:t>
+              <w:t>2.0</w:t>
             </w:r>
           </w:p>
         </w:tc>
       </w:tr>
       <w:tr>
+        <w:trPr>
+          <w:cantSplit w:val="true"/>
+        </w:trPr>
         <w:tc>
           <w:tcPr>
             <w:tcW w:type="dxa" w:w="2232"/>
@@ -207,6 +216,9 @@
         </w:tc>
       </w:tr>
       <w:tr>
+        <w:trPr>
+          <w:cantSplit w:val="true"/>
+        </w:trPr>
         <w:tc>
           <w:tcPr>
             <w:tcW w:type="dxa" w:w="2232"/>
@@ -241,7 +253,7 @@
           </w:tcPr>
           <w:p>
             <w:r>
-              <w:t>Desenvolvimento local com base de homologação</w:t>
+              <w:t>Produção no Render com dados temporários de amostra</w:t>
             </w:r>
           </w:p>
         </w:tc>
@@ -253,7 +265,7 @@
         <w:jc w:val="both"/>
       </w:pPr>
       <w:r>
-        <w:t>Este documento orienta a homologação manual de toda a plataforma, desde o cadastro e o login até a criação, tramitação, execução, finalização e consulta de projetos. Os casos utilizam a base de homologação criada no projeto e cobrem os perfis Coordenador, Aluno, Gestor e o acesso restrito do Centro de Estudos.</w:t>
+        <w:t>Este documento orienta a validação manual da plataforma publicada no Render, desde o cadastro e o login até a criação, tramitação, execução, finalização e consulta de projetos. Os casos utilizam dados temporários de amostra e cobrem os perfis Coordenador, Aluno, Gestor e o acesso restrito do Centro de Estudos. As operações realizadas alteram o banco de produção e devem permanecer limitadas às contas e aos registros descritos neste roteiro.</w:t>
       </w:r>
     </w:p>
     <w:p>
@@ -279,7 +291,7 @@
         <w:ind w:left="403" w:hanging="317"/>
       </w:pPr>
       <w:r>
-        <w:t>•  Inicie o servidor com python manage.py runserver.</w:t>
+        <w:t>•  Acesse https://propeg-plataforma.onrender.com/projetos/.</w:t>
       </w:r>
     </w:p>
     <w:p>
@@ -287,7 +299,7 @@
         <w:ind w:left="403" w:hanging="317"/>
       </w:pPr>
       <w:r>
-        <w:t>•  Acesse http://127.0.0.1:8000/.</w:t>
+        <w:t>•  Use somente as contas e os projetos de amostra identificados neste documento.</w:t>
       </w:r>
     </w:p>
     <w:p>
@@ -295,7 +307,7 @@
         <w:ind w:left="403" w:hanging="317"/>
       </w:pPr>
       <w:r>
-        <w:t>•  Para restaurar os dados, execute python manage.py povoar_demonstracao --confirmar.</w:t>
+        <w:t>•  Antes de cada fluxo completo, escolha um projeto de amostra que ainda não tenha sido alterado ou crie um novo projeto com uma das contas de coordenador.</w:t>
       </w:r>
     </w:p>
     <w:p>
@@ -303,6 +315,14 @@
         <w:ind w:left="403" w:hanging="317"/>
       </w:pPr>
       <w:r>
+        <w:t>•  Para testar envio de e-mail, substitua temporariamente o e-mail de uma conta de amostra por uma caixa postal que você controle.</w:t>
+      </w:r>
+    </w:p>
+    <w:p>
+      <w:pPr>
+        <w:ind w:left="403" w:hanging="317"/>
+      </w:pPr>
+      <w:r>
         <w:t>•  Use um navegador atualizado e, para responsividade, teste também uma largura próxima de 390 px.</w:t>
       </w:r>
     </w:p>
@@ -311,7 +331,7 @@
         <w:ind w:left="403" w:hanging="317"/>
       </w:pPr>
       <w:r>
-        <w:t>•  As contas e senhas abaixo são exclusivas do ambiente de homologação.</w:t>
+        <w:t>•  As credenciais abaixo são temporárias e devem ser removidas ao fim da validação.</w:t>
       </w:r>
     </w:p>
     <w:p>
@@ -344,6 +364,7 @@
       </w:tblGrid>
       <w:tr>
         <w:trPr>
+          <w:cantSplit w:val="true"/>
           <w:tblHeader w:val="true"/>
         </w:trPr>
         <w:tc>
@@ -392,6 +413,9 @@
         </w:tc>
       </w:tr>
       <w:tr>
+        <w:trPr>
+          <w:cantSplit w:val="true"/>
+        </w:trPr>
         <w:tc>
           <w:tcPr>
             <w:tcW w:type="dxa" w:w="1944"/>
@@ -428,6 +452,9 @@
         </w:tc>
       </w:tr>
       <w:tr>
+        <w:trPr>
+          <w:cantSplit w:val="true"/>
+        </w:trPr>
         <w:tc>
           <w:tcPr>
             <w:tcW w:type="dxa" w:w="1944"/>
@@ -466,6 +493,9 @@
         </w:tc>
       </w:tr>
       <w:tr>
+        <w:trPr>
+          <w:cantSplit w:val="true"/>
+        </w:trPr>
         <w:tc>
           <w:tcPr>
             <w:tcW w:type="dxa" w:w="1944"/>
@@ -508,12 +538,12 @@
         <w:pStyle w:val="Heading1"/>
       </w:pPr>
       <w:r>
-        <w:t>Credenciais da base de homologação</w:t>
-      </w:r>
-    </w:p>
-    <w:p>
-      <w:r>
-        <w:t>O CPF pode ser digitado com ou sem pontuação. As senhas diferem por perfil para facilitar a execução dos testes e não devem ser reutilizadas fora do ambiente local.</w:t>
+        <w:t>Credenciais da amostra em produção</w:t>
+      </w:r>
+    </w:p>
+    <w:p>
+      <w:r>
+        <w:t>O CPF pode ser digitado com ou sem pontuação. As senhas diferem por perfil para facilitar a execução dos testes e não devem ser reutilizadas em contas pessoais ou institucionais.</w:t>
       </w:r>
     </w:p>
     <w:tbl>
@@ -540,6 +570,7 @@
       </w:tblGrid>
       <w:tr>
         <w:trPr>
+          <w:cantSplit w:val="true"/>
           <w:tblHeader w:val="true"/>
         </w:trPr>
         <w:tc>
@@ -632,6 +663,9 @@
         </w:tc>
       </w:tr>
       <w:tr>
+        <w:trPr>
+          <w:cantSplit w:val="true"/>
+        </w:trPr>
         <w:tc>
           <w:tcPr>
             <w:tcW w:type="dxa" w:w="1800"/>
@@ -702,6 +736,9 @@
         </w:tc>
       </w:tr>
       <w:tr>
+        <w:trPr>
+          <w:cantSplit w:val="true"/>
+        </w:trPr>
         <w:tc>
           <w:tcPr>
             <w:tcW w:type="dxa" w:w="1800"/>
@@ -776,6 +813,9 @@
         </w:tc>
       </w:tr>
       <w:tr>
+        <w:trPr>
+          <w:cantSplit w:val="true"/>
+        </w:trPr>
         <w:tc>
           <w:tcPr>
             <w:tcW w:type="dxa" w:w="1800"/>
@@ -846,6 +886,9 @@
         </w:tc>
       </w:tr>
       <w:tr>
+        <w:trPr>
+          <w:cantSplit w:val="true"/>
+        </w:trPr>
         <w:tc>
           <w:tcPr>
             <w:tcW w:type="dxa" w:w="1800"/>
@@ -920,6 +963,9 @@
         </w:tc>
       </w:tr>
       <w:tr>
+        <w:trPr>
+          <w:cantSplit w:val="true"/>
+        </w:trPr>
         <w:tc>
           <w:tcPr>
             <w:tcW w:type="dxa" w:w="1800"/>
@@ -990,6 +1036,9 @@
         </w:tc>
       </w:tr>
       <w:tr>
+        <w:trPr>
+          <w:cantSplit w:val="true"/>
+        </w:trPr>
         <w:tc>
           <w:tcPr>
             <w:tcW w:type="dxa" w:w="1800"/>
@@ -1064,6 +1113,9 @@
         </w:tc>
       </w:tr>
       <w:tr>
+        <w:trPr>
+          <w:cantSplit w:val="true"/>
+        </w:trPr>
         <w:tc>
           <w:tcPr>
             <w:tcW w:type="dxa" w:w="1800"/>
@@ -1134,6 +1186,9 @@
         </w:tc>
       </w:tr>
       <w:tr>
+        <w:trPr>
+          <w:cantSplit w:val="true"/>
+        </w:trPr>
         <w:tc>
           <w:tcPr>
             <w:tcW w:type="dxa" w:w="1800"/>
@@ -1208,6 +1263,9 @@
         </w:tc>
       </w:tr>
       <w:tr>
+        <w:trPr>
+          <w:cantSplit w:val="true"/>
+        </w:trPr>
         <w:tc>
           <w:tcPr>
             <w:tcW w:type="dxa" w:w="1800"/>
@@ -1284,6 +1342,571 @@
         <w:pStyle w:val="Heading1"/>
       </w:pPr>
       <w:r>
+        <w:t>Caminhos do ambiente de produção</w:t>
+      </w:r>
+    </w:p>
+    <w:tbl>
+      <w:tblPr>
+        <w:tblStyle w:val="TableGrid"/>
+        <w:tblW w:type="auto" w:w="0"/>
+        <w:jc w:val="center"/>
+        <w:tblLayout w:type="fixed"/>
+        <w:tblLook w:firstColumn="1" w:firstRow="1" w:lastColumn="0" w:lastRow="0" w:noHBand="0" w:noVBand="1" w:val="04A0"/>
+        <w:tblBorders>
+          <w:top w:val="single" w:sz="6" w:color="D9D9D9"/>
+          <w:left w:val="single" w:sz="6" w:color="D9D9D9"/>
+          <w:bottom w:val="single" w:sz="6" w:color="D9D9D9"/>
+          <w:right w:val="single" w:sz="6" w:color="D9D9D9"/>
+          <w:insideH w:val="single" w:sz="6" w:color="D9D9D9"/>
+          <w:insideV w:val="single" w:sz="6" w:color="D9D9D9"/>
+        </w:tblBorders>
+      </w:tblPr>
+      <w:tblGrid>
+        <w:gridCol w:w="5040"/>
+        <w:gridCol w:w="5040"/>
+      </w:tblGrid>
+      <w:tr>
+        <w:trPr>
+          <w:cantSplit w:val="true"/>
+          <w:tblHeader w:val="true"/>
+        </w:trPr>
+        <w:tc>
+          <w:tcPr>
+            <w:tcW w:type="dxa" w:w="3168"/>
+            <w:tcMar>
+              <w:top w:w="100" w:type="dxa"/>
+              <w:start w:w="120" w:type="dxa"/>
+              <w:bottom w:w="100" w:type="dxa"/>
+              <w:end w:w="120" w:type="dxa"/>
+            </w:tcMar>
+            <w:vAlign w:val="center"/>
+            <w:shd w:fill="0B3D6E"/>
+          </w:tcPr>
+          <w:p>
+            <w:r>
+              <w:rPr>
+                <w:b/>
+                <w:color w:val="FFFFFF"/>
+              </w:rPr>
+              <w:t>Função</w:t>
+            </w:r>
+          </w:p>
+        </w:tc>
+        <w:tc>
+          <w:tcPr>
+            <w:tcW w:type="dxa" w:w="6624"/>
+            <w:tcMar>
+              <w:top w:w="100" w:type="dxa"/>
+              <w:start w:w="120" w:type="dxa"/>
+              <w:bottom w:w="100" w:type="dxa"/>
+              <w:end w:w="120" w:type="dxa"/>
+            </w:tcMar>
+            <w:vAlign w:val="center"/>
+            <w:shd w:fill="0B3D6E"/>
+          </w:tcPr>
+          <w:p>
+            <w:r>
+              <w:rPr>
+                <w:b/>
+                <w:color w:val="FFFFFF"/>
+              </w:rPr>
+              <w:t>URL</w:t>
+            </w:r>
+          </w:p>
+        </w:tc>
+      </w:tr>
+      <w:tr>
+        <w:trPr>
+          <w:cantSplit w:val="true"/>
+        </w:trPr>
+        <w:tc>
+          <w:tcPr>
+            <w:tcW w:type="dxa" w:w="3168"/>
+            <w:tcMar>
+              <w:top w:w="100" w:type="dxa"/>
+              <w:start w:w="120" w:type="dxa"/>
+              <w:bottom w:w="100" w:type="dxa"/>
+              <w:end w:w="120" w:type="dxa"/>
+            </w:tcMar>
+            <w:vAlign w:val="center"/>
+          </w:tcPr>
+          <w:p>
+            <w:r>
+              <w:t>Entrada e autenticação</w:t>
+            </w:r>
+          </w:p>
+        </w:tc>
+        <w:tc>
+          <w:tcPr>
+            <w:tcW w:type="dxa" w:w="6624"/>
+            <w:tcMar>
+              <w:top w:w="100" w:type="dxa"/>
+              <w:start w:w="120" w:type="dxa"/>
+              <w:bottom w:w="100" w:type="dxa"/>
+              <w:end w:w="120" w:type="dxa"/>
+            </w:tcMar>
+            <w:vAlign w:val="center"/>
+          </w:tcPr>
+          <w:p>
+            <w:r>
+              <w:t>https://propeg-plataforma.onrender.com/projetos/</w:t>
+            </w:r>
+          </w:p>
+        </w:tc>
+      </w:tr>
+      <w:tr>
+        <w:trPr>
+          <w:cantSplit w:val="true"/>
+        </w:trPr>
+        <w:tc>
+          <w:tcPr>
+            <w:tcW w:type="dxa" w:w="3168"/>
+            <w:tcMar>
+              <w:top w:w="100" w:type="dxa"/>
+              <w:start w:w="120" w:type="dxa"/>
+              <w:bottom w:w="100" w:type="dxa"/>
+              <w:end w:w="120" w:type="dxa"/>
+            </w:tcMar>
+            <w:vAlign w:val="center"/>
+            <w:shd w:fill="EAF2F8"/>
+          </w:tcPr>
+          <w:p>
+            <w:r>
+              <w:t>Consulta pública</w:t>
+            </w:r>
+          </w:p>
+        </w:tc>
+        <w:tc>
+          <w:tcPr>
+            <w:tcW w:type="dxa" w:w="6624"/>
+            <w:tcMar>
+              <w:top w:w="100" w:type="dxa"/>
+              <w:start w:w="120" w:type="dxa"/>
+              <w:bottom w:w="100" w:type="dxa"/>
+              <w:end w:w="120" w:type="dxa"/>
+            </w:tcMar>
+            <w:vAlign w:val="center"/>
+            <w:shd w:fill="EAF2F8"/>
+          </w:tcPr>
+          <w:p>
+            <w:r>
+              <w:t>https://propeg-plataforma.onrender.com/projetos/consulta/</w:t>
+            </w:r>
+          </w:p>
+        </w:tc>
+      </w:tr>
+      <w:tr>
+        <w:trPr>
+          <w:cantSplit w:val="true"/>
+        </w:trPr>
+        <w:tc>
+          <w:tcPr>
+            <w:tcW w:type="dxa" w:w="3168"/>
+            <w:tcMar>
+              <w:top w:w="100" w:type="dxa"/>
+              <w:start w:w="120" w:type="dxa"/>
+              <w:bottom w:w="100" w:type="dxa"/>
+              <w:end w:w="120" w:type="dxa"/>
+            </w:tcMar>
+            <w:vAlign w:val="center"/>
+          </w:tcPr>
+          <w:p>
+            <w:r>
+              <w:t>Ajuda da plataforma</w:t>
+            </w:r>
+          </w:p>
+        </w:tc>
+        <w:tc>
+          <w:tcPr>
+            <w:tcW w:type="dxa" w:w="6624"/>
+            <w:tcMar>
+              <w:top w:w="100" w:type="dxa"/>
+              <w:start w:w="120" w:type="dxa"/>
+              <w:bottom w:w="100" w:type="dxa"/>
+              <w:end w:w="120" w:type="dxa"/>
+            </w:tcMar>
+            <w:vAlign w:val="center"/>
+          </w:tcPr>
+          <w:p>
+            <w:r>
+              <w:t>https://propeg-plataforma.onrender.com/projetos/ajuda/</w:t>
+            </w:r>
+          </w:p>
+        </w:tc>
+      </w:tr>
+      <w:tr>
+        <w:trPr>
+          <w:cantSplit w:val="true"/>
+        </w:trPr>
+        <w:tc>
+          <w:tcPr>
+            <w:tcW w:type="dxa" w:w="3168"/>
+            <w:tcMar>
+              <w:top w:w="100" w:type="dxa"/>
+              <w:start w:w="120" w:type="dxa"/>
+              <w:bottom w:w="100" w:type="dxa"/>
+              <w:end w:w="120" w:type="dxa"/>
+            </w:tcMar>
+            <w:vAlign w:val="center"/>
+            <w:shd w:fill="EAF2F8"/>
+          </w:tcPr>
+          <w:p>
+            <w:r>
+              <w:t>Painel do coordenador</w:t>
+            </w:r>
+          </w:p>
+        </w:tc>
+        <w:tc>
+          <w:tcPr>
+            <w:tcW w:type="dxa" w:w="6624"/>
+            <w:tcMar>
+              <w:top w:w="100" w:type="dxa"/>
+              <w:start w:w="120" w:type="dxa"/>
+              <w:bottom w:w="100" w:type="dxa"/>
+              <w:end w:w="120" w:type="dxa"/>
+            </w:tcMar>
+            <w:vAlign w:val="center"/>
+            <w:shd w:fill="EAF2F8"/>
+          </w:tcPr>
+          <w:p>
+            <w:r>
+              <w:t>https://propeg-plataforma.onrender.com/projetos/telaprincipal/</w:t>
+            </w:r>
+          </w:p>
+        </w:tc>
+      </w:tr>
+      <w:tr>
+        <w:trPr>
+          <w:cantSplit w:val="true"/>
+        </w:trPr>
+        <w:tc>
+          <w:tcPr>
+            <w:tcW w:type="dxa" w:w="3168"/>
+            <w:tcMar>
+              <w:top w:w="100" w:type="dxa"/>
+              <w:start w:w="120" w:type="dxa"/>
+              <w:bottom w:w="100" w:type="dxa"/>
+              <w:end w:w="120" w:type="dxa"/>
+            </w:tcMar>
+            <w:vAlign w:val="center"/>
+          </w:tcPr>
+          <w:p>
+            <w:r>
+              <w:t>Projetos do coordenador</w:t>
+            </w:r>
+          </w:p>
+        </w:tc>
+        <w:tc>
+          <w:tcPr>
+            <w:tcW w:type="dxa" w:w="6624"/>
+            <w:tcMar>
+              <w:top w:w="100" w:type="dxa"/>
+              <w:start w:w="120" w:type="dxa"/>
+              <w:bottom w:w="100" w:type="dxa"/>
+              <w:end w:w="120" w:type="dxa"/>
+            </w:tcMar>
+            <w:vAlign w:val="center"/>
+          </w:tcPr>
+          <w:p>
+            <w:r>
+              <w:t>https://propeg-plataforma.onrender.com/projetos/projetos/meusprojetos/</w:t>
+            </w:r>
+          </w:p>
+        </w:tc>
+      </w:tr>
+      <w:tr>
+        <w:trPr>
+          <w:cantSplit w:val="true"/>
+        </w:trPr>
+        <w:tc>
+          <w:tcPr>
+            <w:tcW w:type="dxa" w:w="3168"/>
+            <w:tcMar>
+              <w:top w:w="100" w:type="dxa"/>
+              <w:start w:w="120" w:type="dxa"/>
+              <w:bottom w:w="100" w:type="dxa"/>
+              <w:end w:w="120" w:type="dxa"/>
+            </w:tcMar>
+            <w:vAlign w:val="center"/>
+            <w:shd w:fill="EAF2F8"/>
+          </w:tcPr>
+          <w:p>
+            <w:r>
+              <w:t>Projetos do aluno</w:t>
+            </w:r>
+          </w:p>
+        </w:tc>
+        <w:tc>
+          <w:tcPr>
+            <w:tcW w:type="dxa" w:w="6624"/>
+            <w:tcMar>
+              <w:top w:w="100" w:type="dxa"/>
+              <w:start w:w="120" w:type="dxa"/>
+              <w:bottom w:w="100" w:type="dxa"/>
+              <w:end w:w="120" w:type="dxa"/>
+            </w:tcMar>
+            <w:vAlign w:val="center"/>
+            <w:shd w:fill="EAF2F8"/>
+          </w:tcPr>
+          <w:p>
+            <w:r>
+              <w:t>https://propeg-plataforma.onrender.com/projetos/aluno/projetos/meusprojetos/</w:t>
+            </w:r>
+          </w:p>
+        </w:tc>
+      </w:tr>
+      <w:tr>
+        <w:trPr>
+          <w:cantSplit w:val="true"/>
+        </w:trPr>
+        <w:tc>
+          <w:tcPr>
+            <w:tcW w:type="dxa" w:w="3168"/>
+            <w:tcMar>
+              <w:top w:w="100" w:type="dxa"/>
+              <w:start w:w="120" w:type="dxa"/>
+              <w:bottom w:w="100" w:type="dxa"/>
+              <w:end w:w="120" w:type="dxa"/>
+            </w:tcMar>
+            <w:vAlign w:val="center"/>
+          </w:tcPr>
+          <w:p>
+            <w:r>
+              <w:t>Painel do gestor</w:t>
+            </w:r>
+          </w:p>
+        </w:tc>
+        <w:tc>
+          <w:tcPr>
+            <w:tcW w:type="dxa" w:w="6624"/>
+            <w:tcMar>
+              <w:top w:w="100" w:type="dxa"/>
+              <w:start w:w="120" w:type="dxa"/>
+              <w:bottom w:w="100" w:type="dxa"/>
+              <w:end w:w="120" w:type="dxa"/>
+            </w:tcMar>
+            <w:vAlign w:val="center"/>
+          </w:tcPr>
+          <w:p>
+            <w:r>
+              <w:t>https://propeg-plataforma.onrender.com/projetos/gestor/dashboard/</w:t>
+            </w:r>
+          </w:p>
+        </w:tc>
+      </w:tr>
+      <w:tr>
+        <w:trPr>
+          <w:cantSplit w:val="true"/>
+        </w:trPr>
+        <w:tc>
+          <w:tcPr>
+            <w:tcW w:type="dxa" w:w="3168"/>
+            <w:tcMar>
+              <w:top w:w="100" w:type="dxa"/>
+              <w:start w:w="120" w:type="dxa"/>
+              <w:bottom w:w="100" w:type="dxa"/>
+              <w:end w:w="120" w:type="dxa"/>
+            </w:tcMar>
+            <w:vAlign w:val="center"/>
+            <w:shd w:fill="EAF2F8"/>
+          </w:tcPr>
+          <w:p>
+            <w:r>
+              <w:t>Usuários para o gestor</w:t>
+            </w:r>
+          </w:p>
+        </w:tc>
+        <w:tc>
+          <w:tcPr>
+            <w:tcW w:type="dxa" w:w="6624"/>
+            <w:tcMar>
+              <w:top w:w="100" w:type="dxa"/>
+              <w:start w:w="120" w:type="dxa"/>
+              <w:bottom w:w="100" w:type="dxa"/>
+              <w:end w:w="120" w:type="dxa"/>
+            </w:tcMar>
+            <w:vAlign w:val="center"/>
+            <w:shd w:fill="EAF2F8"/>
+          </w:tcPr>
+          <w:p>
+            <w:r>
+              <w:t>https://propeg-plataforma.onrender.com/projetos/gestor/usuarios/</w:t>
+            </w:r>
+          </w:p>
+        </w:tc>
+      </w:tr>
+      <w:tr>
+        <w:trPr>
+          <w:cantSplit w:val="true"/>
+        </w:trPr>
+        <w:tc>
+          <w:tcPr>
+            <w:tcW w:type="dxa" w:w="3168"/>
+            <w:tcMar>
+              <w:top w:w="100" w:type="dxa"/>
+              <w:start w:w="120" w:type="dxa"/>
+              <w:bottom w:w="100" w:type="dxa"/>
+              <w:end w:w="120" w:type="dxa"/>
+            </w:tcMar>
+            <w:vAlign w:val="center"/>
+          </w:tcPr>
+          <w:p>
+            <w:r>
+              <w:t>Histórico de projetos</w:t>
+            </w:r>
+          </w:p>
+        </w:tc>
+        <w:tc>
+          <w:tcPr>
+            <w:tcW w:type="dxa" w:w="6624"/>
+            <w:tcMar>
+              <w:top w:w="100" w:type="dxa"/>
+              <w:start w:w="120" w:type="dxa"/>
+              <w:bottom w:w="100" w:type="dxa"/>
+              <w:end w:w="120" w:type="dxa"/>
+            </w:tcMar>
+            <w:vAlign w:val="center"/>
+          </w:tcPr>
+          <w:p>
+            <w:r>
+              <w:t>https://propeg-plataforma.onrender.com/projetos/gestor/projetos/historico/</w:t>
+            </w:r>
+          </w:p>
+        </w:tc>
+      </w:tr>
+      <w:tr>
+        <w:trPr>
+          <w:cantSplit w:val="true"/>
+        </w:trPr>
+        <w:tc>
+          <w:tcPr>
+            <w:tcW w:type="dxa" w:w="3168"/>
+            <w:tcMar>
+              <w:top w:w="100" w:type="dxa"/>
+              <w:start w:w="120" w:type="dxa"/>
+              <w:bottom w:w="100" w:type="dxa"/>
+              <w:end w:w="120" w:type="dxa"/>
+            </w:tcMar>
+            <w:vAlign w:val="center"/>
+            <w:shd w:fill="EAF2F8"/>
+          </w:tcPr>
+          <w:p>
+            <w:r>
+              <w:t>Gestão de editais</w:t>
+            </w:r>
+          </w:p>
+        </w:tc>
+        <w:tc>
+          <w:tcPr>
+            <w:tcW w:type="dxa" w:w="6624"/>
+            <w:tcMar>
+              <w:top w:w="100" w:type="dxa"/>
+              <w:start w:w="120" w:type="dxa"/>
+              <w:bottom w:w="100" w:type="dxa"/>
+              <w:end w:w="120" w:type="dxa"/>
+            </w:tcMar>
+            <w:vAlign w:val="center"/>
+            <w:shd w:fill="EAF2F8"/>
+          </w:tcPr>
+          <w:p>
+            <w:r>
+              <w:t>https://propeg-plataforma.onrender.com/projetos/gestor/editais/</w:t>
+            </w:r>
+          </w:p>
+        </w:tc>
+      </w:tr>
+      <w:tr>
+        <w:trPr>
+          <w:cantSplit w:val="true"/>
+        </w:trPr>
+        <w:tc>
+          <w:tcPr>
+            <w:tcW w:type="dxa" w:w="3168"/>
+            <w:tcMar>
+              <w:top w:w="100" w:type="dxa"/>
+              <w:start w:w="120" w:type="dxa"/>
+              <w:bottom w:w="100" w:type="dxa"/>
+              <w:end w:w="120" w:type="dxa"/>
+            </w:tcMar>
+            <w:vAlign w:val="center"/>
+          </w:tcPr>
+          <w:p>
+            <w:r>
+              <w:t>Relatórios para o gestor</w:t>
+            </w:r>
+          </w:p>
+        </w:tc>
+        <w:tc>
+          <w:tcPr>
+            <w:tcW w:type="dxa" w:w="6624"/>
+            <w:tcMar>
+              <w:top w:w="100" w:type="dxa"/>
+              <w:start w:w="120" w:type="dxa"/>
+              <w:bottom w:w="100" w:type="dxa"/>
+              <w:end w:w="120" w:type="dxa"/>
+            </w:tcMar>
+            <w:vAlign w:val="center"/>
+          </w:tcPr>
+          <w:p>
+            <w:r>
+              <w:t>https://propeg-plataforma.onrender.com/projetos/gestor/relatorios/</w:t>
+            </w:r>
+          </w:p>
+        </w:tc>
+      </w:tr>
+      <w:tr>
+        <w:trPr>
+          <w:cantSplit w:val="true"/>
+        </w:trPr>
+        <w:tc>
+          <w:tcPr>
+            <w:tcW w:type="dxa" w:w="3168"/>
+            <w:tcMar>
+              <w:top w:w="100" w:type="dxa"/>
+              <w:start w:w="120" w:type="dxa"/>
+              <w:bottom w:w="100" w:type="dxa"/>
+              <w:end w:w="120" w:type="dxa"/>
+            </w:tcMar>
+            <w:vAlign w:val="center"/>
+            <w:shd w:fill="EAF2F8"/>
+          </w:tcPr>
+          <w:p>
+            <w:r>
+              <w:t>Administração Django</w:t>
+            </w:r>
+          </w:p>
+        </w:tc>
+        <w:tc>
+          <w:tcPr>
+            <w:tcW w:type="dxa" w:w="6624"/>
+            <w:tcMar>
+              <w:top w:w="100" w:type="dxa"/>
+              <w:start w:w="120" w:type="dxa"/>
+              <w:bottom w:w="100" w:type="dxa"/>
+              <w:end w:w="120" w:type="dxa"/>
+            </w:tcMar>
+            <w:vAlign w:val="center"/>
+            <w:shd w:fill="EAF2F8"/>
+          </w:tcPr>
+          <w:p>
+            <w:r>
+              <w:t>https://propeg-plataforma.onrender.com/admin/</w:t>
+            </w:r>
+          </w:p>
+        </w:tc>
+      </w:tr>
+    </w:tbl>
+    <w:p/>
+    <w:p>
+      <w:r>
+        <w:t>As rotas autenticadas redirecionam para a tela inicial quando a sessão não possui o perfil necessário. O painel Django usa a conta administrativa configurada no Render; as contas de gestor desta amostra devem ser usadas na própria plataforma.</w:t>
+      </w:r>
+    </w:p>
+    <w:p>
+      <w:pPr>
+        <w:pStyle w:val="Heading1"/>
+      </w:pPr>
+      <w:r>
         <w:t>Projetos disponíveis para consulta</w:t>
       </w:r>
     </w:p>
@@ -1311,6 +1934,7 @@
       </w:tblGrid>
       <w:tr>
         <w:trPr>
+          <w:cantSplit w:val="true"/>
           <w:tblHeader w:val="true"/>
         </w:trPr>
         <w:tc>
@@ -1403,6 +2027,9 @@
         </w:tc>
       </w:tr>
       <w:tr>
+        <w:trPr>
+          <w:cantSplit w:val="true"/>
+        </w:trPr>
         <w:tc>
           <w:tcPr>
             <w:tcW w:type="dxa" w:w="1800"/>
@@ -1473,6 +2100,9 @@
         </w:tc>
       </w:tr>
       <w:tr>
+        <w:trPr>
+          <w:cantSplit w:val="true"/>
+        </w:trPr>
         <w:tc>
           <w:tcPr>
             <w:tcW w:type="dxa" w:w="1800"/>
@@ -1547,6 +2177,9 @@
         </w:tc>
       </w:tr>
       <w:tr>
+        <w:trPr>
+          <w:cantSplit w:val="true"/>
+        </w:trPr>
         <w:tc>
           <w:tcPr>
             <w:tcW w:type="dxa" w:w="1800"/>
@@ -1617,6 +2250,9 @@
         </w:tc>
       </w:tr>
       <w:tr>
+        <w:trPr>
+          <w:cantSplit w:val="true"/>
+        </w:trPr>
         <w:tc>
           <w:tcPr>
             <w:tcW w:type="dxa" w:w="1800"/>
@@ -1691,6 +2327,9 @@
         </w:tc>
       </w:tr>
       <w:tr>
+        <w:trPr>
+          <w:cantSplit w:val="true"/>
+        </w:trPr>
         <w:tc>
           <w:tcPr>
             <w:tcW w:type="dxa" w:w="1800"/>
@@ -1761,6 +2400,9 @@
         </w:tc>
       </w:tr>
       <w:tr>
+        <w:trPr>
+          <w:cantSplit w:val="true"/>
+        </w:trPr>
         <w:tc>
           <w:tcPr>
             <w:tcW w:type="dxa" w:w="1800"/>
@@ -1835,6 +2477,9 @@
         </w:tc>
       </w:tr>
       <w:tr>
+        <w:trPr>
+          <w:cantSplit w:val="true"/>
+        </w:trPr>
         <w:tc>
           <w:tcPr>
             <w:tcW w:type="dxa" w:w="1800"/>
@@ -1905,6 +2550,9 @@
         </w:tc>
       </w:tr>
       <w:tr>
+        <w:trPr>
+          <w:cantSplit w:val="true"/>
+        </w:trPr>
         <w:tc>
           <w:tcPr>
             <w:tcW w:type="dxa" w:w="1800"/>
@@ -1979,6 +2627,9 @@
         </w:tc>
       </w:tr>
       <w:tr>
+        <w:trPr>
+          <w:cantSplit w:val="true"/>
+        </w:trPr>
         <w:tc>
           <w:tcPr>
             <w:tcW w:type="dxa" w:w="1800"/>
@@ -2080,6 +2731,7 @@
       </w:tblGrid>
       <w:tr>
         <w:trPr>
+          <w:cantSplit w:val="true"/>
           <w:tblHeader w:val="true"/>
         </w:trPr>
         <w:tc>
@@ -2128,6 +2780,9 @@
         </w:tc>
       </w:tr>
       <w:tr>
+        <w:trPr>
+          <w:cantSplit w:val="true"/>
+        </w:trPr>
         <w:tc>
           <w:tcPr>
             <w:tcW w:type="dxa" w:w="3096"/>
@@ -2158,12 +2813,15 @@
           </w:tcPr>
           <w:p>
             <w:r>
-              <w:t>/projetos/centro/aprovacao/demo-centro-ufac-2026/</w:t>
+              <w:t>https://propeg-plataforma.onrender.com/projetos/centro/aprovacao/demo-centro-ufac-2026/</w:t>
             </w:r>
           </w:p>
         </w:tc>
       </w:tr>
       <w:tr>
+        <w:trPr>
+          <w:cantSplit w:val="true"/>
+        </w:trPr>
         <w:tc>
           <w:tcPr>
             <w:tcW w:type="dxa" w:w="3096"/>
@@ -2175,6 +2833,46 @@
             </w:tcMar>
             <w:vAlign w:val="center"/>
             <w:shd w:fill="EAF2F8"/>
+          </w:tcPr>
+          <w:p>
+            <w:r>
+              <w:t>Validade do link do Centro</w:t>
+            </w:r>
+          </w:p>
+        </w:tc>
+        <w:tc>
+          <w:tcPr>
+            <w:tcW w:type="dxa" w:w="6696"/>
+            <w:tcMar>
+              <w:top w:w="100" w:type="dxa"/>
+              <w:start w:w="120" w:type="dxa"/>
+              <w:bottom w:w="100" w:type="dxa"/>
+              <w:end w:w="120" w:type="dxa"/>
+            </w:tcMar>
+            <w:vAlign w:val="center"/>
+            <w:shd w:fill="EAF2F8"/>
+          </w:tcPr>
+          <w:p>
+            <w:r>
+              <w:t>Uso único; expira 30 dias após o último povoamento da amostra</w:t>
+            </w:r>
+          </w:p>
+        </w:tc>
+      </w:tr>
+      <w:tr>
+        <w:trPr>
+          <w:cantSplit w:val="true"/>
+        </w:trPr>
+        <w:tc>
+          <w:tcPr>
+            <w:tcW w:type="dxa" w:w="3096"/>
+            <w:tcMar>
+              <w:top w:w="100" w:type="dxa"/>
+              <w:start w:w="120" w:type="dxa"/>
+              <w:bottom w:w="100" w:type="dxa"/>
+              <w:end w:w="120" w:type="dxa"/>
+            </w:tcMar>
+            <w:vAlign w:val="center"/>
           </w:tcPr>
           <w:p>
             <w:r>
@@ -2192,7 +2890,6 @@
               <w:end w:w="120" w:type="dxa"/>
             </w:tcMar>
             <w:vAlign w:val="center"/>
-            <w:shd w:fill="EAF2F8"/>
           </w:tcPr>
           <w:p>
             <w:r>
@@ -2202,6 +2899,9 @@
         </w:tc>
       </w:tr>
       <w:tr>
+        <w:trPr>
+          <w:cantSplit w:val="true"/>
+        </w:trPr>
         <w:tc>
           <w:tcPr>
             <w:tcW w:type="dxa" w:w="3096"/>
@@ -2212,6 +2912,7 @@
               <w:end w:w="120" w:type="dxa"/>
             </w:tcMar>
             <w:vAlign w:val="center"/>
+            <w:shd w:fill="EAF2F8"/>
           </w:tcPr>
           <w:p>
             <w:r>
@@ -2229,15 +2930,19 @@
               <w:end w:w="120" w:type="dxa"/>
             </w:tcMar>
             <w:vAlign w:val="center"/>
+            <w:shd w:fill="EAF2F8"/>
           </w:tcPr>
           <w:p>
             <w:r>
-              <w:t>output/pdf/projeto_teste_preenchimento_automatico.pdf</w:t>
+              <w:t>Arquivo local output/pdf/projeto_teste_preenchimento_automatico.pdf</w:t>
             </w:r>
           </w:p>
         </w:tc>
       </w:tr>
       <w:tr>
+        <w:trPr>
+          <w:cantSplit w:val="true"/>
+        </w:trPr>
         <w:tc>
           <w:tcPr>
             <w:tcW w:type="dxa" w:w="3096"/>
@@ -2248,7 +2953,6 @@
               <w:end w:w="120" w:type="dxa"/>
             </w:tcMar>
             <w:vAlign w:val="center"/>
-            <w:shd w:fill="EAF2F8"/>
           </w:tcPr>
           <w:p>
             <w:r>
@@ -2266,16 +2970,59 @@
               <w:end w:w="120" w:type="dxa"/>
             </w:tcMar>
             <w:vAlign w:val="center"/>
-            <w:shd w:fill="EAF2F8"/>
           </w:tcPr>
           <w:p>
             <w:r>
-              <w:t>static/imagens/imagem-exemplo.jpeg</w:t>
+              <w:t>Arquivo local static/imagens/imagem-exemplo.jpeg</w:t>
             </w:r>
           </w:p>
         </w:tc>
       </w:tr>
       <w:tr>
+        <w:trPr>
+          <w:cantSplit w:val="true"/>
+        </w:trPr>
+        <w:tc>
+          <w:tcPr>
+            <w:tcW w:type="dxa" w:w="3096"/>
+            <w:tcMar>
+              <w:top w:w="100" w:type="dxa"/>
+              <w:start w:w="120" w:type="dxa"/>
+              <w:bottom w:w="100" w:type="dxa"/>
+              <w:end w:w="120" w:type="dxa"/>
+            </w:tcMar>
+            <w:vAlign w:val="center"/>
+            <w:shd w:fill="EAF2F8"/>
+          </w:tcPr>
+          <w:p>
+            <w:r>
+              <w:t>E-mail de recebimento</w:t>
+            </w:r>
+          </w:p>
+        </w:tc>
+        <w:tc>
+          <w:tcPr>
+            <w:tcW w:type="dxa" w:w="6696"/>
+            <w:tcMar>
+              <w:top w:w="100" w:type="dxa"/>
+              <w:start w:w="120" w:type="dxa"/>
+              <w:bottom w:w="100" w:type="dxa"/>
+              <w:end w:w="120" w:type="dxa"/>
+            </w:tcMar>
+            <w:vAlign w:val="center"/>
+            <w:shd w:fill="EAF2F8"/>
+          </w:tcPr>
+          <w:p>
+            <w:r>
+              <w:t>Substituir o e-mail de uma conta de amostra por uma caixa postal controlada pelo testador</w:t>
+            </w:r>
+          </w:p>
+        </w:tc>
+      </w:tr>
+      <w:tr>
+        <w:trPr>
+          <w:cantSplit w:val="true"/>
+        </w:trPr>
         <w:tc>
           <w:tcPr>
             <w:tcW w:type="dxa" w:w="3096"/>
@@ -2312,6 +3059,9 @@
         </w:tc>
       </w:tr>
       <w:tr>
+        <w:trPr>
+          <w:cantSplit w:val="true"/>
+        </w:trPr>
         <w:tc>
           <w:tcPr>
             <w:tcW w:type="dxa" w:w="3096"/>
@@ -2350,6 +3100,9 @@
         </w:tc>
       </w:tr>
       <w:tr>
+        <w:trPr>
+          <w:cantSplit w:val="true"/>
+        </w:trPr>
         <w:tc>
           <w:tcPr>
             <w:tcW w:type="dxa" w:w="3096"/>
@@ -2386,6 +3139,9 @@
         </w:tc>
       </w:tr>
       <w:tr>
+        <w:trPr>
+          <w:cantSplit w:val="true"/>
+        </w:trPr>
         <w:tc>
           <w:tcPr>
             <w:tcW w:type="dxa" w:w="3096"/>
@@ -2430,7 +3186,7 @@
         <w:pStyle w:val="Heading2"/>
       </w:pPr>
       <w:r>
-        <w:t>Dados para criar um projeto durante a homologação</w:t>
+        <w:t>Dados para criar um projeto durante a validação</w:t>
       </w:r>
     </w:p>
     <w:tbl>
@@ -2455,6 +3211,7 @@
       </w:tblGrid>
       <w:tr>
         <w:trPr>
+          <w:cantSplit w:val="true"/>
           <w:tblHeader w:val="true"/>
         </w:trPr>
         <w:tc>
@@ -2503,6 +3260,9 @@
         </w:tc>
       </w:tr>
       <w:tr>
+        <w:trPr>
+          <w:cantSplit w:val="true"/>
+        </w:trPr>
         <w:tc>
           <w:tcPr>
             <w:tcW w:type="dxa" w:w="2520"/>
@@ -2539,6 +3299,9 @@
         </w:tc>
       </w:tr>
       <w:tr>
+        <w:trPr>
+          <w:cantSplit w:val="true"/>
+        </w:trPr>
         <w:tc>
           <w:tcPr>
             <w:tcW w:type="dxa" w:w="2520"/>
@@ -2577,6 +3340,9 @@
         </w:tc>
       </w:tr>
       <w:tr>
+        <w:trPr>
+          <w:cantSplit w:val="true"/>
+        </w:trPr>
         <w:tc>
           <w:tcPr>
             <w:tcW w:type="dxa" w:w="2520"/>
@@ -2613,6 +3379,9 @@
         </w:tc>
       </w:tr>
       <w:tr>
+        <w:trPr>
+          <w:cantSplit w:val="true"/>
+        </w:trPr>
         <w:tc>
           <w:tcPr>
             <w:tcW w:type="dxa" w:w="2520"/>
@@ -2651,6 +3420,9 @@
         </w:tc>
       </w:tr>
       <w:tr>
+        <w:trPr>
+          <w:cantSplit w:val="true"/>
+        </w:trPr>
         <w:tc>
           <w:tcPr>
             <w:tcW w:type="dxa" w:w="2520"/>
@@ -2687,6 +3459,9 @@
         </w:tc>
       </w:tr>
       <w:tr>
+        <w:trPr>
+          <w:cantSplit w:val="true"/>
+        </w:trPr>
         <w:tc>
           <w:tcPr>
             <w:tcW w:type="dxa" w:w="2520"/>
@@ -2725,6 +3500,9 @@
         </w:tc>
       </w:tr>
       <w:tr>
+        <w:trPr>
+          <w:cantSplit w:val="true"/>
+        </w:trPr>
         <w:tc>
           <w:tcPr>
             <w:tcW w:type="dxa" w:w="2520"/>
@@ -2761,6 +3539,9 @@
         </w:tc>
       </w:tr>
       <w:tr>
+        <w:trPr>
+          <w:cantSplit w:val="true"/>
+        </w:trPr>
         <w:tc>
           <w:tcPr>
             <w:tcW w:type="dxa" w:w="2520"/>
@@ -2799,6 +3580,9 @@
         </w:tc>
       </w:tr>
       <w:tr>
+        <w:trPr>
+          <w:cantSplit w:val="true"/>
+        </w:trPr>
         <w:tc>
           <w:tcPr>
             <w:tcW w:type="dxa" w:w="2520"/>
@@ -2835,6 +3619,9 @@
         </w:tc>
       </w:tr>
       <w:tr>
+        <w:trPr>
+          <w:cantSplit w:val="true"/>
+        </w:trPr>
         <w:tc>
           <w:tcPr>
             <w:tcW w:type="dxa" w:w="2520"/>
@@ -2873,6 +3660,9 @@
         </w:tc>
       </w:tr>
       <w:tr>
+        <w:trPr>
+          <w:cantSplit w:val="true"/>
+        </w:trPr>
         <w:tc>
           <w:tcPr>
             <w:tcW w:type="dxa" w:w="2520"/>
@@ -2909,6 +3699,9 @@
         </w:tc>
       </w:tr>
       <w:tr>
+        <w:trPr>
+          <w:cantSplit w:val="true"/>
+        </w:trPr>
         <w:tc>
           <w:tcPr>
             <w:tcW w:type="dxa" w:w="2520"/>
@@ -2947,6 +3740,9 @@
         </w:tc>
       </w:tr>
       <w:tr>
+        <w:trPr>
+          <w:cantSplit w:val="true"/>
+        </w:trPr>
         <w:tc>
           <w:tcPr>
             <w:tcW w:type="dxa" w:w="2520"/>
@@ -2987,12 +3783,16 @@
     <w:p>
       <w:pPr>
         <w:pStyle w:val="Heading1"/>
+        <w:keepNext/>
       </w:pPr>
       <w:r>
         <w:t>Casos de teste de acesso e cadastro</w:t>
       </w:r>
     </w:p>
     <w:p>
+      <w:pPr>
+        <w:keepNext/>
+      </w:pPr>
       <w:r>
         <w:t>Estes casos validam a entrada no sistema, a criação de contas e a recuperação de acesso.</w:t>
       </w:r>
@@ -3052,7 +3852,7 @@
         <w:t xml:space="preserve">Pré-condições: </w:t>
       </w:r>
       <w:r>
-        <w:t>Servidor em execução e sessão encerrada.</w:t>
+        <w:t>Implantação do Render disponível e sessão encerrada.</w:t>
       </w:r>
     </w:p>
     <w:p>
@@ -3070,7 +3870,6 @@
     </w:p>
     <w:p>
       <w:pPr>
-        <w:keepNext/>
         <w:keepLines/>
         <w:ind w:left="403" w:hanging="317"/>
       </w:pPr>
@@ -3080,7 +3879,6 @@
     </w:p>
     <w:p>
       <w:pPr>
-        <w:keepNext/>
         <w:keepLines/>
         <w:ind w:left="403" w:hanging="317"/>
       </w:pPr>
@@ -3103,7 +3901,6 @@
     </w:p>
     <w:p>
       <w:pPr>
-        <w:keepNext/>
         <w:keepLines/>
         <w:ind w:left="403" w:hanging="317"/>
       </w:pPr>
@@ -3210,7 +4007,6 @@
     </w:p>
     <w:p>
       <w:pPr>
-        <w:keepNext/>
         <w:keepLines/>
         <w:ind w:left="403" w:hanging="317"/>
       </w:pPr>
@@ -3220,7 +4016,6 @@
     </w:p>
     <w:p>
       <w:pPr>
-        <w:keepNext/>
         <w:keepLines/>
         <w:ind w:left="403" w:hanging="317"/>
       </w:pPr>
@@ -3230,7 +4025,6 @@
     </w:p>
     <w:p>
       <w:pPr>
-        <w:keepNext/>
         <w:keepLines/>
         <w:ind w:left="403" w:hanging="317"/>
       </w:pPr>
@@ -3253,7 +4047,6 @@
     </w:p>
     <w:p>
       <w:pPr>
-        <w:keepNext/>
         <w:keepLines/>
         <w:ind w:left="403" w:hanging="317"/>
       </w:pPr>
@@ -3360,7 +4153,6 @@
     </w:p>
     <w:p>
       <w:pPr>
-        <w:keepNext/>
         <w:keepLines/>
         <w:ind w:left="403" w:hanging="317"/>
       </w:pPr>
@@ -3370,7 +4162,6 @@
     </w:p>
     <w:p>
       <w:pPr>
-        <w:keepNext/>
         <w:keepLines/>
         <w:ind w:left="403" w:hanging="317"/>
       </w:pPr>
@@ -3380,7 +4171,6 @@
     </w:p>
     <w:p>
       <w:pPr>
-        <w:keepNext/>
         <w:keepLines/>
         <w:ind w:left="403" w:hanging="317"/>
       </w:pPr>
@@ -3403,7 +4193,6 @@
     </w:p>
     <w:p>
       <w:pPr>
-        <w:keepNext/>
         <w:keepLines/>
         <w:ind w:left="403" w:hanging="317"/>
       </w:pPr>
@@ -3476,7 +4265,7 @@
         <w:t xml:space="preserve">Pré-condições: </w:t>
       </w:r>
       <w:r>
-        <w:t>Base de homologação carregada.</w:t>
+        <w:t>Dados de amostra carregados em produção.</w:t>
       </w:r>
     </w:p>
     <w:p>
@@ -3510,7 +4299,6 @@
     </w:p>
     <w:p>
       <w:pPr>
-        <w:keepNext/>
         <w:keepLines/>
         <w:ind w:left="403" w:hanging="317"/>
       </w:pPr>
@@ -3520,7 +4308,6 @@
     </w:p>
     <w:p>
       <w:pPr>
-        <w:keepNext/>
         <w:keepLines/>
         <w:ind w:left="403" w:hanging="317"/>
       </w:pPr>
@@ -3543,7 +4330,6 @@
     </w:p>
     <w:p>
       <w:pPr>
-        <w:keepNext/>
         <w:keepLines/>
         <w:ind w:left="403" w:hanging="317"/>
       </w:pPr>
@@ -3616,7 +4402,7 @@
         <w:t xml:space="preserve">Pré-condições: </w:t>
       </w:r>
       <w:r>
-        <w:t>Base de homologação carregada.</w:t>
+        <w:t>Dados de amostra carregados em produção.</w:t>
       </w:r>
     </w:p>
     <w:p>
@@ -3650,7 +4436,6 @@
     </w:p>
     <w:p>
       <w:pPr>
-        <w:keepNext/>
         <w:keepLines/>
         <w:ind w:left="403" w:hanging="317"/>
       </w:pPr>
@@ -3660,7 +4445,6 @@
     </w:p>
     <w:p>
       <w:pPr>
-        <w:keepNext/>
         <w:keepLines/>
         <w:ind w:left="403" w:hanging="317"/>
       </w:pPr>
@@ -3670,7 +4454,6 @@
     </w:p>
     <w:p>
       <w:pPr>
-        <w:keepNext/>
         <w:keepLines/>
         <w:ind w:left="403" w:hanging="317"/>
       </w:pPr>
@@ -3693,7 +4476,6 @@
     </w:p>
     <w:p>
       <w:pPr>
-        <w:keepNext/>
         <w:keepLines/>
         <w:ind w:left="403" w:hanging="317"/>
       </w:pPr>
@@ -3784,7 +4566,6 @@
     </w:p>
     <w:p>
       <w:pPr>
-        <w:keepNext/>
         <w:keepLines/>
         <w:ind w:left="403" w:hanging="317"/>
       </w:pPr>
@@ -3794,7 +4575,6 @@
     </w:p>
     <w:p>
       <w:pPr>
-        <w:keepNext/>
         <w:keepLines/>
         <w:ind w:left="403" w:hanging="317"/>
       </w:pPr>
@@ -3817,7 +4597,6 @@
     </w:p>
     <w:p>
       <w:pPr>
-        <w:keepNext/>
         <w:keepLines/>
         <w:ind w:left="403" w:hanging="317"/>
       </w:pPr>
@@ -3908,7 +4687,6 @@
     </w:p>
     <w:p>
       <w:pPr>
-        <w:keepNext/>
         <w:keepLines/>
         <w:ind w:left="403" w:hanging="317"/>
       </w:pPr>
@@ -3918,7 +4696,6 @@
     </w:p>
     <w:p>
       <w:pPr>
-        <w:keepNext/>
         <w:keepLines/>
         <w:ind w:left="403" w:hanging="317"/>
       </w:pPr>
@@ -3941,7 +4718,6 @@
     </w:p>
     <w:p>
       <w:pPr>
-        <w:keepNext/>
         <w:keepLines/>
         <w:ind w:left="403" w:hanging="317"/>
       </w:pPr>
@@ -4014,7 +4790,7 @@
         <w:t xml:space="preserve">Pré-condições: </w:t>
       </w:r>
       <w:r>
-        <w:t>Backend de e-mail configurado para o ambiente de teste.</w:t>
+        <w:t>E-mail transacional do Render configurado e conta de amostra apontando para uma caixa postal controlada.</w:t>
       </w:r>
     </w:p>
     <w:p>
@@ -4048,7 +4824,6 @@
     </w:p>
     <w:p>
       <w:pPr>
-        <w:keepNext/>
         <w:keepLines/>
         <w:ind w:left="403" w:hanging="317"/>
       </w:pPr>
@@ -4058,7 +4833,6 @@
     </w:p>
     <w:p>
       <w:pPr>
-        <w:keepNext/>
         <w:keepLines/>
         <w:ind w:left="403" w:hanging="317"/>
       </w:pPr>
@@ -4068,7 +4842,6 @@
     </w:p>
     <w:p>
       <w:pPr>
-        <w:keepNext/>
         <w:keepLines/>
         <w:ind w:left="403" w:hanging="317"/>
       </w:pPr>
@@ -4091,7 +4864,6 @@
     </w:p>
     <w:p>
       <w:pPr>
-        <w:keepNext/>
         <w:keepLines/>
         <w:ind w:left="403" w:hanging="317"/>
       </w:pPr>
@@ -4182,7 +4954,6 @@
     </w:p>
     <w:p>
       <w:pPr>
-        <w:keepNext/>
         <w:keepLines/>
         <w:ind w:left="403" w:hanging="317"/>
       </w:pPr>
@@ -4192,7 +4963,6 @@
     </w:p>
     <w:p>
       <w:pPr>
-        <w:keepNext/>
         <w:keepLines/>
         <w:ind w:left="403" w:hanging="317"/>
       </w:pPr>
@@ -4215,7 +4985,6 @@
     </w:p>
     <w:p>
       <w:pPr>
-        <w:keepNext/>
         <w:keepLines/>
         <w:ind w:left="403" w:hanging="317"/>
       </w:pPr>
@@ -4235,25 +5004,12 @@
     <w:p/>
     <w:p>
       <w:pPr>
-        <w:pStyle w:val="Heading1"/>
-      </w:pPr>
-      <w:r>
-        <w:t>Casos de teste de perfil</w:t>
-      </w:r>
-    </w:p>
-    <w:p>
-      <w:r>
-        <w:t>Validação dos dados pessoais e vínculos institucionais.</w:t>
-      </w:r>
-    </w:p>
-    <w:p>
-      <w:pPr>
         <w:pStyle w:val="Heading3"/>
         <w:keepNext/>
         <w:keepLines/>
       </w:pPr>
       <w:r>
-        <w:t>CT-PER-001  Completar o perfil do coordenador</w:t>
+        <w:t>CT-ACC-010  Consultar o guia e a seção sobre o sistema</w:t>
       </w:r>
     </w:p>
     <w:p>
@@ -4269,7 +5025,7 @@
         <w:t xml:space="preserve">Perfil: </w:t>
       </w:r>
       <w:r>
-        <w:t>Coordenador</w:t>
+        <w:t>Qualquer usuário autenticado</w:t>
       </w:r>
     </w:p>
     <w:p>
@@ -4301,7 +5057,7 @@
         <w:t xml:space="preserve">Pré-condições: </w:t>
       </w:r>
       <w:r>
-        <w:t>Entrar como Ana Souza.</w:t>
+        <w:t>Usuário autenticado.</w:t>
       </w:r>
     </w:p>
     <w:p>
@@ -4319,32 +5075,29 @@
     </w:p>
     <w:p>
       <w:pPr>
-        <w:keepNext/>
         <w:keepLines/>
         <w:ind w:left="403" w:hanging="317"/>
       </w:pPr>
       <w:r>
-        <w:t>1.  Abrir Meu Perfil e Editar.</w:t>
-      </w:r>
-    </w:p>
-    <w:p>
-      <w:pPr>
-        <w:keepNext/>
+        <w:t>1.  Abrir a tela Ajuda.</w:t>
+      </w:r>
+    </w:p>
+    <w:p>
+      <w:pPr>
         <w:keepLines/>
         <w:ind w:left="403" w:hanging="317"/>
       </w:pPr>
       <w:r>
-        <w:t>2.  Preencher dados pessoais, titulação, SIAPE, Lattes e centro de lotação.</w:t>
-      </w:r>
-    </w:p>
-    <w:p>
-      <w:pPr>
-        <w:keepNext/>
+        <w:t>2.  Percorrer as seções do guia.</w:t>
+      </w:r>
+    </w:p>
+    <w:p>
+      <w:pPr>
         <w:keepLines/>
         <w:ind w:left="403" w:hanging="317"/>
       </w:pPr>
       <w:r>
-        <w:t>3.  Salvar e reabrir o perfil.</w:t>
+        <w:t>3.  Abrir a seção Sobre o Sistema e os Desenvolvedores.</w:t>
       </w:r>
     </w:p>
     <w:p>
@@ -4362,12 +5115,11 @@
     </w:p>
     <w:p>
       <w:pPr>
-        <w:keepNext/>
         <w:keepLines/>
         <w:ind w:left="403" w:hanging="317"/>
       </w:pPr>
       <w:r>
-        <w:t>•  Os dados válidos são persistidos.</w:t>
+        <w:t>•  O guia apresenta os três tipos de projeto e os fluxos atuais.</w:t>
       </w:r>
     </w:p>
     <w:p>
@@ -4376,18 +5128,35 @@
         <w:ind w:left="403" w:hanging="317"/>
       </w:pPr>
       <w:r>
-        <w:t>•  Centro e demais seleções exibem os valores salvos.</w:t>
+        <w:t>•  Douglas Moura Araújo e Áleks Sebastian de Freitas Araújo são identificados como desenvolvedores.</w:t>
       </w:r>
     </w:p>
     <w:p/>
     <w:p>
       <w:pPr>
+        <w:pStyle w:val="Heading1"/>
+        <w:keepNext/>
+      </w:pPr>
+      <w:r>
+        <w:t>Casos de teste de perfil</w:t>
+      </w:r>
+    </w:p>
+    <w:p>
+      <w:pPr>
+        <w:keepNext/>
+      </w:pPr>
+      <w:r>
+        <w:t>Validação dos dados pessoais e vínculos institucionais.</w:t>
+      </w:r>
+    </w:p>
+    <w:p>
+      <w:pPr>
         <w:pStyle w:val="Heading3"/>
         <w:keepNext/>
         <w:keepLines/>
       </w:pPr>
       <w:r>
-        <w:t>CT-PER-002  Restringir o regime de trabalho</w:t>
+        <w:t>CT-PER-001  Completar o perfil do coordenador</w:t>
       </w:r>
     </w:p>
     <w:p>
@@ -4435,7 +5204,7 @@
         <w:t xml:space="preserve">Pré-condições: </w:t>
       </w:r>
       <w:r>
-        <w:t>Tela de edição do perfil aberta.</w:t>
+        <w:t>Entrar como Ana Souza.</w:t>
       </w:r>
     </w:p>
     <w:p>
@@ -4453,32 +5222,29 @@
     </w:p>
     <w:p>
       <w:pPr>
-        <w:keepNext/>
         <w:keepLines/>
         <w:ind w:left="403" w:hanging="317"/>
       </w:pPr>
       <w:r>
-        <w:t>1.  Abrir Regime de Trabalho.</w:t>
-      </w:r>
-    </w:p>
-    <w:p>
-      <w:pPr>
-        <w:keepNext/>
+        <w:t>1.  Abrir Meu Perfil e Editar.</w:t>
+      </w:r>
+    </w:p>
+    <w:p>
+      <w:pPr>
         <w:keepLines/>
         <w:ind w:left="403" w:hanging="317"/>
       </w:pPr>
       <w:r>
-        <w:t>2.  Verificar todas as opções.</w:t>
-      </w:r>
-    </w:p>
-    <w:p>
-      <w:pPr>
-        <w:keepNext/>
+        <w:t>2.  Preencher dados pessoais, titulação, SIAPE, Lattes e centro de lotação.</w:t>
+      </w:r>
+    </w:p>
+    <w:p>
+      <w:pPr>
         <w:keepLines/>
         <w:ind w:left="403" w:hanging="317"/>
       </w:pPr>
       <w:r>
-        <w:t>3.  Salvar sucessivamente 20h, 40h e DE.</w:t>
+        <w:t>3.  Salvar e reabrir o perfil.</w:t>
       </w:r>
     </w:p>
     <w:p>
@@ -4496,12 +5262,11 @@
     </w:p>
     <w:p>
       <w:pPr>
-        <w:keepNext/>
         <w:keepLines/>
         <w:ind w:left="403" w:hanging="317"/>
       </w:pPr>
       <w:r>
-        <w:t>•  Somente 20h, 40h e DE Dedicação Exclusiva aparecem.</w:t>
+        <w:t>•  Os dados válidos são persistidos.</w:t>
       </w:r>
     </w:p>
     <w:p>
@@ -4510,7 +5275,7 @@
         <w:ind w:left="403" w:hanging="317"/>
       </w:pPr>
       <w:r>
-        <w:t>•  Não é possível digitar um valor livre.</w:t>
+        <w:t>•  Centro e demais seleções exibem os valores salvos.</w:t>
       </w:r>
     </w:p>
     <w:p/>
@@ -4521,7 +5286,7 @@
         <w:keepLines/>
       </w:pPr>
       <w:r>
-        <w:t>CT-PER-003  Editar o perfil do aluno</w:t>
+        <w:t>CT-PER-002  Restringir o regime de trabalho</w:t>
       </w:r>
     </w:p>
     <w:p>
@@ -4537,7 +5302,7 @@
         <w:t xml:space="preserve">Perfil: </w:t>
       </w:r>
       <w:r>
-        <w:t>Aluno</w:t>
+        <w:t>Coordenador</w:t>
       </w:r>
     </w:p>
     <w:p>
@@ -4569,7 +5334,7 @@
         <w:t xml:space="preserve">Pré-condições: </w:t>
       </w:r>
       <w:r>
-        <w:t>Entrar como Diego Alves.</w:t>
+        <w:t>Tela de edição do perfil aberta.</w:t>
       </w:r>
     </w:p>
     <w:p>
@@ -4587,32 +5352,29 @@
     </w:p>
     <w:p>
       <w:pPr>
-        <w:keepNext/>
         <w:keepLines/>
         <w:ind w:left="403" w:hanging="317"/>
       </w:pPr>
       <w:r>
-        <w:t>1.  Abrir a edição de perfil.</w:t>
-      </w:r>
-    </w:p>
-    <w:p>
-      <w:pPr>
-        <w:keepNext/>
+        <w:t>1.  Abrir Regime de Trabalho.</w:t>
+      </w:r>
+    </w:p>
+    <w:p>
+      <w:pPr>
         <w:keepLines/>
         <w:ind w:left="403" w:hanging="317"/>
       </w:pPr>
       <w:r>
-        <w:t>2.  Selecionar curso de graduação e vínculo de pós-graduação, se aplicável.</w:t>
-      </w:r>
-    </w:p>
-    <w:p>
-      <w:pPr>
-        <w:keepNext/>
+        <w:t>2.  Verificar todas as opções.</w:t>
+      </w:r>
+    </w:p>
+    <w:p>
+      <w:pPr>
         <w:keepLines/>
         <w:ind w:left="403" w:hanging="317"/>
       </w:pPr>
       <w:r>
-        <w:t>3.  Salvar e verificar o resumo do perfil.</w:t>
+        <w:t>3.  Salvar sucessivamente 20h, 40h e DE.</w:t>
       </w:r>
     </w:p>
     <w:p>
@@ -4630,12 +5392,11 @@
     </w:p>
     <w:p>
       <w:pPr>
-        <w:keepNext/>
         <w:keepLines/>
         <w:ind w:left="403" w:hanging="317"/>
       </w:pPr>
       <w:r>
-        <w:t>•  A lista apresenta os cursos do catálogo UFAC.</w:t>
+        <w:t>•  Somente 20h, 40h e DE Dedicação Exclusiva aparecem.</w:t>
       </w:r>
     </w:p>
     <w:p>
@@ -4644,7 +5405,7 @@
         <w:ind w:left="403" w:hanging="317"/>
       </w:pPr>
       <w:r>
-        <w:t>•  Curso, matrícula e demais dados ficam disponíveis no perfil.</w:t>
+        <w:t>•  Não é possível digitar um valor livre.</w:t>
       </w:r>
     </w:p>
     <w:p/>
@@ -4655,7 +5416,7 @@
         <w:keepLines/>
       </w:pPr>
       <w:r>
-        <w:t>CT-PER-004  Validar centros e cursos vinculados</w:t>
+        <w:t>CT-PER-003  Editar o perfil do aluno</w:t>
       </w:r>
     </w:p>
     <w:p>
@@ -4671,7 +5432,7 @@
         <w:t xml:space="preserve">Perfil: </w:t>
       </w:r>
       <w:r>
-        <w:t>Coordenador Aluno</w:t>
+        <w:t>Aluno</w:t>
       </w:r>
     </w:p>
     <w:p>
@@ -4703,7 +5464,7 @@
         <w:t xml:space="preserve">Pré-condições: </w:t>
       </w:r>
       <w:r>
-        <w:t>Base de homologação carregada.</w:t>
+        <w:t>Entrar como Diego Alves.</w:t>
       </w:r>
     </w:p>
     <w:p>
@@ -4721,32 +5482,29 @@
     </w:p>
     <w:p>
       <w:pPr>
-        <w:keepNext/>
         <w:keepLines/>
         <w:ind w:left="403" w:hanging="317"/>
       </w:pPr>
       <w:r>
-        <w:t>1.  Abrir uma seleção de centro.</w:t>
-      </w:r>
-    </w:p>
-    <w:p>
-      <w:pPr>
-        <w:keepNext/>
+        <w:t>1.  Abrir a edição de perfil.</w:t>
+      </w:r>
+    </w:p>
+    <w:p>
+      <w:pPr>
         <w:keepLines/>
         <w:ind w:left="403" w:hanging="317"/>
       </w:pPr>
       <w:r>
-        <w:t>2.  Confirmar os oito centros acadêmicos.</w:t>
-      </w:r>
-    </w:p>
-    <w:p>
-      <w:pPr>
-        <w:keepNext/>
+        <w:t>2.  Selecionar curso de graduação e vínculo de pós-graduação, se aplicável.</w:t>
+      </w:r>
+    </w:p>
+    <w:p>
+      <w:pPr>
         <w:keepLines/>
         <w:ind w:left="403" w:hanging="317"/>
       </w:pPr>
       <w:r>
-        <w:t>3.  Na criação de projeto, selecionar CCET e abrir a lista de cursos.</w:t>
+        <w:t>3.  Salvar e verificar o resumo do perfil.</w:t>
       </w:r>
     </w:p>
     <w:p>
@@ -4764,12 +5522,11 @@
     </w:p>
     <w:p>
       <w:pPr>
-        <w:keepNext/>
         <w:keepLines/>
         <w:ind w:left="403" w:hanging="317"/>
       </w:pPr>
       <w:r>
-        <w:t>•  Não aparecem centros genéricos ou de teste.</w:t>
+        <w:t>•  A lista apresenta os cursos do catálogo UFAC.</w:t>
       </w:r>
     </w:p>
     <w:p>
@@ -4778,31 +5535,18 @@
         <w:ind w:left="403" w:hanging="317"/>
       </w:pPr>
       <w:r>
-        <w:t>•  Após escolher CCET, somente os quatro cursos vinculados ao centro são oferecidos.</w:t>
+        <w:t>•  Curso, matrícula e demais dados ficam disponíveis no perfil.</w:t>
       </w:r>
     </w:p>
     <w:p/>
     <w:p>
       <w:pPr>
-        <w:pStyle w:val="Heading1"/>
-      </w:pPr>
-      <w:r>
-        <w:t>Casos de teste do coordenador</w:t>
-      </w:r>
-    </w:p>
-    <w:p>
-      <w:r>
-        <w:t>Os testes percorrem as cinco etapas atuais do cadastro e as ações posteriores à submissão.</w:t>
-      </w:r>
-    </w:p>
-    <w:p>
-      <w:pPr>
         <w:pStyle w:val="Heading3"/>
         <w:keepNext/>
         <w:keepLines/>
       </w:pPr>
       <w:r>
-        <w:t>CT-COO-001  Consultar painel e projetos do coordenador</w:t>
+        <w:t>CT-PER-004  Validar centros e cursos vinculados</w:t>
       </w:r>
     </w:p>
     <w:p>
@@ -4818,7 +5562,7 @@
         <w:t xml:space="preserve">Perfil: </w:t>
       </w:r>
       <w:r>
-        <w:t>Coordenador</w:t>
+        <w:t>Coordenador Aluno</w:t>
       </w:r>
     </w:p>
     <w:p>
@@ -4850,7 +5594,7 @@
         <w:t xml:space="preserve">Pré-condições: </w:t>
       </w:r>
       <w:r>
-        <w:t>Entrar como Ana Souza.</w:t>
+        <w:t>Dados de amostra carregados em produção.</w:t>
       </w:r>
     </w:p>
     <w:p>
@@ -4868,22 +5612,29 @@
     </w:p>
     <w:p>
       <w:pPr>
-        <w:keepNext/>
         <w:keepLines/>
         <w:ind w:left="403" w:hanging="317"/>
       </w:pPr>
       <w:r>
-        <w:t>1.  Abrir Tela Principal.</w:t>
-      </w:r>
-    </w:p>
-    <w:p>
-      <w:pPr>
-        <w:keepNext/>
+        <w:t>1.  Abrir uma seleção de centro.</w:t>
+      </w:r>
+    </w:p>
+    <w:p>
+      <w:pPr>
         <w:keepLines/>
         <w:ind w:left="403" w:hanging="317"/>
       </w:pPr>
       <w:r>
-        <w:t>2.  Abrir Meus Projetos e alternar entre as abas de situação.</w:t>
+        <w:t>2.  Confirmar os oito centros acadêmicos.</w:t>
+      </w:r>
+    </w:p>
+    <w:p>
+      <w:pPr>
+        <w:keepLines/>
+        <w:ind w:left="403" w:hanging="317"/>
+      </w:pPr>
+      <w:r>
+        <w:t>3.  Na criação de projeto, selecionar CCET e abrir a lista de cursos.</w:t>
       </w:r>
     </w:p>
     <w:p>
@@ -4901,12 +5652,11 @@
     </w:p>
     <w:p>
       <w:pPr>
-        <w:keepNext/>
         <w:keepLines/>
         <w:ind w:left="403" w:hanging="317"/>
       </w:pPr>
       <w:r>
-        <w:t>•  Métricas e projetos pertencem ao coordenador autenticado.</w:t>
+        <w:t>•  Não aparecem centros genéricos ou de teste.</w:t>
       </w:r>
     </w:p>
     <w:p>
@@ -4915,18 +5665,35 @@
         <w:ind w:left="403" w:hanging="317"/>
       </w:pPr>
       <w:r>
-        <w:t>•  O rascunho, o projeto aguardando Centro e o projeto submetido aparecem nas abas corretas.</w:t>
+        <w:t>•  Após escolher CCET, somente os quatro cursos vinculados ao centro são oferecidos.</w:t>
       </w:r>
     </w:p>
     <w:p/>
     <w:p>
       <w:pPr>
+        <w:pStyle w:val="Heading1"/>
+        <w:keepNext/>
+      </w:pPr>
+      <w:r>
+        <w:t>Casos de teste do coordenador</w:t>
+      </w:r>
+    </w:p>
+    <w:p>
+      <w:pPr>
+        <w:keepNext/>
+      </w:pPr>
+      <w:r>
+        <w:t>Os testes percorrem as cinco etapas atuais do cadastro e as ações posteriores à submissão.</w:t>
+      </w:r>
+    </w:p>
+    <w:p>
+      <w:pPr>
         <w:pStyle w:val="Heading3"/>
         <w:keepNext/>
         <w:keepLines/>
       </w:pPr>
       <w:r>
-        <w:t>CT-COO-002  Escolher entre rascunho e novo projeto</w:t>
+        <w:t>CT-COO-001  Consultar painel e projetos do coordenador</w:t>
       </w:r>
     </w:p>
     <w:p>
@@ -4974,7 +5741,7 @@
         <w:t xml:space="preserve">Pré-condições: </w:t>
       </w:r>
       <w:r>
-        <w:t>Ana Souza possui um rascunho.</w:t>
+        <w:t>Entrar como Ana Souza.</w:t>
       </w:r>
     </w:p>
     <w:p>
@@ -4992,32 +5759,20 @@
     </w:p>
     <w:p>
       <w:pPr>
-        <w:keepNext/>
         <w:keepLines/>
         <w:ind w:left="403" w:hanging="317"/>
       </w:pPr>
       <w:r>
-        <w:t>1.  Clicar em Criar Novo Projeto.</w:t>
-      </w:r>
-    </w:p>
-    <w:p>
-      <w:pPr>
-        <w:keepNext/>
+        <w:t>1.  Abrir Tela Principal.</w:t>
+      </w:r>
+    </w:p>
+    <w:p>
+      <w:pPr>
         <w:keepLines/>
         <w:ind w:left="403" w:hanging="317"/>
       </w:pPr>
       <w:r>
-        <w:t>2.  Verificar o alerta e as ações.</w:t>
-      </w:r>
-    </w:p>
-    <w:p>
-      <w:pPr>
-        <w:keepNext/>
-        <w:keepLines/>
-        <w:ind w:left="403" w:hanging="317"/>
-      </w:pPr>
-      <w:r>
-        <w:t>3.  Selecionar Iniciar um novo projeto.</w:t>
+        <w:t>2.  Abrir Meus Projetos e alternar entre as abas de situação.</w:t>
       </w:r>
     </w:p>
     <w:p>
@@ -5035,12 +5790,11 @@
     </w:p>
     <w:p>
       <w:pPr>
-        <w:keepNext/>
         <w:keepLines/>
         <w:ind w:left="403" w:hanging="317"/>
       </w:pPr>
       <w:r>
-        <w:t>•  A caixa informativa mantém altura proporcional ao conteúdo.</w:t>
+        <w:t>•  Métricas e projetos pertencem ao coordenador autenticado.</w:t>
       </w:r>
     </w:p>
     <w:p>
@@ -5049,7 +5803,7 @@
         <w:ind w:left="403" w:hanging="317"/>
       </w:pPr>
       <w:r>
-        <w:t>•  O sistema informa que o novo projeto não usará os rascunhos existentes e solicita confirmação.</w:t>
+        <w:t>•  O rascunho, o projeto aguardando Centro e o projeto submetido aparecem nas abas corretas.</w:t>
       </w:r>
     </w:p>
     <w:p/>
@@ -5060,7 +5814,7 @@
         <w:keepLines/>
       </w:pPr>
       <w:r>
-        <w:t>CT-COO-003  Criar projeto de Agência de Fomento</w:t>
+        <w:t>CT-COO-002  Escolher entre rascunho e novo projeto</w:t>
       </w:r>
     </w:p>
     <w:p>
@@ -5108,6 +5862,136 @@
         <w:t xml:space="preserve">Pré-condições: </w:t>
       </w:r>
       <w:r>
+        <w:t>Ana Souza possui um rascunho.</w:t>
+      </w:r>
+    </w:p>
+    <w:p>
+      <w:pPr>
+        <w:keepNext/>
+        <w:keepLines/>
+        <w:spacing w:after="40"/>
+      </w:pPr>
+      <w:r>
+        <w:rPr>
+          <w:b/>
+        </w:rPr>
+        <w:t>Passos</w:t>
+      </w:r>
+    </w:p>
+    <w:p>
+      <w:pPr>
+        <w:keepLines/>
+        <w:ind w:left="403" w:hanging="317"/>
+      </w:pPr>
+      <w:r>
+        <w:t>1.  Clicar em Criar Novo Projeto.</w:t>
+      </w:r>
+    </w:p>
+    <w:p>
+      <w:pPr>
+        <w:keepLines/>
+        <w:ind w:left="403" w:hanging="317"/>
+      </w:pPr>
+      <w:r>
+        <w:t>2.  Verificar o alerta e as ações.</w:t>
+      </w:r>
+    </w:p>
+    <w:p>
+      <w:pPr>
+        <w:keepLines/>
+        <w:ind w:left="403" w:hanging="317"/>
+      </w:pPr>
+      <w:r>
+        <w:t>3.  Selecionar Iniciar um novo projeto.</w:t>
+      </w:r>
+    </w:p>
+    <w:p>
+      <w:pPr>
+        <w:keepNext/>
+        <w:keepLines/>
+        <w:spacing w:after="40"/>
+      </w:pPr>
+      <w:r>
+        <w:rPr>
+          <w:b/>
+        </w:rPr>
+        <w:t>Resultado esperado</w:t>
+      </w:r>
+    </w:p>
+    <w:p>
+      <w:pPr>
+        <w:keepLines/>
+        <w:ind w:left="403" w:hanging="317"/>
+      </w:pPr>
+      <w:r>
+        <w:t>•  A caixa informativa mantém altura proporcional ao conteúdo.</w:t>
+      </w:r>
+    </w:p>
+    <w:p>
+      <w:pPr>
+        <w:keepLines/>
+        <w:ind w:left="403" w:hanging="317"/>
+      </w:pPr>
+      <w:r>
+        <w:t>•  O sistema informa que o novo projeto não usará os rascunhos existentes e solicita confirmação.</w:t>
+      </w:r>
+    </w:p>
+    <w:p/>
+    <w:p>
+      <w:pPr>
+        <w:pStyle w:val="Heading3"/>
+        <w:keepNext/>
+        <w:keepLines/>
+      </w:pPr>
+      <w:r>
+        <w:t>CT-COO-003  Criar projeto de Agência de Fomento</w:t>
+      </w:r>
+    </w:p>
+    <w:p>
+      <w:pPr>
+        <w:keepNext/>
+        <w:keepLines/>
+        <w:spacing w:after="80"/>
+      </w:pPr>
+      <w:r>
+        <w:rPr>
+          <w:b/>
+        </w:rPr>
+        <w:t xml:space="preserve">Perfil: </w:t>
+      </w:r>
+      <w:r>
+        <w:t>Coordenador</w:t>
+      </w:r>
+    </w:p>
+    <w:p>
+      <w:pPr>
+        <w:keepNext/>
+        <w:keepLines/>
+        <w:spacing w:after="80"/>
+      </w:pPr>
+      <w:r>
+        <w:rPr>
+          <w:b/>
+        </w:rPr>
+        <w:t xml:space="preserve">Prioridade: </w:t>
+      </w:r>
+      <w:r>
+        <w:t>Alta</w:t>
+      </w:r>
+    </w:p>
+    <w:p>
+      <w:pPr>
+        <w:keepNext/>
+        <w:keepLines/>
+        <w:spacing w:after="80"/>
+      </w:pPr>
+      <w:r>
+        <w:rPr>
+          <w:b/>
+        </w:rPr>
+        <w:t xml:space="preserve">Pré-condições: </w:t>
+      </w:r>
+      <w:r>
         <w:t>Novo projeto iniciado.</w:t>
       </w:r>
     </w:p>
@@ -5142,7 +6026,6 @@
     </w:p>
     <w:p>
       <w:pPr>
-        <w:keepNext/>
         <w:keepLines/>
         <w:ind w:left="403" w:hanging="317"/>
       </w:pPr>
@@ -5152,7 +6035,6 @@
     </w:p>
     <w:p>
       <w:pPr>
-        <w:keepNext/>
         <w:keepLines/>
         <w:ind w:left="403" w:hanging="317"/>
       </w:pPr>
@@ -5162,7 +6044,6 @@
     </w:p>
     <w:p>
       <w:pPr>
-        <w:keepNext/>
         <w:keepLines/>
         <w:ind w:left="403" w:hanging="317"/>
       </w:pPr>
@@ -5185,7 +6066,6 @@
     </w:p>
     <w:p>
       <w:pPr>
-        <w:keepNext/>
         <w:keepLines/>
         <w:ind w:left="403" w:hanging="317"/>
       </w:pPr>
@@ -5276,7 +6156,6 @@
     </w:p>
     <w:p>
       <w:pPr>
-        <w:keepNext/>
         <w:keepLines/>
         <w:ind w:left="403" w:hanging="317"/>
       </w:pPr>
@@ -5286,7 +6165,6 @@
     </w:p>
     <w:p>
       <w:pPr>
-        <w:keepNext/>
         <w:keepLines/>
         <w:ind w:left="403" w:hanging="317"/>
       </w:pPr>
@@ -5296,7 +6174,6 @@
     </w:p>
     <w:p>
       <w:pPr>
-        <w:keepNext/>
         <w:keepLines/>
         <w:ind w:left="403" w:hanging="317"/>
       </w:pPr>
@@ -5319,7 +6196,6 @@
     </w:p>
     <w:p>
       <w:pPr>
-        <w:keepNext/>
         <w:keepLines/>
         <w:ind w:left="403" w:hanging="317"/>
       </w:pPr>
@@ -5410,7 +6286,6 @@
     </w:p>
     <w:p>
       <w:pPr>
-        <w:keepNext/>
         <w:keepLines/>
         <w:ind w:left="403" w:hanging="317"/>
       </w:pPr>
@@ -5420,7 +6295,6 @@
     </w:p>
     <w:p>
       <w:pPr>
-        <w:keepNext/>
         <w:keepLines/>
         <w:ind w:left="403" w:hanging="317"/>
       </w:pPr>
@@ -5430,7 +6304,6 @@
     </w:p>
     <w:p>
       <w:pPr>
-        <w:keepNext/>
         <w:keepLines/>
         <w:ind w:left="403" w:hanging="317"/>
       </w:pPr>
@@ -5453,7 +6326,6 @@
     </w:p>
     <w:p>
       <w:pPr>
-        <w:keepNext/>
         <w:keepLines/>
         <w:ind w:left="403" w:hanging="317"/>
       </w:pPr>
@@ -5544,7 +6416,6 @@
     </w:p>
     <w:p>
       <w:pPr>
-        <w:keepNext/>
         <w:keepLines/>
         <w:ind w:left="403" w:hanging="317"/>
       </w:pPr>
@@ -5554,7 +6425,6 @@
     </w:p>
     <w:p>
       <w:pPr>
-        <w:keepNext/>
         <w:keepLines/>
         <w:ind w:left="403" w:hanging="317"/>
       </w:pPr>
@@ -5564,7 +6434,6 @@
     </w:p>
     <w:p>
       <w:pPr>
-        <w:keepNext/>
         <w:keepLines/>
         <w:ind w:left="403" w:hanging="317"/>
       </w:pPr>
@@ -5587,7 +6456,6 @@
     </w:p>
     <w:p>
       <w:pPr>
-        <w:keepNext/>
         <w:keepLines/>
         <w:ind w:left="403" w:hanging="317"/>
       </w:pPr>
@@ -5678,7 +6546,6 @@
     </w:p>
     <w:p>
       <w:pPr>
-        <w:keepNext/>
         <w:keepLines/>
         <w:ind w:left="403" w:hanging="317"/>
       </w:pPr>
@@ -5688,7 +6555,6 @@
     </w:p>
     <w:p>
       <w:pPr>
-        <w:keepNext/>
         <w:keepLines/>
         <w:ind w:left="403" w:hanging="317"/>
       </w:pPr>
@@ -5698,7 +6564,6 @@
     </w:p>
     <w:p>
       <w:pPr>
-        <w:keepNext/>
         <w:keepLines/>
         <w:ind w:left="403" w:hanging="317"/>
       </w:pPr>
@@ -5721,7 +6586,6 @@
     </w:p>
     <w:p>
       <w:pPr>
-        <w:keepNext/>
         <w:keepLines/>
         <w:ind w:left="403" w:hanging="317"/>
       </w:pPr>
@@ -5812,7 +6676,6 @@
     </w:p>
     <w:p>
       <w:pPr>
-        <w:keepNext/>
         <w:keepLines/>
         <w:ind w:left="403" w:hanging="317"/>
       </w:pPr>
@@ -5822,7 +6685,6 @@
     </w:p>
     <w:p>
       <w:pPr>
-        <w:keepNext/>
         <w:keepLines/>
         <w:ind w:left="403" w:hanging="317"/>
       </w:pPr>
@@ -5832,7 +6694,6 @@
     </w:p>
     <w:p>
       <w:pPr>
-        <w:keepNext/>
         <w:keepLines/>
         <w:ind w:left="403" w:hanging="317"/>
       </w:pPr>
@@ -5855,7 +6716,6 @@
     </w:p>
     <w:p>
       <w:pPr>
-        <w:keepNext/>
         <w:keepLines/>
         <w:ind w:left="403" w:hanging="317"/>
       </w:pPr>
@@ -5962,7 +6822,6 @@
     </w:p>
     <w:p>
       <w:pPr>
-        <w:keepNext/>
         <w:keepLines/>
         <w:ind w:left="403" w:hanging="317"/>
       </w:pPr>
@@ -5972,7 +6831,6 @@
     </w:p>
     <w:p>
       <w:pPr>
-        <w:keepNext/>
         <w:keepLines/>
         <w:ind w:left="403" w:hanging="317"/>
       </w:pPr>
@@ -5982,7 +6840,6 @@
     </w:p>
     <w:p>
       <w:pPr>
-        <w:keepNext/>
         <w:keepLines/>
         <w:ind w:left="403" w:hanging="317"/>
       </w:pPr>
@@ -6005,7 +6862,6 @@
     </w:p>
     <w:p>
       <w:pPr>
-        <w:keepNext/>
         <w:keepLines/>
         <w:ind w:left="403" w:hanging="317"/>
       </w:pPr>
@@ -6094,7 +6950,7 @@
         <w:t xml:space="preserve">Dados de teste: </w:t>
       </w:r>
       <w:r>
-        <w:t>output/pdf/projeto_teste_preenchimento_automatico.pdf.</w:t>
+        <w:t>Arquivo local output/pdf/projeto_teste_preenchimento_automatico.pdf.</w:t>
       </w:r>
     </w:p>
     <w:p>
@@ -6112,7 +6968,6 @@
     </w:p>
     <w:p>
       <w:pPr>
-        <w:keepNext/>
         <w:keepLines/>
         <w:ind w:left="403" w:hanging="317"/>
       </w:pPr>
@@ -6122,7 +6977,6 @@
     </w:p>
     <w:p>
       <w:pPr>
-        <w:keepNext/>
         <w:keepLines/>
         <w:ind w:left="403" w:hanging="317"/>
       </w:pPr>
@@ -6132,7 +6986,6 @@
     </w:p>
     <w:p>
       <w:pPr>
-        <w:keepNext/>
         <w:keepLines/>
         <w:ind w:left="403" w:hanging="317"/>
       </w:pPr>
@@ -6155,7 +7008,6 @@
     </w:p>
     <w:p>
       <w:pPr>
-        <w:keepNext/>
         <w:keepLines/>
         <w:ind w:left="403" w:hanging="317"/>
       </w:pPr>
@@ -6246,7 +7098,6 @@
     </w:p>
     <w:p>
       <w:pPr>
-        <w:keepNext/>
         <w:keepLines/>
         <w:ind w:left="403" w:hanging="317"/>
       </w:pPr>
@@ -6256,7 +7107,6 @@
     </w:p>
     <w:p>
       <w:pPr>
-        <w:keepNext/>
         <w:keepLines/>
         <w:ind w:left="403" w:hanging="317"/>
       </w:pPr>
@@ -6279,7 +7129,6 @@
     </w:p>
     <w:p>
       <w:pPr>
-        <w:keepNext/>
         <w:keepLines/>
         <w:ind w:left="403" w:hanging="317"/>
       </w:pPr>
@@ -6370,7 +7219,6 @@
     </w:p>
     <w:p>
       <w:pPr>
-        <w:keepNext/>
         <w:keepLines/>
         <w:ind w:left="403" w:hanging="317"/>
       </w:pPr>
@@ -6380,7 +7228,6 @@
     </w:p>
     <w:p>
       <w:pPr>
-        <w:keepNext/>
         <w:keepLines/>
         <w:ind w:left="403" w:hanging="317"/>
       </w:pPr>
@@ -6390,7 +7237,6 @@
     </w:p>
     <w:p>
       <w:pPr>
-        <w:keepNext/>
         <w:keepLines/>
         <w:ind w:left="403" w:hanging="317"/>
       </w:pPr>
@@ -6413,7 +7259,6 @@
     </w:p>
     <w:p>
       <w:pPr>
-        <w:keepNext/>
         <w:keepLines/>
         <w:ind w:left="403" w:hanging="317"/>
       </w:pPr>
@@ -6504,7 +7349,6 @@
     </w:p>
     <w:p>
       <w:pPr>
-        <w:keepNext/>
         <w:keepLines/>
         <w:ind w:left="403" w:hanging="317"/>
       </w:pPr>
@@ -6514,7 +7358,6 @@
     </w:p>
     <w:p>
       <w:pPr>
-        <w:keepNext/>
         <w:keepLines/>
         <w:ind w:left="403" w:hanging="317"/>
       </w:pPr>
@@ -6524,7 +7367,6 @@
     </w:p>
     <w:p>
       <w:pPr>
-        <w:keepNext/>
         <w:keepLines/>
         <w:ind w:left="403" w:hanging="317"/>
       </w:pPr>
@@ -6547,7 +7389,6 @@
     </w:p>
     <w:p>
       <w:pPr>
-        <w:keepNext/>
         <w:keepLines/>
         <w:ind w:left="403" w:hanging="317"/>
       </w:pPr>
@@ -6654,7 +7495,6 @@
     </w:p>
     <w:p>
       <w:pPr>
-        <w:keepNext/>
         <w:keepLines/>
         <w:ind w:left="403" w:hanging="317"/>
       </w:pPr>
@@ -6664,7 +7504,6 @@
     </w:p>
     <w:p>
       <w:pPr>
-        <w:keepNext/>
         <w:keepLines/>
         <w:ind w:left="403" w:hanging="317"/>
       </w:pPr>
@@ -6674,7 +7513,6 @@
     </w:p>
     <w:p>
       <w:pPr>
-        <w:keepNext/>
         <w:keepLines/>
         <w:ind w:left="403" w:hanging="317"/>
       </w:pPr>
@@ -6697,7 +7535,6 @@
     </w:p>
     <w:p>
       <w:pPr>
-        <w:keepNext/>
         <w:keepLines/>
         <w:ind w:left="403" w:hanging="317"/>
       </w:pPr>
@@ -6788,7 +7625,6 @@
     </w:p>
     <w:p>
       <w:pPr>
-        <w:keepNext/>
         <w:keepLines/>
         <w:ind w:left="403" w:hanging="317"/>
       </w:pPr>
@@ -6798,7 +7634,6 @@
     </w:p>
     <w:p>
       <w:pPr>
-        <w:keepNext/>
         <w:keepLines/>
         <w:ind w:left="403" w:hanging="317"/>
       </w:pPr>
@@ -6821,7 +7656,6 @@
     </w:p>
     <w:p>
       <w:pPr>
-        <w:keepNext/>
         <w:keepLines/>
         <w:ind w:left="403" w:hanging="317"/>
       </w:pPr>
@@ -6912,7 +7746,6 @@
     </w:p>
     <w:p>
       <w:pPr>
-        <w:keepNext/>
         <w:keepLines/>
         <w:ind w:left="403" w:hanging="317"/>
       </w:pPr>
@@ -6922,7 +7755,6 @@
     </w:p>
     <w:p>
       <w:pPr>
-        <w:keepNext/>
         <w:keepLines/>
         <w:ind w:left="403" w:hanging="317"/>
       </w:pPr>
@@ -6945,7 +7777,6 @@
     </w:p>
     <w:p>
       <w:pPr>
-        <w:keepNext/>
         <w:keepLines/>
         <w:ind w:left="403" w:hanging="317"/>
       </w:pPr>
@@ -7036,7 +7867,6 @@
     </w:p>
     <w:p>
       <w:pPr>
-        <w:keepNext/>
         <w:keepLines/>
         <w:ind w:left="403" w:hanging="317"/>
       </w:pPr>
@@ -7046,7 +7876,6 @@
     </w:p>
     <w:p>
       <w:pPr>
-        <w:keepNext/>
         <w:keepLines/>
         <w:ind w:left="403" w:hanging="317"/>
       </w:pPr>
@@ -7056,7 +7885,6 @@
     </w:p>
     <w:p>
       <w:pPr>
-        <w:keepNext/>
         <w:keepLines/>
         <w:ind w:left="403" w:hanging="317"/>
       </w:pPr>
@@ -7079,7 +7907,6 @@
     </w:p>
     <w:p>
       <w:pPr>
-        <w:keepNext/>
         <w:keepLines/>
         <w:ind w:left="403" w:hanging="317"/>
       </w:pPr>
@@ -7170,7 +7997,6 @@
     </w:p>
     <w:p>
       <w:pPr>
-        <w:keepNext/>
         <w:keepLines/>
         <w:ind w:left="403" w:hanging="317"/>
       </w:pPr>
@@ -7180,7 +8006,6 @@
     </w:p>
     <w:p>
       <w:pPr>
-        <w:keepNext/>
         <w:keepLines/>
         <w:ind w:left="403" w:hanging="317"/>
       </w:pPr>
@@ -7190,7 +8015,6 @@
     </w:p>
     <w:p>
       <w:pPr>
-        <w:keepNext/>
         <w:keepLines/>
         <w:ind w:left="403" w:hanging="317"/>
       </w:pPr>
@@ -7213,7 +8037,6 @@
     </w:p>
     <w:p>
       <w:pPr>
-        <w:keepNext/>
         <w:keepLines/>
         <w:ind w:left="403" w:hanging="317"/>
       </w:pPr>
@@ -7304,7 +8127,6 @@
     </w:p>
     <w:p>
       <w:pPr>
-        <w:keepNext/>
         <w:keepLines/>
         <w:ind w:left="403" w:hanging="317"/>
       </w:pPr>
@@ -7314,7 +8136,6 @@
     </w:p>
     <w:p>
       <w:pPr>
-        <w:keepNext/>
         <w:keepLines/>
         <w:ind w:left="403" w:hanging="317"/>
       </w:pPr>
@@ -7324,7 +8145,6 @@
     </w:p>
     <w:p>
       <w:pPr>
-        <w:keepNext/>
         <w:keepLines/>
         <w:ind w:left="403" w:hanging="317"/>
       </w:pPr>
@@ -7347,7 +8167,6 @@
     </w:p>
     <w:p>
       <w:pPr>
-        <w:keepNext/>
         <w:keepLines/>
         <w:ind w:left="403" w:hanging="317"/>
       </w:pPr>
@@ -7370,7 +8189,6 @@
         <w:pStyle w:val="Heading3"/>
         <w:keepNext/>
         <w:keepLines/>
-        <w:pageBreakBefore/>
       </w:pPr>
       <w:r>
         <w:t>CT-COO-020  Iniciar projeto aprovado e validar bloqueio ético</w:t>
@@ -7439,7 +8257,6 @@
     </w:p>
     <w:p>
       <w:pPr>
-        <w:keepNext/>
         <w:keepLines/>
         <w:ind w:left="403" w:hanging="317"/>
       </w:pPr>
@@ -7449,7 +8266,6 @@
     </w:p>
     <w:p>
       <w:pPr>
-        <w:keepNext/>
         <w:keepLines/>
         <w:ind w:left="403" w:hanging="317"/>
       </w:pPr>
@@ -7459,7 +8275,6 @@
     </w:p>
     <w:p>
       <w:pPr>
-        <w:keepNext/>
         <w:keepLines/>
         <w:ind w:left="403" w:hanging="317"/>
       </w:pPr>
@@ -7482,7 +8297,6 @@
     </w:p>
     <w:p>
       <w:pPr>
-        <w:keepNext/>
         <w:keepLines/>
         <w:ind w:left="403" w:hanging="317"/>
       </w:pPr>
@@ -7573,7 +8387,6 @@
     </w:p>
     <w:p>
       <w:pPr>
-        <w:keepNext/>
         <w:keepLines/>
         <w:ind w:left="403" w:hanging="317"/>
       </w:pPr>
@@ -7583,7 +8396,6 @@
     </w:p>
     <w:p>
       <w:pPr>
-        <w:keepNext/>
         <w:keepLines/>
         <w:ind w:left="403" w:hanging="317"/>
       </w:pPr>
@@ -7593,7 +8405,6 @@
     </w:p>
     <w:p>
       <w:pPr>
-        <w:keepNext/>
         <w:keepLines/>
         <w:ind w:left="403" w:hanging="317"/>
       </w:pPr>
@@ -7616,7 +8427,6 @@
     </w:p>
     <w:p>
       <w:pPr>
-        <w:keepNext/>
         <w:keepLines/>
         <w:ind w:left="403" w:hanging="317"/>
       </w:pPr>
@@ -7637,12 +8447,16 @@
     <w:p>
       <w:pPr>
         <w:pStyle w:val="Heading1"/>
+        <w:keepNext/>
       </w:pPr>
       <w:r>
         <w:t>Casos de teste do Centro de Estudos</w:t>
       </w:r>
     </w:p>
     <w:p>
+      <w:pPr>
+        <w:keepNext/>
+      </w:pPr>
       <w:r>
         <w:t>O link é temporário, restrito e de uso único.</w:t>
       </w:r>
@@ -7702,7 +8516,7 @@
         <w:t xml:space="preserve">Pré-condições: </w:t>
       </w:r>
       <w:r>
-        <w:t>Usar o link de homologação antes de consumi-lo.</w:t>
+        <w:t>Usar o link de amostra do Centro antes de consumi-lo.</w:t>
       </w:r>
     </w:p>
     <w:p>
@@ -7720,7 +8534,6 @@
     </w:p>
     <w:p>
       <w:pPr>
-        <w:keepNext/>
         <w:keepLines/>
         <w:ind w:left="403" w:hanging="317"/>
       </w:pPr>
@@ -7730,7 +8543,6 @@
     </w:p>
     <w:p>
       <w:pPr>
-        <w:keepNext/>
         <w:keepLines/>
         <w:ind w:left="403" w:hanging="317"/>
       </w:pPr>
@@ -7753,7 +8565,6 @@
     </w:p>
     <w:p>
       <w:pPr>
-        <w:keepNext/>
         <w:keepLines/>
         <w:ind w:left="403" w:hanging="317"/>
       </w:pPr>
@@ -7844,7 +8655,6 @@
     </w:p>
     <w:p>
       <w:pPr>
-        <w:keepNext/>
         <w:keepLines/>
         <w:ind w:left="403" w:hanging="317"/>
       </w:pPr>
@@ -7854,7 +8664,6 @@
     </w:p>
     <w:p>
       <w:pPr>
-        <w:keepNext/>
         <w:keepLines/>
         <w:ind w:left="403" w:hanging="317"/>
       </w:pPr>
@@ -7877,7 +8686,6 @@
     </w:p>
     <w:p>
       <w:pPr>
-        <w:keepNext/>
         <w:keepLines/>
         <w:ind w:left="403" w:hanging="317"/>
       </w:pPr>
@@ -7968,7 +8776,6 @@
     </w:p>
     <w:p>
       <w:pPr>
-        <w:keepNext/>
         <w:keepLines/>
         <w:ind w:left="403" w:hanging="317"/>
       </w:pPr>
@@ -7978,7 +8785,6 @@
     </w:p>
     <w:p>
       <w:pPr>
-        <w:keepNext/>
         <w:keepLines/>
         <w:ind w:left="403" w:hanging="317"/>
       </w:pPr>
@@ -8001,7 +8807,6 @@
     </w:p>
     <w:p>
       <w:pPr>
-        <w:keepNext/>
         <w:keepLines/>
         <w:ind w:left="403" w:hanging="317"/>
       </w:pPr>
@@ -8092,7 +8897,6 @@
     </w:p>
     <w:p>
       <w:pPr>
-        <w:keepNext/>
         <w:keepLines/>
         <w:ind w:left="403" w:hanging="317"/>
       </w:pPr>
@@ -8102,7 +8906,6 @@
     </w:p>
     <w:p>
       <w:pPr>
-        <w:keepNext/>
         <w:keepLines/>
         <w:ind w:left="403" w:hanging="317"/>
       </w:pPr>
@@ -8125,7 +8928,6 @@
     </w:p>
     <w:p>
       <w:pPr>
-        <w:keepNext/>
         <w:keepLines/>
         <w:ind w:left="403" w:hanging="317"/>
       </w:pPr>
@@ -8216,7 +9018,6 @@
     </w:p>
     <w:p>
       <w:pPr>
-        <w:keepNext/>
         <w:keepLines/>
         <w:ind w:left="403" w:hanging="317"/>
       </w:pPr>
@@ -8226,7 +9027,6 @@
     </w:p>
     <w:p>
       <w:pPr>
-        <w:keepNext/>
         <w:keepLines/>
         <w:ind w:left="403" w:hanging="317"/>
       </w:pPr>
@@ -8249,7 +9049,6 @@
     </w:p>
     <w:p>
       <w:pPr>
-        <w:keepNext/>
         <w:keepLines/>
         <w:ind w:left="403" w:hanging="317"/>
       </w:pPr>
@@ -8270,12 +9069,16 @@
     <w:p>
       <w:pPr>
         <w:pStyle w:val="Heading1"/>
+        <w:keepNext/>
       </w:pPr>
       <w:r>
         <w:t>Casos de teste do gestor</w:t>
       </w:r>
     </w:p>
     <w:p>
+      <w:pPr>
+        <w:keepNext/>
+      </w:pPr>
       <w:r>
         <w:t>Validação das rotinas administrativas, de decisão e de auditoria.</w:t>
       </w:r>
@@ -8353,7 +9156,6 @@
     </w:p>
     <w:p>
       <w:pPr>
-        <w:keepNext/>
         <w:keepLines/>
         <w:ind w:left="403" w:hanging="317"/>
       </w:pPr>
@@ -8363,7 +9165,6 @@
     </w:p>
     <w:p>
       <w:pPr>
-        <w:keepNext/>
         <w:keepLines/>
         <w:ind w:left="403" w:hanging="317"/>
       </w:pPr>
@@ -8386,12 +9187,11 @@
     </w:p>
     <w:p>
       <w:pPr>
-        <w:keepNext/>
         <w:keepLines/>
         <w:ind w:left="403" w:hanging="317"/>
       </w:pPr>
       <w:r>
-        <w:t>•  Os totais refletem a base de homologação.</w:t>
+        <w:t>•  Os totais refletem os dados de amostra em produção.</w:t>
       </w:r>
     </w:p>
     <w:p>
@@ -8459,7 +9259,7 @@
         <w:t xml:space="preserve">Pré-condições: </w:t>
       </w:r>
       <w:r>
-        <w:t>Base de homologação carregada.</w:t>
+        <w:t>Dados de amostra carregados em produção.</w:t>
       </w:r>
     </w:p>
     <w:p>
@@ -8477,7 +9277,6 @@
     </w:p>
     <w:p>
       <w:pPr>
-        <w:keepNext/>
         <w:keepLines/>
         <w:ind w:left="403" w:hanging="317"/>
       </w:pPr>
@@ -8487,7 +9286,6 @@
     </w:p>
     <w:p>
       <w:pPr>
-        <w:keepNext/>
         <w:keepLines/>
         <w:ind w:left="403" w:hanging="317"/>
       </w:pPr>
@@ -8497,7 +9295,6 @@
     </w:p>
     <w:p>
       <w:pPr>
-        <w:keepNext/>
         <w:keepLines/>
         <w:ind w:left="403" w:hanging="317"/>
       </w:pPr>
@@ -8520,7 +9317,6 @@
     </w:p>
     <w:p>
       <w:pPr>
-        <w:keepNext/>
         <w:keepLines/>
         <w:ind w:left="403" w:hanging="317"/>
       </w:pPr>
@@ -8593,7 +9389,7 @@
         <w:t xml:space="preserve">Pré-condições: </w:t>
       </w:r>
       <w:r>
-        <w:t>Usuário de homologação selecionado.</w:t>
+        <w:t>Usuário de amostra selecionado.</w:t>
       </w:r>
     </w:p>
     <w:p>
@@ -8611,7 +9407,6 @@
     </w:p>
     <w:p>
       <w:pPr>
-        <w:keepNext/>
         <w:keepLines/>
         <w:ind w:left="403" w:hanging="317"/>
       </w:pPr>
@@ -8621,7 +9416,6 @@
     </w:p>
     <w:p>
       <w:pPr>
-        <w:keepNext/>
         <w:keepLines/>
         <w:ind w:left="403" w:hanging="317"/>
       </w:pPr>
@@ -8631,7 +9425,6 @@
     </w:p>
     <w:p>
       <w:pPr>
-        <w:keepNext/>
         <w:keepLines/>
         <w:ind w:left="403" w:hanging="317"/>
       </w:pPr>
@@ -8654,7 +9447,6 @@
     </w:p>
     <w:p>
       <w:pPr>
-        <w:keepNext/>
         <w:keepLines/>
         <w:ind w:left="403" w:hanging="317"/>
       </w:pPr>
@@ -8727,7 +9519,7 @@
         <w:t xml:space="preserve">Pré-condições: </w:t>
       </w:r>
       <w:r>
-        <w:t>Criar uma conta temporária sem projetos; manter os usuários de homologação vinculados.</w:t>
+        <w:t>Criar uma conta temporária sem projetos; manter os usuários de amostra vinculados.</w:t>
       </w:r>
     </w:p>
     <w:p>
@@ -8745,7 +9537,6 @@
     </w:p>
     <w:p>
       <w:pPr>
-        <w:keepNext/>
         <w:keepLines/>
         <w:ind w:left="403" w:hanging="317"/>
       </w:pPr>
@@ -8755,7 +9546,6 @@
     </w:p>
     <w:p>
       <w:pPr>
-        <w:keepNext/>
         <w:keepLines/>
         <w:ind w:left="403" w:hanging="317"/>
       </w:pPr>
@@ -8778,7 +9568,6 @@
     </w:p>
     <w:p>
       <w:pPr>
-        <w:keepNext/>
         <w:keepLines/>
         <w:ind w:left="403" w:hanging="317"/>
       </w:pPr>
@@ -8869,7 +9658,6 @@
     </w:p>
     <w:p>
       <w:pPr>
-        <w:keepNext/>
         <w:keepLines/>
         <w:ind w:left="403" w:hanging="317"/>
       </w:pPr>
@@ -8879,7 +9667,6 @@
     </w:p>
     <w:p>
       <w:pPr>
-        <w:keepNext/>
         <w:keepLines/>
         <w:ind w:left="403" w:hanging="317"/>
       </w:pPr>
@@ -8902,7 +9689,6 @@
     </w:p>
     <w:p>
       <w:pPr>
-        <w:keepNext/>
         <w:keepLines/>
         <w:ind w:left="403" w:hanging="317"/>
       </w:pPr>
@@ -8993,7 +9779,6 @@
     </w:p>
     <w:p>
       <w:pPr>
-        <w:keepNext/>
         <w:keepLines/>
         <w:ind w:left="403" w:hanging="317"/>
       </w:pPr>
@@ -9003,7 +9788,6 @@
     </w:p>
     <w:p>
       <w:pPr>
-        <w:keepNext/>
         <w:keepLines/>
         <w:ind w:left="403" w:hanging="317"/>
       </w:pPr>
@@ -9026,7 +9810,6 @@
     </w:p>
     <w:p>
       <w:pPr>
-        <w:keepNext/>
         <w:keepLines/>
         <w:ind w:left="403" w:hanging="317"/>
       </w:pPr>
@@ -9117,7 +9900,6 @@
     </w:p>
     <w:p>
       <w:pPr>
-        <w:keepNext/>
         <w:keepLines/>
         <w:ind w:left="403" w:hanging="317"/>
       </w:pPr>
@@ -9127,7 +9909,6 @@
     </w:p>
     <w:p>
       <w:pPr>
-        <w:keepNext/>
         <w:keepLines/>
         <w:ind w:left="403" w:hanging="317"/>
       </w:pPr>
@@ -9137,7 +9918,6 @@
     </w:p>
     <w:p>
       <w:pPr>
-        <w:keepNext/>
         <w:keepLines/>
         <w:ind w:left="403" w:hanging="317"/>
       </w:pPr>
@@ -9160,7 +9940,6 @@
     </w:p>
     <w:p>
       <w:pPr>
-        <w:keepNext/>
         <w:keepLines/>
         <w:ind w:left="403" w:hanging="317"/>
       </w:pPr>
@@ -9251,7 +10030,6 @@
     </w:p>
     <w:p>
       <w:pPr>
-        <w:keepNext/>
         <w:keepLines/>
         <w:ind w:left="403" w:hanging="317"/>
       </w:pPr>
@@ -9261,7 +10039,6 @@
     </w:p>
     <w:p>
       <w:pPr>
-        <w:keepNext/>
         <w:keepLines/>
         <w:ind w:left="403" w:hanging="317"/>
       </w:pPr>
@@ -9284,7 +10061,6 @@
     </w:p>
     <w:p>
       <w:pPr>
-        <w:keepNext/>
         <w:keepLines/>
         <w:ind w:left="403" w:hanging="317"/>
       </w:pPr>
@@ -9375,7 +10151,6 @@
     </w:p>
     <w:p>
       <w:pPr>
-        <w:keepNext/>
         <w:keepLines/>
         <w:ind w:left="403" w:hanging="317"/>
       </w:pPr>
@@ -9385,7 +10160,6 @@
     </w:p>
     <w:p>
       <w:pPr>
-        <w:keepNext/>
         <w:keepLines/>
         <w:ind w:left="403" w:hanging="317"/>
       </w:pPr>
@@ -9395,7 +10169,6 @@
     </w:p>
     <w:p>
       <w:pPr>
-        <w:keepNext/>
         <w:keepLines/>
         <w:ind w:left="403" w:hanging="317"/>
       </w:pPr>
@@ -9418,7 +10191,6 @@
     </w:p>
     <w:p>
       <w:pPr>
-        <w:keepNext/>
         <w:keepLines/>
         <w:ind w:left="403" w:hanging="317"/>
       </w:pPr>
@@ -9509,7 +10281,6 @@
     </w:p>
     <w:p>
       <w:pPr>
-        <w:keepNext/>
         <w:keepLines/>
         <w:ind w:left="403" w:hanging="317"/>
       </w:pPr>
@@ -9519,7 +10290,6 @@
     </w:p>
     <w:p>
       <w:pPr>
-        <w:keepNext/>
         <w:keepLines/>
         <w:ind w:left="403" w:hanging="317"/>
       </w:pPr>
@@ -9529,7 +10299,6 @@
     </w:p>
     <w:p>
       <w:pPr>
-        <w:keepNext/>
         <w:keepLines/>
         <w:ind w:left="403" w:hanging="317"/>
       </w:pPr>
@@ -9552,7 +10321,6 @@
     </w:p>
     <w:p>
       <w:pPr>
-        <w:keepNext/>
         <w:keepLines/>
         <w:ind w:left="403" w:hanging="317"/>
       </w:pPr>
@@ -9625,7 +10393,7 @@
         <w:t xml:space="preserve">Pré-condições: </w:t>
       </w:r>
       <w:r>
-        <w:t>Base de homologação carregada.</w:t>
+        <w:t>Dados de amostra carregados em produção.</w:t>
       </w:r>
     </w:p>
     <w:p>
@@ -9643,7 +10411,6 @@
     </w:p>
     <w:p>
       <w:pPr>
-        <w:keepNext/>
         <w:keepLines/>
         <w:ind w:left="403" w:hanging="317"/>
       </w:pPr>
@@ -9653,7 +10420,6 @@
     </w:p>
     <w:p>
       <w:pPr>
-        <w:keepNext/>
         <w:keepLines/>
         <w:ind w:left="403" w:hanging="317"/>
       </w:pPr>
@@ -9663,7 +10429,6 @@
     </w:p>
     <w:p>
       <w:pPr>
-        <w:keepNext/>
         <w:keepLines/>
         <w:ind w:left="403" w:hanging="317"/>
       </w:pPr>
@@ -9686,7 +10451,6 @@
     </w:p>
     <w:p>
       <w:pPr>
-        <w:keepNext/>
         <w:keepLines/>
         <w:ind w:left="403" w:hanging="317"/>
       </w:pPr>
@@ -9777,7 +10541,6 @@
     </w:p>
     <w:p>
       <w:pPr>
-        <w:keepNext/>
         <w:keepLines/>
         <w:ind w:left="403" w:hanging="317"/>
       </w:pPr>
@@ -9787,7 +10550,6 @@
     </w:p>
     <w:p>
       <w:pPr>
-        <w:keepNext/>
         <w:keepLines/>
         <w:ind w:left="403" w:hanging="317"/>
       </w:pPr>
@@ -9810,7 +10572,6 @@
     </w:p>
     <w:p>
       <w:pPr>
-        <w:keepNext/>
         <w:keepLines/>
         <w:ind w:left="403" w:hanging="317"/>
       </w:pPr>
@@ -9901,7 +10662,6 @@
     </w:p>
     <w:p>
       <w:pPr>
-        <w:keepNext/>
         <w:keepLines/>
         <w:ind w:left="403" w:hanging="317"/>
       </w:pPr>
@@ -9911,7 +10671,6 @@
     </w:p>
     <w:p>
       <w:pPr>
-        <w:keepNext/>
         <w:keepLines/>
         <w:ind w:left="403" w:hanging="317"/>
       </w:pPr>
@@ -9921,7 +10680,6 @@
     </w:p>
     <w:p>
       <w:pPr>
-        <w:keepNext/>
         <w:keepLines/>
         <w:ind w:left="403" w:hanging="317"/>
       </w:pPr>
@@ -9944,7 +10702,6 @@
     </w:p>
     <w:p>
       <w:pPr>
-        <w:keepNext/>
         <w:keepLines/>
         <w:ind w:left="403" w:hanging="317"/>
       </w:pPr>
@@ -10035,7 +10792,6 @@
     </w:p>
     <w:p>
       <w:pPr>
-        <w:keepNext/>
         <w:keepLines/>
         <w:ind w:left="403" w:hanging="317"/>
       </w:pPr>
@@ -10045,7 +10801,6 @@
     </w:p>
     <w:p>
       <w:pPr>
-        <w:keepNext/>
         <w:keepLines/>
         <w:ind w:left="403" w:hanging="317"/>
       </w:pPr>
@@ -10055,7 +10810,6 @@
     </w:p>
     <w:p>
       <w:pPr>
-        <w:keepNext/>
         <w:keepLines/>
         <w:ind w:left="403" w:hanging="317"/>
       </w:pPr>
@@ -10078,7 +10832,6 @@
     </w:p>
     <w:p>
       <w:pPr>
-        <w:keepNext/>
         <w:keepLines/>
         <w:ind w:left="403" w:hanging="317"/>
       </w:pPr>
@@ -10169,7 +10922,6 @@
     </w:p>
     <w:p>
       <w:pPr>
-        <w:keepNext/>
         <w:keepLines/>
         <w:ind w:left="403" w:hanging="317"/>
       </w:pPr>
@@ -10179,7 +10931,6 @@
     </w:p>
     <w:p>
       <w:pPr>
-        <w:keepNext/>
         <w:keepLines/>
         <w:ind w:left="403" w:hanging="317"/>
       </w:pPr>
@@ -10202,7 +10953,6 @@
     </w:p>
     <w:p>
       <w:pPr>
-        <w:keepNext/>
         <w:keepLines/>
         <w:ind w:left="403" w:hanging="317"/>
       </w:pPr>
@@ -10293,7 +11043,6 @@
     </w:p>
     <w:p>
       <w:pPr>
-        <w:keepNext/>
         <w:keepLines/>
         <w:ind w:left="403" w:hanging="317"/>
       </w:pPr>
@@ -10303,7 +11052,6 @@
     </w:p>
     <w:p>
       <w:pPr>
-        <w:keepNext/>
         <w:keepLines/>
         <w:ind w:left="403" w:hanging="317"/>
       </w:pPr>
@@ -10326,7 +11074,6 @@
     </w:p>
     <w:p>
       <w:pPr>
-        <w:keepNext/>
         <w:keepLines/>
         <w:ind w:left="403" w:hanging="317"/>
       </w:pPr>
@@ -10417,7 +11164,6 @@
     </w:p>
     <w:p>
       <w:pPr>
-        <w:keepNext/>
         <w:keepLines/>
         <w:ind w:left="403" w:hanging="317"/>
       </w:pPr>
@@ -10427,7 +11173,6 @@
     </w:p>
     <w:p>
       <w:pPr>
-        <w:keepNext/>
         <w:keepLines/>
         <w:ind w:left="403" w:hanging="317"/>
       </w:pPr>
@@ -10437,7 +11182,6 @@
     </w:p>
     <w:p>
       <w:pPr>
-        <w:keepNext/>
         <w:keepLines/>
         <w:ind w:left="403" w:hanging="317"/>
       </w:pPr>
@@ -10460,7 +11204,6 @@
     </w:p>
     <w:p>
       <w:pPr>
-        <w:keepNext/>
         <w:keepLines/>
         <w:ind w:left="403" w:hanging="317"/>
       </w:pPr>
@@ -10481,13 +11224,16 @@
     <w:p>
       <w:pPr>
         <w:pStyle w:val="Heading1"/>
-        <w:pageBreakBefore/>
+        <w:keepNext/>
       </w:pPr>
       <w:r>
         <w:t>Casos de teste do aluno</w:t>
       </w:r>
     </w:p>
     <w:p>
+      <w:pPr>
+        <w:keepNext/>
+      </w:pPr>
       <w:r>
         <w:t>Validação do acompanhamento e das restrições do perfil discente.</w:t>
       </w:r>
@@ -10565,7 +11311,6 @@
     </w:p>
     <w:p>
       <w:pPr>
-        <w:keepNext/>
         <w:keepLines/>
         <w:ind w:left="403" w:hanging="317"/>
       </w:pPr>
@@ -10575,7 +11320,6 @@
     </w:p>
     <w:p>
       <w:pPr>
-        <w:keepNext/>
         <w:keepLines/>
         <w:ind w:left="403" w:hanging="317"/>
       </w:pPr>
@@ -10598,7 +11342,6 @@
     </w:p>
     <w:p>
       <w:pPr>
-        <w:keepNext/>
         <w:keepLines/>
         <w:ind w:left="403" w:hanging="317"/>
       </w:pPr>
@@ -10689,7 +11432,6 @@
     </w:p>
     <w:p>
       <w:pPr>
-        <w:keepNext/>
         <w:keepLines/>
         <w:ind w:left="403" w:hanging="317"/>
       </w:pPr>
@@ -10699,7 +11441,6 @@
     </w:p>
     <w:p>
       <w:pPr>
-        <w:keepNext/>
         <w:keepLines/>
         <w:ind w:left="403" w:hanging="317"/>
       </w:pPr>
@@ -10722,7 +11463,6 @@
     </w:p>
     <w:p>
       <w:pPr>
-        <w:keepNext/>
         <w:keepLines/>
         <w:ind w:left="403" w:hanging="317"/>
       </w:pPr>
@@ -10813,7 +11553,6 @@
     </w:p>
     <w:p>
       <w:pPr>
-        <w:keepNext/>
         <w:keepLines/>
         <w:ind w:left="403" w:hanging="317"/>
       </w:pPr>
@@ -10823,7 +11562,6 @@
     </w:p>
     <w:p>
       <w:pPr>
-        <w:keepNext/>
         <w:keepLines/>
         <w:ind w:left="403" w:hanging="317"/>
       </w:pPr>
@@ -10846,7 +11584,6 @@
     </w:p>
     <w:p>
       <w:pPr>
-        <w:keepNext/>
         <w:keepLines/>
         <w:ind w:left="403" w:hanging="317"/>
       </w:pPr>
@@ -10937,7 +11674,6 @@
     </w:p>
     <w:p>
       <w:pPr>
-        <w:keepNext/>
         <w:keepLines/>
         <w:ind w:left="403" w:hanging="317"/>
       </w:pPr>
@@ -10960,7 +11696,6 @@
     </w:p>
     <w:p>
       <w:pPr>
-        <w:keepNext/>
         <w:keepLines/>
         <w:ind w:left="403" w:hanging="317"/>
       </w:pPr>
@@ -11051,7 +11786,6 @@
     </w:p>
     <w:p>
       <w:pPr>
-        <w:keepNext/>
         <w:keepLines/>
         <w:ind w:left="403" w:hanging="317"/>
       </w:pPr>
@@ -11061,7 +11795,6 @@
     </w:p>
     <w:p>
       <w:pPr>
-        <w:keepNext/>
         <w:keepLines/>
         <w:ind w:left="403" w:hanging="317"/>
       </w:pPr>
@@ -11084,7 +11817,6 @@
     </w:p>
     <w:p>
       <w:pPr>
-        <w:keepNext/>
         <w:keepLines/>
         <w:ind w:left="403" w:hanging="317"/>
       </w:pPr>
@@ -11105,13 +11837,16 @@
     <w:p>
       <w:pPr>
         <w:pStyle w:val="Heading1"/>
-        <w:pageBreakBefore/>
+        <w:keepNext/>
       </w:pPr>
       <w:r>
         <w:t>Casos de teste da consulta pública</w:t>
       </w:r>
     </w:p>
     <w:p>
+      <w:pPr>
+        <w:keepNext/>
+      </w:pPr>
       <w:r>
         <w:t>Validação do acesso sem autenticação e da proteção de dados.</w:t>
       </w:r>
@@ -11189,7 +11924,6 @@
     </w:p>
     <w:p>
       <w:pPr>
-        <w:keepNext/>
         <w:keepLines/>
         <w:ind w:left="403" w:hanging="317"/>
       </w:pPr>
@@ -11199,7 +11933,6 @@
     </w:p>
     <w:p>
       <w:pPr>
-        <w:keepNext/>
         <w:keepLines/>
         <w:ind w:left="403" w:hanging="317"/>
       </w:pPr>
@@ -11222,7 +11955,6 @@
     </w:p>
     <w:p>
       <w:pPr>
-        <w:keepNext/>
         <w:keepLines/>
         <w:ind w:left="403" w:hanging="317"/>
       </w:pPr>
@@ -11245,7 +11977,6 @@
         <w:pStyle w:val="Heading3"/>
         <w:keepNext/>
         <w:keepLines/>
-        <w:pageBreakBefore/>
       </w:pPr>
       <w:r>
         <w:t>CT-PUB-002  Pesquisar e filtrar consulta pública</w:t>
@@ -11314,7 +12045,6 @@
     </w:p>
     <w:p>
       <w:pPr>
-        <w:keepNext/>
         <w:keepLines/>
         <w:ind w:left="403" w:hanging="317"/>
       </w:pPr>
@@ -11324,7 +12054,6 @@
     </w:p>
     <w:p>
       <w:pPr>
-        <w:keepNext/>
         <w:keepLines/>
         <w:ind w:left="403" w:hanging="317"/>
       </w:pPr>
@@ -11334,7 +12063,6 @@
     </w:p>
     <w:p>
       <w:pPr>
-        <w:keepNext/>
         <w:keepLines/>
         <w:ind w:left="403" w:hanging="317"/>
       </w:pPr>
@@ -11357,7 +12085,6 @@
     </w:p>
     <w:p>
       <w:pPr>
-        <w:keepNext/>
         <w:keepLines/>
         <w:ind w:left="403" w:hanging="317"/>
       </w:pPr>
@@ -11448,7 +12175,6 @@
     </w:p>
     <w:p>
       <w:pPr>
-        <w:keepNext/>
         <w:keepLines/>
         <w:ind w:left="403" w:hanging="317"/>
       </w:pPr>
@@ -11458,7 +12184,6 @@
     </w:p>
     <w:p>
       <w:pPr>
-        <w:keepNext/>
         <w:keepLines/>
         <w:ind w:left="403" w:hanging="317"/>
       </w:pPr>
@@ -11481,7 +12206,6 @@
     </w:p>
     <w:p>
       <w:pPr>
-        <w:keepNext/>
         <w:keepLines/>
         <w:ind w:left="403" w:hanging="317"/>
       </w:pPr>
@@ -11572,7 +12296,6 @@
     </w:p>
     <w:p>
       <w:pPr>
-        <w:keepNext/>
         <w:keepLines/>
         <w:ind w:left="403" w:hanging="317"/>
       </w:pPr>
@@ -11582,7 +12305,6 @@
     </w:p>
     <w:p>
       <w:pPr>
-        <w:keepNext/>
         <w:keepLines/>
         <w:ind w:left="403" w:hanging="317"/>
       </w:pPr>
@@ -11605,7 +12327,6 @@
     </w:p>
     <w:p>
       <w:pPr>
-        <w:keepNext/>
         <w:keepLines/>
         <w:ind w:left="403" w:hanging="317"/>
       </w:pPr>
@@ -11626,13 +12347,16 @@
     <w:p>
       <w:pPr>
         <w:pStyle w:val="Heading1"/>
-        <w:pageBreakBefore/>
+        <w:keepNext/>
       </w:pPr>
       <w:r>
         <w:t>Casos de teste de notificações</w:t>
       </w:r>
     </w:p>
     <w:p>
+      <w:pPr>
+        <w:keepNext/>
+      </w:pPr>
       <w:r>
         <w:t>Validação da central interna e dos avisos por prazo.</w:t>
       </w:r>
@@ -11692,7 +12416,7 @@
         <w:t xml:space="preserve">Pré-condições: </w:t>
       </w:r>
       <w:r>
-        <w:t>Usuário possui a notificação de homologação.</w:t>
+        <w:t>Usuário possui a notificação inicial da amostra.</w:t>
       </w:r>
     </w:p>
     <w:p>
@@ -11710,7 +12434,6 @@
     </w:p>
     <w:p>
       <w:pPr>
-        <w:keepNext/>
         <w:keepLines/>
         <w:ind w:left="403" w:hanging="317"/>
       </w:pPr>
@@ -11720,7 +12443,6 @@
     </w:p>
     <w:p>
       <w:pPr>
-        <w:keepNext/>
         <w:keepLines/>
         <w:ind w:left="403" w:hanging="317"/>
       </w:pPr>
@@ -11730,7 +12452,6 @@
     </w:p>
     <w:p>
       <w:pPr>
-        <w:keepNext/>
         <w:keepLines/>
         <w:ind w:left="403" w:hanging="317"/>
       </w:pPr>
@@ -11753,7 +12474,6 @@
     </w:p>
     <w:p>
       <w:pPr>
-        <w:keepNext/>
         <w:keepLines/>
         <w:ind w:left="403" w:hanging="317"/>
       </w:pPr>
@@ -11776,7 +12496,6 @@
         <w:pStyle w:val="Heading3"/>
         <w:keepNext/>
         <w:keepLines/>
-        <w:pageBreakBefore/>
       </w:pPr>
       <w:r>
         <w:t>CT-NOT-002  Emitir alertas do prazo ético</w:t>
@@ -11845,7 +12564,6 @@
     </w:p>
     <w:p>
       <w:pPr>
-        <w:keepNext/>
         <w:keepLines/>
         <w:ind w:left="403" w:hanging="317"/>
       </w:pPr>
@@ -11855,7 +12573,6 @@
     </w:p>
     <w:p>
       <w:pPr>
-        <w:keepNext/>
         <w:keepLines/>
         <w:ind w:left="403" w:hanging="317"/>
       </w:pPr>
@@ -11865,7 +12582,6 @@
     </w:p>
     <w:p>
       <w:pPr>
-        <w:keepNext/>
         <w:keepLines/>
         <w:ind w:left="403" w:hanging="317"/>
       </w:pPr>
@@ -11888,7 +12604,6 @@
     </w:p>
     <w:p>
       <w:pPr>
-        <w:keepNext/>
         <w:keepLines/>
         <w:ind w:left="403" w:hanging="317"/>
       </w:pPr>
@@ -11909,13 +12624,16 @@
     <w:p>
       <w:pPr>
         <w:pStyle w:val="Heading1"/>
-        <w:pageBreakBefore/>
+        <w:keepNext/>
       </w:pPr>
       <w:r>
         <w:t>Casos de teste de segurança e interface</w:t>
       </w:r>
     </w:p>
     <w:p>
+      <w:pPr>
+        <w:keepNext/>
+      </w:pPr>
       <w:r>
         <w:t>Cenários negativos e de controle de acesso.</w:t>
       </w:r>
@@ -11993,7 +12711,6 @@
     </w:p>
     <w:p>
       <w:pPr>
-        <w:keepNext/>
         <w:keepLines/>
         <w:ind w:left="403" w:hanging="317"/>
       </w:pPr>
@@ -12003,7 +12720,6 @@
     </w:p>
     <w:p>
       <w:pPr>
-        <w:keepNext/>
         <w:keepLines/>
         <w:ind w:left="403" w:hanging="317"/>
       </w:pPr>
@@ -12013,7 +12729,6 @@
     </w:p>
     <w:p>
       <w:pPr>
-        <w:keepNext/>
         <w:keepLines/>
         <w:ind w:left="403" w:hanging="317"/>
       </w:pPr>
@@ -12036,7 +12751,6 @@
     </w:p>
     <w:p>
       <w:pPr>
-        <w:keepNext/>
         <w:keepLines/>
         <w:ind w:left="403" w:hanging="317"/>
       </w:pPr>
@@ -12127,7 +12841,6 @@
     </w:p>
     <w:p>
       <w:pPr>
-        <w:keepNext/>
         <w:keepLines/>
         <w:ind w:left="403" w:hanging="317"/>
       </w:pPr>
@@ -12137,7 +12850,6 @@
     </w:p>
     <w:p>
       <w:pPr>
-        <w:keepNext/>
         <w:keepLines/>
         <w:ind w:left="403" w:hanging="317"/>
       </w:pPr>
@@ -12160,7 +12872,6 @@
     </w:p>
     <w:p>
       <w:pPr>
-        <w:keepNext/>
         <w:keepLines/>
         <w:ind w:left="403" w:hanging="317"/>
       </w:pPr>
@@ -12251,7 +12962,6 @@
     </w:p>
     <w:p>
       <w:pPr>
-        <w:keepNext/>
         <w:keepLines/>
         <w:ind w:left="403" w:hanging="317"/>
       </w:pPr>
@@ -12261,7 +12971,6 @@
     </w:p>
     <w:p>
       <w:pPr>
-        <w:keepNext/>
         <w:keepLines/>
         <w:ind w:left="403" w:hanging="317"/>
       </w:pPr>
@@ -12284,7 +12993,6 @@
     </w:p>
     <w:p>
       <w:pPr>
-        <w:keepNext/>
         <w:keepLines/>
         <w:ind w:left="403" w:hanging="317"/>
       </w:pPr>
@@ -12375,7 +13083,6 @@
     </w:p>
     <w:p>
       <w:pPr>
-        <w:keepNext/>
         <w:keepLines/>
         <w:ind w:left="403" w:hanging="317"/>
       </w:pPr>
@@ -12385,7 +13092,6 @@
     </w:p>
     <w:p>
       <w:pPr>
-        <w:keepNext/>
         <w:keepLines/>
         <w:ind w:left="403" w:hanging="317"/>
       </w:pPr>
@@ -12395,7 +13101,6 @@
     </w:p>
     <w:p>
       <w:pPr>
-        <w:keepNext/>
         <w:keepLines/>
         <w:ind w:left="403" w:hanging="317"/>
       </w:pPr>
@@ -12418,7 +13123,6 @@
     </w:p>
     <w:p>
       <w:pPr>
-        <w:keepNext/>
         <w:keepLines/>
         <w:ind w:left="403" w:hanging="317"/>
       </w:pPr>
@@ -12491,7 +13195,7 @@
         <w:t xml:space="preserve">Pré-condições: </w:t>
       </w:r>
       <w:r>
-        <w:t>Link de homologação disponível.</w:t>
+        <w:t>Link de amostra do Centro disponível.</w:t>
       </w:r>
     </w:p>
     <w:p>
@@ -12509,7 +13213,6 @@
     </w:p>
     <w:p>
       <w:pPr>
-        <w:keepNext/>
         <w:keepLines/>
         <w:ind w:left="403" w:hanging="317"/>
       </w:pPr>
@@ -12519,7 +13222,6 @@
     </w:p>
     <w:p>
       <w:pPr>
-        <w:keepNext/>
         <w:keepLines/>
         <w:ind w:left="403" w:hanging="317"/>
       </w:pPr>
@@ -12542,7 +13244,6 @@
     </w:p>
     <w:p>
       <w:pPr>
-        <w:keepNext/>
         <w:keepLines/>
         <w:ind w:left="403" w:hanging="317"/>
       </w:pPr>
@@ -12633,7 +13334,6 @@
     </w:p>
     <w:p>
       <w:pPr>
-        <w:keepNext/>
         <w:keepLines/>
         <w:ind w:left="403" w:hanging="317"/>
       </w:pPr>
@@ -12643,7 +13343,6 @@
     </w:p>
     <w:p>
       <w:pPr>
-        <w:keepNext/>
         <w:keepLines/>
         <w:ind w:left="403" w:hanging="317"/>
       </w:pPr>
@@ -12666,7 +13365,6 @@
     </w:p>
     <w:p>
       <w:pPr>
-        <w:keepNext/>
         <w:keepLines/>
         <w:ind w:left="403" w:hanging="317"/>
       </w:pPr>
@@ -12893,9 +13591,19 @@
     <w:p>
       <w:pPr>
         <w:pStyle w:val="Heading1"/>
-      </w:pPr>
-      <w:r>
-        <w:t>Verificação automatizada e regressão</w:t>
+        <w:keepNext/>
+        <w:pageBreakBefore/>
+      </w:pPr>
+      <w:r>
+        <w:t>Verificação automatizada e manutenção da amostra</w:t>
+      </w:r>
+    </w:p>
+    <w:p>
+      <w:pPr>
+        <w:keepNext/>
+      </w:pPr>
+      <w:r>
+        <w:t>Os comandos abaixo são destinados ao responsável técnico e devem ser executados no ambiente do Render ou em uma implantação equivalente. O modo aditivo preserva registros existentes; a limpeza remove somente os CPFs, projetos e editais identificados como demonstração.</w:t>
       </w:r>
     </w:p>
     <w:tbl>
@@ -12921,6 +13629,7 @@
       </w:tblGrid>
       <w:tr>
         <w:trPr>
+          <w:cantSplit w:val="true"/>
           <w:tblHeader w:val="true"/>
         </w:trPr>
         <w:tc>
@@ -12991,6 +13700,9 @@
         </w:tc>
       </w:tr>
       <w:tr>
+        <w:trPr>
+          <w:cantSplit w:val="true"/>
+        </w:trPr>
         <w:tc>
           <w:tcPr>
             <w:tcW w:type="dxa" w:w="2160"/>
@@ -13044,6 +13756,9 @@
         </w:tc>
       </w:tr>
       <w:tr>
+        <w:trPr>
+          <w:cantSplit w:val="true"/>
+        </w:trPr>
         <w:tc>
           <w:tcPr>
             <w:tcW w:type="dxa" w:w="2160"/>
@@ -13100,6 +13815,9 @@
         </w:tc>
       </w:tr>
       <w:tr>
+        <w:trPr>
+          <w:cantSplit w:val="true"/>
+        </w:trPr>
         <w:tc>
           <w:tcPr>
             <w:tcW w:type="dxa" w:w="2160"/>
@@ -13153,6 +13871,9 @@
         </w:tc>
       </w:tr>
       <w:tr>
+        <w:trPr>
+          <w:cantSplit w:val="true"/>
+        </w:trPr>
         <w:tc>
           <w:tcPr>
             <w:tcW w:type="dxa" w:w="2160"/>
@@ -13209,6 +13930,9 @@
         </w:tc>
       </w:tr>
       <w:tr>
+        <w:trPr>
+          <w:cantSplit w:val="true"/>
+        </w:trPr>
         <w:tc>
           <w:tcPr>
             <w:tcW w:type="dxa" w:w="2160"/>
@@ -13222,7 +13946,7 @@
           </w:tcPr>
           <w:p>
             <w:r>
-              <w:t>Restaurar base de homologação</w:t>
+              <w:t>Adicionar ou restaurar amostra</w:t>
             </w:r>
           </w:p>
         </w:tc>
@@ -13239,7 +13963,7 @@
           </w:tcPr>
           <w:p>
             <w:r>
-              <w:t>python manage.py povoar_demonstracao --confirmar</w:t>
+              <w:t>python manage.py povoar_demonstracao --adicionar</w:t>
             </w:r>
           </w:p>
         </w:tc>
@@ -13256,7 +13980,66 @@
           </w:tcPr>
           <w:p>
             <w:r>
-              <w:t>9 usuários, 9 projetos, 8 centros e 49 cursos.</w:t>
+              <w:t>9 usuários e 9 projetos de amostra, sem excluir outros dados.</w:t>
+            </w:r>
+          </w:p>
+        </w:tc>
+      </w:tr>
+      <w:tr>
+        <w:trPr>
+          <w:cantSplit w:val="true"/>
+        </w:trPr>
+        <w:tc>
+          <w:tcPr>
+            <w:tcW w:type="dxa" w:w="2160"/>
+            <w:tcMar>
+              <w:top w:w="100" w:type="dxa"/>
+              <w:start w:w="120" w:type="dxa"/>
+              <w:bottom w:w="100" w:type="dxa"/>
+              <w:end w:w="120" w:type="dxa"/>
+            </w:tcMar>
+            <w:vAlign w:val="center"/>
+            <w:shd w:fill="EAF2F8"/>
+          </w:tcPr>
+          <w:p>
+            <w:r>
+              <w:t>Remover amostra temporária</w:t>
+            </w:r>
+          </w:p>
+        </w:tc>
+        <w:tc>
+          <w:tcPr>
+            <w:tcW w:type="dxa" w:w="4608"/>
+            <w:tcMar>
+              <w:top w:w="100" w:type="dxa"/>
+              <w:start w:w="120" w:type="dxa"/>
+              <w:bottom w:w="100" w:type="dxa"/>
+              <w:end w:w="120" w:type="dxa"/>
+            </w:tcMar>
+            <w:vAlign w:val="center"/>
+            <w:shd w:fill="EAF2F8"/>
+          </w:tcPr>
+          <w:p>
+            <w:r>
+              <w:t>python manage.py limpar_demonstracao --confirmar</w:t>
+            </w:r>
+          </w:p>
+        </w:tc>
+        <w:tc>
+          <w:tcPr>
+            <w:tcW w:type="dxa" w:w="3024"/>
+            <w:tcMar>
+              <w:top w:w="100" w:type="dxa"/>
+              <w:start w:w="120" w:type="dxa"/>
+              <w:bottom w:w="100" w:type="dxa"/>
+              <w:end w:w="120" w:type="dxa"/>
+            </w:tcMar>
+            <w:vAlign w:val="center"/>
+            <w:shd w:fill="EAF2F8"/>
+          </w:tcPr>
+          <w:p>
+            <w:r>
+              <w:t>Somente usuários, projetos e editais DEMO são removidos.</w:t>
             </w:r>
           </w:p>
         </w:tc>
@@ -13301,6 +14084,7 @@
       </w:tblGrid>
       <w:tr>
         <w:trPr>
+          <w:cantSplit w:val="true"/>
           <w:tblHeader w:val="true"/>
         </w:trPr>
         <w:tc>
@@ -13415,6 +14199,9 @@
         </w:tc>
       </w:tr>
       <w:tr>
+        <w:trPr>
+          <w:cantSplit w:val="true"/>
+        </w:trPr>
         <w:tc>
           <w:tcPr>
             <w:tcW w:type="dxa" w:w="1440"/>
@@ -13492,6 +14279,9 @@
         </w:tc>
       </w:tr>
       <w:tr>
+        <w:trPr>
+          <w:cantSplit w:val="true"/>
+        </w:trPr>
         <w:tc>
           <w:tcPr>
             <w:tcW w:type="dxa" w:w="1440"/>
@@ -13574,6 +14364,9 @@
         </w:tc>
       </w:tr>
       <w:tr>
+        <w:trPr>
+          <w:cantSplit w:val="true"/>
+        </w:trPr>
         <w:tc>
           <w:tcPr>
             <w:tcW w:type="dxa" w:w="1440"/>
@@ -13651,6 +14444,9 @@
         </w:tc>
       </w:tr>
       <w:tr>
+        <w:trPr>
+          <w:cantSplit w:val="true"/>
+        </w:trPr>
         <w:tc>
           <w:tcPr>
             <w:tcW w:type="dxa" w:w="1440"/>
@@ -13733,6 +14529,9 @@
         </w:tc>
       </w:tr>
       <w:tr>
+        <w:trPr>
+          <w:cantSplit w:val="true"/>
+        </w:trPr>
         <w:tc>
           <w:tcPr>
             <w:tcW w:type="dxa" w:w="1440"/>
@@ -13810,6 +14609,9 @@
         </w:tc>
       </w:tr>
       <w:tr>
+        <w:trPr>
+          <w:cantSplit w:val="true"/>
+        </w:trPr>
         <w:tc>
           <w:tcPr>
             <w:tcW w:type="dxa" w:w="1440"/>
@@ -13892,6 +14694,9 @@
         </w:tc>
       </w:tr>
       <w:tr>
+        <w:trPr>
+          <w:cantSplit w:val="true"/>
+        </w:trPr>
         <w:tc>
           <w:tcPr>
             <w:tcW w:type="dxa" w:w="1440"/>
@@ -13969,6 +14774,9 @@
         </w:tc>
       </w:tr>
       <w:tr>
+        <w:trPr>
+          <w:cantSplit w:val="true"/>
+        </w:trPr>
         <w:tc>
           <w:tcPr>
             <w:tcW w:type="dxa" w:w="1440"/>
@@ -14051,6 +14859,9 @@
         </w:tc>
       </w:tr>
       <w:tr>
+        <w:trPr>
+          <w:cantSplit w:val="true"/>
+        </w:trPr>
         <w:tc>
           <w:tcPr>
             <w:tcW w:type="dxa" w:w="1440"/>
@@ -14128,6 +14939,9 @@
         </w:tc>
       </w:tr>
       <w:tr>
+        <w:trPr>
+          <w:cantSplit w:val="true"/>
+        </w:trPr>
         <w:tc>
           <w:tcPr>
             <w:tcW w:type="dxa" w:w="1440"/>
@@ -14210,6 +15024,9 @@
         </w:tc>
       </w:tr>
       <w:tr>
+        <w:trPr>
+          <w:cantSplit w:val="true"/>
+        </w:trPr>
         <w:tc>
           <w:tcPr>
             <w:tcW w:type="dxa" w:w="1440"/>
@@ -14287,6 +15104,9 @@
         </w:tc>
       </w:tr>
       <w:tr>
+        <w:trPr>
+          <w:cantSplit w:val="true"/>
+        </w:trPr>
         <w:tc>
           <w:tcPr>
             <w:tcW w:type="dxa" w:w="1440"/>
@@ -14375,12 +15195,12 @@
         <w:pStyle w:val="Heading1"/>
       </w:pPr>
       <w:r>
-        <w:t>Critério de encerramento da homologação</w:t>
-      </w:r>
-    </w:p>
-    <w:p>
-      <w:r>
-        <w:t>A homologação pode ser encerrada quando todos os casos de prioridade alta estiverem aprovados, não houver falhas de controle de acesso ou perda de dados e as divergências restantes estiverem registradas com responsável e decisão de correção. Os três fluxos de projeto e o fluxo ético devem ser executados integralmente ao menos uma vez.</w:t>
+        <w:t>Critério de encerramento da validação</w:t>
+      </w:r>
+    </w:p>
+    <w:p>
+      <w:r>
+        <w:t>A validação pode ser encerrada quando todos os casos de prioridade alta estiverem aprovados, não houver falhas de controle de acesso ou perda de dados e as divergências restantes estiverem registradas com responsável e decisão de correção. Os três fluxos de projeto e o fluxo ético devem ser executados integralmente ao menos uma vez.</w:t>
       </w:r>
     </w:p>
     <w:sectPr>
@@ -15129,9 +15949,6 @@
     <w:qFormat/>
     <w:rsid w:val="00FC693F"/>
     <w:pPr>
-      <w:pBdr>
-        <w:bottom w:val="single" w:sz="8" w:space="4" w:color="4F81BD" w:themeColor="accent1"/>
-      </w:pBdr>
       <w:spacing w:after="300" w:line="240" w:lineRule="auto"/>
       <w:contextualSpacing/>
     </w:pPr>

</xml_diff>

<commit_message>
Atualiza plano de testes do fluxo do Centro
</commit_message>
<xml_diff>
--- a/plataforma_projetos/output/Plano_de_Testes_Plataforma_PROPEG.docx
+++ b/plataforma_projetos/output/Plano_de_Testes_Plataforma_PROPEG.docx
@@ -166,7 +166,7 @@
           </w:tcPr>
           <w:p>
             <w:r>
-              <w:t>2.0</w:t>
+              <w:t>2.1</w:t>
             </w:r>
           </w:p>
         </w:tc>
@@ -2854,7 +2854,7 @@
           </w:tcPr>
           <w:p>
             <w:r>
-              <w:t>Uso único; expira 30 dias após o último povoamento da amostra</w:t>
+              <w:t>Uso único; expira em 7 dias (168 horas) após a emissão</w:t>
             </w:r>
           </w:p>
         </w:tc>
@@ -3036,6 +3036,46 @@
           </w:tcPr>
           <w:p>
             <w:r>
+              <w:t>Centro fictício local</w:t>
+            </w:r>
+          </w:p>
+        </w:tc>
+        <w:tc>
+          <w:tcPr>
+            <w:tcW w:type="dxa" w:w="6696"/>
+            <w:tcMar>
+              <w:top w:w="100" w:type="dxa"/>
+              <w:start w:w="120" w:type="dxa"/>
+              <w:bottom w:w="100" w:type="dxa"/>
+              <w:end w:w="120" w:type="dxa"/>
+            </w:tcMar>
+            <w:vAlign w:val="center"/>
+          </w:tcPr>
+          <w:p>
+            <w:r>
+              <w:t>TESTE LUNAR 20260916 - CENTRO DE ESTUDOS FICTÍCIO (SOMENTE TESTE LOCAL - NÃO USAR EM PRODUÇÃO); e-mail d.moura250304@gmail.com</w:t>
+            </w:r>
+          </w:p>
+        </w:tc>
+      </w:tr>
+      <w:tr>
+        <w:trPr>
+          <w:cantSplit w:val="true"/>
+        </w:trPr>
+        <w:tc>
+          <w:tcPr>
+            <w:tcW w:type="dxa" w:w="3096"/>
+            <w:tcMar>
+              <w:top w:w="100" w:type="dxa"/>
+              <w:start w:w="120" w:type="dxa"/>
+              <w:bottom w:w="100" w:type="dxa"/>
+              <w:end w:w="120" w:type="dxa"/>
+            </w:tcMar>
+            <w:vAlign w:val="center"/>
+            <w:shd w:fill="EAF2F8"/>
+          </w:tcPr>
+          <w:p>
+            <w:r>
               <w:t>CPF válido para membro manual</w:t>
             </w:r>
           </w:p>
@@ -3050,6 +3090,7 @@
               <w:end w:w="120" w:type="dxa"/>
             </w:tcMar>
             <w:vAlign w:val="center"/>
+            <w:shd w:fill="EAF2F8"/>
           </w:tcPr>
           <w:p>
             <w:r>
@@ -3072,7 +3113,6 @@
               <w:end w:w="120" w:type="dxa"/>
             </w:tcMar>
             <w:vAlign w:val="center"/>
-            <w:shd w:fill="EAF2F8"/>
           </w:tcPr>
           <w:p>
             <w:r>
@@ -3090,7 +3130,6 @@
               <w:end w:w="120" w:type="dxa"/>
             </w:tcMar>
             <w:vAlign w:val="center"/>
-            <w:shd w:fill="EAF2F8"/>
           </w:tcPr>
           <w:p>
             <w:r>
@@ -3113,6 +3152,7 @@
               <w:end w:w="120" w:type="dxa"/>
             </w:tcMar>
             <w:vAlign w:val="center"/>
+            <w:shd w:fill="EAF2F8"/>
           </w:tcPr>
           <w:p>
             <w:r>
@@ -3130,6 +3170,7 @@
               <w:end w:w="120" w:type="dxa"/>
             </w:tcMar>
             <w:vAlign w:val="center"/>
+            <w:shd w:fill="EAF2F8"/>
           </w:tcPr>
           <w:p>
             <w:r>
@@ -3152,7 +3193,6 @@
               <w:end w:w="120" w:type="dxa"/>
             </w:tcMar>
             <w:vAlign w:val="center"/>
-            <w:shd w:fill="EAF2F8"/>
           </w:tcPr>
           <w:p>
             <w:r>
@@ -3170,7 +3210,6 @@
               <w:end w:w="120" w:type="dxa"/>
             </w:tcMar>
             <w:vAlign w:val="center"/>
-            <w:shd w:fill="EAF2F8"/>
           </w:tcPr>
           <w:p>
             <w:r>
@@ -8516,7 +8555,7 @@
         <w:t xml:space="preserve">Pré-condições: </w:t>
       </w:r>
       <w:r>
-        <w:t>Usar o link de amostra do Centro antes de consumi-lo.</w:t>
+        <w:t>Usar um projeto temporário local ou outro token criado para o teste. Não consumir o link público de demonstração em verificações comuns.</w:t>
       </w:r>
     </w:p>
     <w:p>
@@ -8915,6 +8954,15 @@
     </w:p>
     <w:p>
       <w:pPr>
+        <w:keepLines/>
+        <w:ind w:left="403" w:hanging="317"/>
+      </w:pPr>
+      <w:r>
+        <w:t>3.  Abrir os detalhes do projeto com o coordenador ou gestor e consultar a ata em Anexos.</w:t>
+      </w:r>
+    </w:p>
+    <w:p>
+      <w:pPr>
         <w:keepNext/>
         <w:keepLines/>
         <w:spacing w:after="40"/>
@@ -8932,7 +8980,7 @@
         <w:ind w:left="403" w:hanging="317"/>
       </w:pPr>
       <w:r>
-        <w:t>•  A ata fica vinculada ao projeto.</w:t>
+        <w:t>•  A ata fica vinculada ao projeto e pode ser aberta em Anexos.</w:t>
       </w:r>
     </w:p>
     <w:p>
@@ -8941,7 +8989,16 @@
         <w:ind w:left="403" w:hanging="317"/>
       </w:pPr>
       <w:r>
-        <w:t>•  O projeto passa ao fluxo da gestão e o token é marcado como utilizado.</w:t>
+        <w:t>•  O projeto muda de Aguardando aprovação do Centro para Submetido, segue à gestão e o token é marcado como utilizado.</w:t>
+      </w:r>
+    </w:p>
+    <w:p>
+      <w:pPr>
+        <w:keepLines/>
+        <w:ind w:left="403" w:hanging="317"/>
+      </w:pPr>
+      <w:r>
+        <w:t>•  O coordenador recebe a notificação prevista.</w:t>
       </w:r>
     </w:p>
     <w:p/>
@@ -9063,6 +9120,145 @@
       </w:pPr>
       <w:r>
         <w:t>•  A página informa que o link foi utilizado, expirou ou foi invalidado.</w:t>
+      </w:r>
+    </w:p>
+    <w:p/>
+    <w:p>
+      <w:pPr>
+        <w:pStyle w:val="Heading3"/>
+        <w:keepNext/>
+        <w:keepLines/>
+      </w:pPr>
+      <w:r>
+        <w:t>CT-CEN-006  Enviar ata quando o navegador informa origem opaca</w:t>
+      </w:r>
+    </w:p>
+    <w:p>
+      <w:pPr>
+        <w:keepNext/>
+        <w:keepLines/>
+        <w:spacing w:after="80"/>
+      </w:pPr>
+      <w:r>
+        <w:rPr>
+          <w:b/>
+        </w:rPr>
+        <w:t xml:space="preserve">Perfil: </w:t>
+      </w:r>
+      <w:r>
+        <w:t>Responsável do Centro</w:t>
+      </w:r>
+    </w:p>
+    <w:p>
+      <w:pPr>
+        <w:keepNext/>
+        <w:keepLines/>
+        <w:spacing w:after="80"/>
+      </w:pPr>
+      <w:r>
+        <w:rPr>
+          <w:b/>
+        </w:rPr>
+        <w:t xml:space="preserve">Prioridade: </w:t>
+      </w:r>
+      <w:r>
+        <w:t>Alta</w:t>
+      </w:r>
+    </w:p>
+    <w:p>
+      <w:pPr>
+        <w:keepNext/>
+        <w:keepLines/>
+        <w:spacing w:after="80"/>
+      </w:pPr>
+      <w:r>
+        <w:rPr>
+          <w:b/>
+        </w:rPr>
+        <w:t xml:space="preserve">Pré-condições: </w:t>
+      </w:r>
+      <w:r>
+        <w:t>Token local válido e cliente configurado para enviar o cabeçalho HTTP Origin: null, sem Referer.</w:t>
+      </w:r>
+    </w:p>
+    <w:p>
+      <w:pPr>
+        <w:keepNext/>
+        <w:keepLines/>
+        <w:spacing w:after="40"/>
+      </w:pPr>
+      <w:r>
+        <w:rPr>
+          <w:b/>
+        </w:rPr>
+        <w:t>Passos</w:t>
+      </w:r>
+    </w:p>
+    <w:p>
+      <w:pPr>
+        <w:keepLines/>
+        <w:ind w:left="403" w:hanging="317"/>
+      </w:pPr>
+      <w:r>
+        <w:t>1.  Abrir o link público sem autenticação.</w:t>
+      </w:r>
+    </w:p>
+    <w:p>
+      <w:pPr>
+        <w:keepLines/>
+        <w:ind w:left="403" w:hanging="317"/>
+      </w:pPr>
+      <w:r>
+        <w:t>2.  Preencher nome, cargo e confirmação, anexar uma ata válida e enviar com Origin: null.</w:t>
+      </w:r>
+    </w:p>
+    <w:p>
+      <w:pPr>
+        <w:keepLines/>
+        <w:ind w:left="403" w:hanging="317"/>
+      </w:pPr>
+      <w:r>
+        <w:t>3.  Reabrir o mesmo link e consultar o projeto no perfil autorizado.</w:t>
+      </w:r>
+    </w:p>
+    <w:p>
+      <w:pPr>
+        <w:keepNext/>
+        <w:keepLines/>
+        <w:spacing w:after="40"/>
+      </w:pPr>
+      <w:r>
+        <w:rPr>
+          <w:b/>
+        </w:rPr>
+        <w:t>Resultado esperado</w:t>
+      </w:r>
+    </w:p>
+    <w:p>
+      <w:pPr>
+        <w:keepLines/>
+        <w:ind w:left="403" w:hanging="317"/>
+      </w:pPr>
+      <w:r>
+        <w:t>•  O envio não é recusado pela verificação CSRF.</w:t>
+      </w:r>
+    </w:p>
+    <w:p>
+      <w:pPr>
+        <w:keepLines/>
+        <w:ind w:left="403" w:hanging="317"/>
+      </w:pPr>
+      <w:r>
+        <w:t>•  A ata é salva, o token é consumido uma única vez e o projeto passa para Submetido.</w:t>
+      </w:r>
+    </w:p>
+    <w:p>
+      <w:pPr>
+        <w:keepLines/>
+        <w:ind w:left="403" w:hanging="317"/>
+      </w:pPr>
+      <w:r>
+        <w:t>•  O segundo acesso informa que o link está indisponível.</w:t>
       </w:r>
     </w:p>
     <w:p/>
@@ -15193,6 +15389,1451 @@
     <w:p>
       <w:pPr>
         <w:pStyle w:val="Heading1"/>
+        <w:pageBreakBefore/>
+      </w:pPr>
+      <w:r>
+        <w:t>Atualização da execução de 16 de setembro de 2026</w:t>
+      </w:r>
+    </w:p>
+    <w:p>
+      <w:r>
+        <w:t>Esta seção consolida a validação específica do fluxo de aprovação pelo Centro de Estudos, a correção aplicada durante a execução e os limites da confirmação em produção. Os resultados não autorizam declarar a plataforma livre de bugs; eles descrevem a cobertura efetivamente executada.</w:t>
+      </w:r>
+    </w:p>
+    <w:p>
+      <w:pPr>
+        <w:pStyle w:val="Heading2"/>
+      </w:pPr>
+      <w:r>
+        <w:t>Resultado do fluxo do Centro de Estudos</w:t>
+      </w:r>
+    </w:p>
+    <w:tbl>
+      <w:tblPr>
+        <w:tblStyle w:val="TableGrid"/>
+        <w:tblW w:type="auto" w:w="0"/>
+        <w:jc w:val="center"/>
+        <w:tblLayout w:type="fixed"/>
+        <w:tblLook w:firstColumn="1" w:firstRow="1" w:lastColumn="0" w:lastRow="0" w:noHBand="0" w:noVBand="1" w:val="04A0"/>
+        <w:tblBorders>
+          <w:top w:val="single" w:sz="6" w:color="D9D9D9"/>
+          <w:left w:val="single" w:sz="6" w:color="D9D9D9"/>
+          <w:bottom w:val="single" w:sz="6" w:color="D9D9D9"/>
+          <w:right w:val="single" w:sz="6" w:color="D9D9D9"/>
+          <w:insideH w:val="single" w:sz="6" w:color="D9D9D9"/>
+          <w:insideV w:val="single" w:sz="6" w:color="D9D9D9"/>
+        </w:tblBorders>
+      </w:tblPr>
+      <w:tblGrid>
+        <w:gridCol w:w="3360"/>
+        <w:gridCol w:w="3360"/>
+        <w:gridCol w:w="3360"/>
+      </w:tblGrid>
+      <w:tr>
+        <w:trPr>
+          <w:cantSplit w:val="true"/>
+          <w:tblHeader w:val="true"/>
+        </w:trPr>
+        <w:tc>
+          <w:tcPr>
+            <w:tcW w:type="dxa" w:w="2880"/>
+            <w:tcMar>
+              <w:top w:w="100" w:type="dxa"/>
+              <w:start w:w="120" w:type="dxa"/>
+              <w:bottom w:w="100" w:type="dxa"/>
+              <w:end w:w="120" w:type="dxa"/>
+            </w:tcMar>
+            <w:vAlign w:val="center"/>
+            <w:shd w:fill="0B3D6E"/>
+          </w:tcPr>
+          <w:p>
+            <w:r>
+              <w:rPr>
+                <w:b/>
+                <w:color w:val="FFFFFF"/>
+              </w:rPr>
+              <w:t>Verificação</w:t>
+            </w:r>
+          </w:p>
+        </w:tc>
+        <w:tc>
+          <w:tcPr>
+            <w:tcW w:type="dxa" w:w="1512"/>
+            <w:tcMar>
+              <w:top w:w="100" w:type="dxa"/>
+              <w:start w:w="120" w:type="dxa"/>
+              <w:bottom w:w="100" w:type="dxa"/>
+              <w:end w:w="120" w:type="dxa"/>
+            </w:tcMar>
+            <w:vAlign w:val="center"/>
+            <w:shd w:fill="0B3D6E"/>
+          </w:tcPr>
+          <w:p>
+            <w:r>
+              <w:rPr>
+                <w:b/>
+                <w:color w:val="FFFFFF"/>
+              </w:rPr>
+              <w:t>Resultado</w:t>
+            </w:r>
+          </w:p>
+        </w:tc>
+        <w:tc>
+          <w:tcPr>
+            <w:tcW w:type="dxa" w:w="5400"/>
+            <w:tcMar>
+              <w:top w:w="100" w:type="dxa"/>
+              <w:start w:w="120" w:type="dxa"/>
+              <w:bottom w:w="100" w:type="dxa"/>
+              <w:end w:w="120" w:type="dxa"/>
+            </w:tcMar>
+            <w:vAlign w:val="center"/>
+            <w:shd w:fill="0B3D6E"/>
+          </w:tcPr>
+          <w:p>
+            <w:r>
+              <w:rPr>
+                <w:b/>
+                <w:color w:val="FFFFFF"/>
+              </w:rPr>
+              <w:t>Evidência</w:t>
+            </w:r>
+          </w:p>
+        </w:tc>
+      </w:tr>
+      <w:tr>
+        <w:trPr>
+          <w:cantSplit w:val="true"/>
+        </w:trPr>
+        <w:tc>
+          <w:tcPr>
+            <w:tcW w:type="dxa" w:w="2880"/>
+            <w:tcMar>
+              <w:top w:w="100" w:type="dxa"/>
+              <w:start w:w="120" w:type="dxa"/>
+              <w:bottom w:w="100" w:type="dxa"/>
+              <w:end w:w="120" w:type="dxa"/>
+            </w:tcMar>
+            <w:vAlign w:val="center"/>
+          </w:tcPr>
+          <w:p>
+            <w:r>
+              <w:t>Envio local com token válido</w:t>
+            </w:r>
+          </w:p>
+        </w:tc>
+        <w:tc>
+          <w:tcPr>
+            <w:tcW w:type="dxa" w:w="1512"/>
+            <w:tcMar>
+              <w:top w:w="100" w:type="dxa"/>
+              <w:start w:w="120" w:type="dxa"/>
+              <w:bottom w:w="100" w:type="dxa"/>
+              <w:end w:w="120" w:type="dxa"/>
+            </w:tcMar>
+            <w:vAlign w:val="center"/>
+          </w:tcPr>
+          <w:p>
+            <w:r>
+              <w:t>Corrigido</w:t>
+            </w:r>
+          </w:p>
+        </w:tc>
+        <w:tc>
+          <w:tcPr>
+            <w:tcW w:type="dxa" w:w="5400"/>
+            <w:tcMar>
+              <w:top w:w="100" w:type="dxa"/>
+              <w:start w:w="120" w:type="dxa"/>
+              <w:bottom w:w="100" w:type="dxa"/>
+              <w:end w:w="120" w:type="dxa"/>
+            </w:tcMar>
+            <w:vAlign w:val="center"/>
+          </w:tcPr>
+          <w:p>
+            <w:r>
+              <w:t>Ata salva; solicitação marcada como utilizada; projeto 106 passou de Aguardando aprovação do Centro para Submetido.</w:t>
+            </w:r>
+          </w:p>
+        </w:tc>
+      </w:tr>
+      <w:tr>
+        <w:trPr>
+          <w:cantSplit w:val="true"/>
+        </w:trPr>
+        <w:tc>
+          <w:tcPr>
+            <w:tcW w:type="dxa" w:w="2880"/>
+            <w:tcMar>
+              <w:top w:w="100" w:type="dxa"/>
+              <w:start w:w="120" w:type="dxa"/>
+              <w:bottom w:w="100" w:type="dxa"/>
+              <w:end w:w="120" w:type="dxa"/>
+            </w:tcMar>
+            <w:vAlign w:val="center"/>
+            <w:shd w:fill="EAF2F8"/>
+          </w:tcPr>
+          <w:p>
+            <w:r>
+              <w:t>Consulta posterior da ata</w:t>
+            </w:r>
+          </w:p>
+        </w:tc>
+        <w:tc>
+          <w:tcPr>
+            <w:tcW w:type="dxa" w:w="1512"/>
+            <w:tcMar>
+              <w:top w:w="100" w:type="dxa"/>
+              <w:start w:w="120" w:type="dxa"/>
+              <w:bottom w:w="100" w:type="dxa"/>
+              <w:end w:w="120" w:type="dxa"/>
+            </w:tcMar>
+            <w:vAlign w:val="center"/>
+            <w:shd w:fill="EAF2F8"/>
+          </w:tcPr>
+          <w:p>
+            <w:r>
+              <w:t>Passou</w:t>
+            </w:r>
+          </w:p>
+        </w:tc>
+        <w:tc>
+          <w:tcPr>
+            <w:tcW w:type="dxa" w:w="5400"/>
+            <w:tcMar>
+              <w:top w:w="100" w:type="dxa"/>
+              <w:start w:w="120" w:type="dxa"/>
+              <w:bottom w:w="100" w:type="dxa"/>
+              <w:end w:w="120" w:type="dxa"/>
+            </w:tcMar>
+            <w:vAlign w:val="center"/>
+            <w:shd w:fill="EAF2F8"/>
+          </w:tcPr>
+          <w:p>
+            <w:r>
+              <w:t>A ata apareceu em Anexos nos detalhes do projeto e o PDF pôde ser aberto pelo perfil autorizado.</w:t>
+            </w:r>
+          </w:p>
+        </w:tc>
+      </w:tr>
+      <w:tr>
+        <w:trPr>
+          <w:cantSplit w:val="true"/>
+        </w:trPr>
+        <w:tc>
+          <w:tcPr>
+            <w:tcW w:type="dxa" w:w="2880"/>
+            <w:tcMar>
+              <w:top w:w="100" w:type="dxa"/>
+              <w:start w:w="120" w:type="dxa"/>
+              <w:bottom w:w="100" w:type="dxa"/>
+              <w:end w:w="120" w:type="dxa"/>
+            </w:tcMar>
+            <w:vAlign w:val="center"/>
+          </w:tcPr>
+          <w:p>
+            <w:r>
+              <w:t>Reutilização do token local</w:t>
+            </w:r>
+          </w:p>
+        </w:tc>
+        <w:tc>
+          <w:tcPr>
+            <w:tcW w:type="dxa" w:w="1512"/>
+            <w:tcMar>
+              <w:top w:w="100" w:type="dxa"/>
+              <w:start w:w="120" w:type="dxa"/>
+              <w:bottom w:w="100" w:type="dxa"/>
+              <w:end w:w="120" w:type="dxa"/>
+            </w:tcMar>
+            <w:vAlign w:val="center"/>
+          </w:tcPr>
+          <w:p>
+            <w:r>
+              <w:t>Passou</w:t>
+            </w:r>
+          </w:p>
+        </w:tc>
+        <w:tc>
+          <w:tcPr>
+            <w:tcW w:type="dxa" w:w="5400"/>
+            <w:tcMar>
+              <w:top w:w="100" w:type="dxa"/>
+              <w:start w:w="120" w:type="dxa"/>
+              <w:bottom w:w="100" w:type="dxa"/>
+              <w:end w:w="120" w:type="dxa"/>
+            </w:tcMar>
+            <w:vAlign w:val="center"/>
+          </w:tcPr>
+          <w:p>
+            <w:r>
+              <w:t>O token consumido deixou de permitir novo envio.</w:t>
+            </w:r>
+          </w:p>
+        </w:tc>
+      </w:tr>
+      <w:tr>
+        <w:trPr>
+          <w:cantSplit w:val="true"/>
+        </w:trPr>
+        <w:tc>
+          <w:tcPr>
+            <w:tcW w:type="dxa" w:w="2880"/>
+            <w:tcMar>
+              <w:top w:w="100" w:type="dxa"/>
+              <w:start w:w="120" w:type="dxa"/>
+              <w:bottom w:w="100" w:type="dxa"/>
+              <w:end w:w="120" w:type="dxa"/>
+            </w:tcMar>
+            <w:vAlign w:val="center"/>
+            <w:shd w:fill="EAF2F8"/>
+          </w:tcPr>
+          <w:p>
+            <w:r>
+              <w:t>Produção com Origin: null e token inválido</w:t>
+            </w:r>
+          </w:p>
+        </w:tc>
+        <w:tc>
+          <w:tcPr>
+            <w:tcW w:type="dxa" w:w="1512"/>
+            <w:tcMar>
+              <w:top w:w="100" w:type="dxa"/>
+              <w:start w:w="120" w:type="dxa"/>
+              <w:bottom w:w="100" w:type="dxa"/>
+              <w:end w:w="120" w:type="dxa"/>
+            </w:tcMar>
+            <w:vAlign w:val="center"/>
+            <w:shd w:fill="EAF2F8"/>
+          </w:tcPr>
+          <w:p>
+            <w:r>
+              <w:t>Passou</w:t>
+            </w:r>
+          </w:p>
+        </w:tc>
+        <w:tc>
+          <w:tcPr>
+            <w:tcW w:type="dxa" w:w="5400"/>
+            <w:tcMar>
+              <w:top w:w="100" w:type="dxa"/>
+              <w:start w:w="120" w:type="dxa"/>
+              <w:bottom w:w="100" w:type="dxa"/>
+              <w:end w:w="120" w:type="dxa"/>
+            </w:tcMar>
+            <w:vAlign w:val="center"/>
+            <w:shd w:fill="EAF2F8"/>
+          </w:tcPr>
+          <w:p>
+            <w:r>
+              <w:t>A requisição alcançou a regra do link e retornou 410 Link indisponível, em vez de 403 CSRF.</w:t>
+            </w:r>
+          </w:p>
+        </w:tc>
+      </w:tr>
+      <w:tr>
+        <w:trPr>
+          <w:cantSplit w:val="true"/>
+        </w:trPr>
+        <w:tc>
+          <w:tcPr>
+            <w:tcW w:type="dxa" w:w="2880"/>
+            <w:tcMar>
+              <w:top w:w="100" w:type="dxa"/>
+              <w:start w:w="120" w:type="dxa"/>
+              <w:bottom w:w="100" w:type="dxa"/>
+              <w:end w:w="120" w:type="dxa"/>
+            </w:tcMar>
+            <w:vAlign w:val="center"/>
+          </w:tcPr>
+          <w:p>
+            <w:r>
+              <w:t>Produção com token válido e ata real</w:t>
+            </w:r>
+          </w:p>
+        </w:tc>
+        <w:tc>
+          <w:tcPr>
+            <w:tcW w:type="dxa" w:w="1512"/>
+            <w:tcMar>
+              <w:top w:w="100" w:type="dxa"/>
+              <w:start w:w="120" w:type="dxa"/>
+              <w:bottom w:w="100" w:type="dxa"/>
+              <w:end w:w="120" w:type="dxa"/>
+            </w:tcMar>
+            <w:vAlign w:val="center"/>
+          </w:tcPr>
+          <w:p>
+            <w:r>
+              <w:t>Bloqueado</w:t>
+            </w:r>
+          </w:p>
+        </w:tc>
+        <w:tc>
+          <w:tcPr>
+            <w:tcW w:type="dxa" w:w="5400"/>
+            <w:tcMar>
+              <w:top w:w="100" w:type="dxa"/>
+              <w:start w:w="120" w:type="dxa"/>
+              <w:bottom w:w="100" w:type="dxa"/>
+              <w:end w:w="120" w:type="dxa"/>
+            </w:tcMar>
+            <w:vAlign w:val="center"/>
+          </w:tcPr>
+          <w:p>
+            <w:r>
+              <w:t>Não executado para preservar o link de demonstração de uso único e evitar alteração de dados de produção.</w:t>
+            </w:r>
+          </w:p>
+        </w:tc>
+      </w:tr>
+      <w:tr>
+        <w:trPr>
+          <w:cantSplit w:val="true"/>
+        </w:trPr>
+        <w:tc>
+          <w:tcPr>
+            <w:tcW w:type="dxa" w:w="2880"/>
+            <w:tcMar>
+              <w:top w:w="100" w:type="dxa"/>
+              <w:start w:w="120" w:type="dxa"/>
+              <w:bottom w:w="100" w:type="dxa"/>
+              <w:end w:w="120" w:type="dxa"/>
+            </w:tcMar>
+            <w:vAlign w:val="center"/>
+            <w:shd w:fill="EAF2F8"/>
+          </w:tcPr>
+          <w:p>
+            <w:r>
+              <w:t>Suíte automatizada completa</w:t>
+            </w:r>
+          </w:p>
+        </w:tc>
+        <w:tc>
+          <w:tcPr>
+            <w:tcW w:type="dxa" w:w="1512"/>
+            <w:tcMar>
+              <w:top w:w="100" w:type="dxa"/>
+              <w:start w:w="120" w:type="dxa"/>
+              <w:bottom w:w="100" w:type="dxa"/>
+              <w:end w:w="120" w:type="dxa"/>
+            </w:tcMar>
+            <w:vAlign w:val="center"/>
+            <w:shd w:fill="EAF2F8"/>
+          </w:tcPr>
+          <w:p>
+            <w:r>
+              <w:t>Passou</w:t>
+            </w:r>
+          </w:p>
+        </w:tc>
+        <w:tc>
+          <w:tcPr>
+            <w:tcW w:type="dxa" w:w="5400"/>
+            <w:tcMar>
+              <w:top w:w="100" w:type="dxa"/>
+              <w:start w:w="120" w:type="dxa"/>
+              <w:bottom w:w="100" w:type="dxa"/>
+              <w:end w:w="120" w:type="dxa"/>
+            </w:tcMar>
+            <w:vAlign w:val="center"/>
+            <w:shd w:fill="EAF2F8"/>
+          </w:tcPr>
+          <w:p>
+            <w:r>
+              <w:t>49 testes concluídos com sucesso; check sem problemas; nenhuma migration pendente.</w:t>
+            </w:r>
+          </w:p>
+        </w:tc>
+      </w:tr>
+    </w:tbl>
+    <w:p/>
+    <w:p>
+      <w:pPr>
+        <w:pStyle w:val="Heading2"/>
+      </w:pPr>
+      <w:r>
+        <w:t>BUG-001 — envio da ata bloqueado por CSRF em origem isolada</w:t>
+      </w:r>
+    </w:p>
+    <w:tbl>
+      <w:tblPr>
+        <w:tblStyle w:val="TableGrid"/>
+        <w:tblW w:type="auto" w:w="0"/>
+        <w:jc w:val="center"/>
+        <w:tblLayout w:type="fixed"/>
+        <w:tblLook w:firstColumn="1" w:firstRow="1" w:lastColumn="0" w:lastRow="0" w:noHBand="0" w:noVBand="1" w:val="04A0"/>
+        <w:tblBorders>
+          <w:top w:val="single" w:sz="6" w:color="D9D9D9"/>
+          <w:left w:val="single" w:sz="6" w:color="D9D9D9"/>
+          <w:bottom w:val="single" w:sz="6" w:color="D9D9D9"/>
+          <w:right w:val="single" w:sz="6" w:color="D9D9D9"/>
+          <w:insideH w:val="single" w:sz="6" w:color="D9D9D9"/>
+          <w:insideV w:val="single" w:sz="6" w:color="D9D9D9"/>
+        </w:tblBorders>
+      </w:tblPr>
+      <w:tblGrid>
+        <w:gridCol w:w="5040"/>
+        <w:gridCol w:w="5040"/>
+      </w:tblGrid>
+      <w:tr>
+        <w:trPr>
+          <w:cantSplit w:val="true"/>
+          <w:tblHeader w:val="true"/>
+        </w:trPr>
+        <w:tc>
+          <w:tcPr>
+            <w:tcW w:type="dxa" w:w="2232"/>
+            <w:tcMar>
+              <w:top w:w="100" w:type="dxa"/>
+              <w:start w:w="120" w:type="dxa"/>
+              <w:bottom w:w="100" w:type="dxa"/>
+              <w:end w:w="120" w:type="dxa"/>
+            </w:tcMar>
+            <w:vAlign w:val="center"/>
+            <w:shd w:fill="0B3D6E"/>
+          </w:tcPr>
+          <w:p>
+            <w:r>
+              <w:rPr>
+                <w:b/>
+                <w:color w:val="FFFFFF"/>
+              </w:rPr>
+              <w:t>Campo</w:t>
+            </w:r>
+          </w:p>
+        </w:tc>
+        <w:tc>
+          <w:tcPr>
+            <w:tcW w:type="dxa" w:w="7560"/>
+            <w:tcMar>
+              <w:top w:w="100" w:type="dxa"/>
+              <w:start w:w="120" w:type="dxa"/>
+              <w:bottom w:w="100" w:type="dxa"/>
+              <w:end w:w="120" w:type="dxa"/>
+            </w:tcMar>
+            <w:vAlign w:val="center"/>
+            <w:shd w:fill="0B3D6E"/>
+          </w:tcPr>
+          <w:p>
+            <w:r>
+              <w:rPr>
+                <w:b/>
+                <w:color w:val="FFFFFF"/>
+              </w:rPr>
+              <w:t>Registro</w:t>
+            </w:r>
+          </w:p>
+        </w:tc>
+      </w:tr>
+      <w:tr>
+        <w:trPr>
+          <w:cantSplit w:val="true"/>
+        </w:trPr>
+        <w:tc>
+          <w:tcPr>
+            <w:tcW w:type="dxa" w:w="2232"/>
+            <w:tcMar>
+              <w:top w:w="100" w:type="dxa"/>
+              <w:start w:w="120" w:type="dxa"/>
+              <w:bottom w:w="100" w:type="dxa"/>
+              <w:end w:w="120" w:type="dxa"/>
+            </w:tcMar>
+            <w:vAlign w:val="center"/>
+          </w:tcPr>
+          <w:p>
+            <w:r>
+              <w:t>Classificação</w:t>
+            </w:r>
+          </w:p>
+        </w:tc>
+        <w:tc>
+          <w:tcPr>
+            <w:tcW w:type="dxa" w:w="7560"/>
+            <w:tcMar>
+              <w:top w:w="100" w:type="dxa"/>
+              <w:start w:w="120" w:type="dxa"/>
+              <w:bottom w:w="100" w:type="dxa"/>
+              <w:end w:w="120" w:type="dxa"/>
+            </w:tcMar>
+            <w:vAlign w:val="center"/>
+          </w:tcPr>
+          <w:p>
+            <w:r>
+              <w:t>Alta</w:t>
+            </w:r>
+          </w:p>
+        </w:tc>
+      </w:tr>
+      <w:tr>
+        <w:trPr>
+          <w:cantSplit w:val="true"/>
+        </w:trPr>
+        <w:tc>
+          <w:tcPr>
+            <w:tcW w:type="dxa" w:w="2232"/>
+            <w:tcMar>
+              <w:top w:w="100" w:type="dxa"/>
+              <w:start w:w="120" w:type="dxa"/>
+              <w:bottom w:w="100" w:type="dxa"/>
+              <w:end w:w="120" w:type="dxa"/>
+            </w:tcMar>
+            <w:vAlign w:val="center"/>
+            <w:shd w:fill="EAF2F8"/>
+          </w:tcPr>
+          <w:p>
+            <w:r>
+              <w:t>Perfil</w:t>
+            </w:r>
+          </w:p>
+        </w:tc>
+        <w:tc>
+          <w:tcPr>
+            <w:tcW w:type="dxa" w:w="7560"/>
+            <w:tcMar>
+              <w:top w:w="100" w:type="dxa"/>
+              <w:start w:w="120" w:type="dxa"/>
+              <w:bottom w:w="100" w:type="dxa"/>
+              <w:end w:w="120" w:type="dxa"/>
+            </w:tcMar>
+            <w:vAlign w:val="center"/>
+            <w:shd w:fill="EAF2F8"/>
+          </w:tcPr>
+          <w:p>
+            <w:r>
+              <w:t>Responsável do Centro de Estudos, sem autenticação</w:t>
+            </w:r>
+          </w:p>
+        </w:tc>
+      </w:tr>
+      <w:tr>
+        <w:trPr>
+          <w:cantSplit w:val="true"/>
+        </w:trPr>
+        <w:tc>
+          <w:tcPr>
+            <w:tcW w:type="dxa" w:w="2232"/>
+            <w:tcMar>
+              <w:top w:w="100" w:type="dxa"/>
+              <w:start w:w="120" w:type="dxa"/>
+              <w:bottom w:w="100" w:type="dxa"/>
+              <w:end w:w="120" w:type="dxa"/>
+            </w:tcMar>
+            <w:vAlign w:val="center"/>
+          </w:tcPr>
+          <w:p>
+            <w:r>
+              <w:t>Página</w:t>
+            </w:r>
+          </w:p>
+        </w:tc>
+        <w:tc>
+          <w:tcPr>
+            <w:tcW w:type="dxa" w:w="7560"/>
+            <w:tcMar>
+              <w:top w:w="100" w:type="dxa"/>
+              <w:start w:w="120" w:type="dxa"/>
+              <w:bottom w:w="100" w:type="dxa"/>
+              <w:end w:w="120" w:type="dxa"/>
+            </w:tcMar>
+            <w:vAlign w:val="center"/>
+          </w:tcPr>
+          <w:p>
+            <w:r>
+              <w:t>/projetos/centro/aprovacao/&lt;token&gt;/</w:t>
+            </w:r>
+          </w:p>
+        </w:tc>
+      </w:tr>
+      <w:tr>
+        <w:trPr>
+          <w:cantSplit w:val="true"/>
+        </w:trPr>
+        <w:tc>
+          <w:tcPr>
+            <w:tcW w:type="dxa" w:w="2232"/>
+            <w:tcMar>
+              <w:top w:w="100" w:type="dxa"/>
+              <w:start w:w="120" w:type="dxa"/>
+              <w:bottom w:w="100" w:type="dxa"/>
+              <w:end w:w="120" w:type="dxa"/>
+            </w:tcMar>
+            <w:vAlign w:val="center"/>
+            <w:shd w:fill="EAF2F8"/>
+          </w:tcPr>
+          <w:p>
+            <w:r>
+              <w:t>Pré-condição</w:t>
+            </w:r>
+          </w:p>
+        </w:tc>
+        <w:tc>
+          <w:tcPr>
+            <w:tcW w:type="dxa" w:w="7560"/>
+            <w:tcMar>
+              <w:top w:w="100" w:type="dxa"/>
+              <w:start w:w="120" w:type="dxa"/>
+              <w:bottom w:w="100" w:type="dxa"/>
+              <w:end w:w="120" w:type="dxa"/>
+            </w:tcMar>
+            <w:vAlign w:val="center"/>
+            <w:shd w:fill="EAF2F8"/>
+          </w:tcPr>
+          <w:p>
+            <w:r>
+              <w:t>Solicitação ativa para projeto UFAC sem financiamento e ata válida disponível.</w:t>
+            </w:r>
+          </w:p>
+        </w:tc>
+      </w:tr>
+      <w:tr>
+        <w:trPr>
+          <w:cantSplit w:val="true"/>
+        </w:trPr>
+        <w:tc>
+          <w:tcPr>
+            <w:tcW w:type="dxa" w:w="2232"/>
+            <w:tcMar>
+              <w:top w:w="100" w:type="dxa"/>
+              <w:start w:w="120" w:type="dxa"/>
+              <w:bottom w:w="100" w:type="dxa"/>
+              <w:end w:w="120" w:type="dxa"/>
+            </w:tcMar>
+            <w:vAlign w:val="center"/>
+          </w:tcPr>
+          <w:p>
+            <w:r>
+              <w:t>Passos para reproduzir</w:t>
+            </w:r>
+          </w:p>
+        </w:tc>
+        <w:tc>
+          <w:tcPr>
+            <w:tcW w:type="dxa" w:w="7560"/>
+            <w:tcMar>
+              <w:top w:w="100" w:type="dxa"/>
+              <w:start w:w="120" w:type="dxa"/>
+              <w:bottom w:w="100" w:type="dxa"/>
+              <w:end w:w="120" w:type="dxa"/>
+            </w:tcMar>
+            <w:vAlign w:val="center"/>
+          </w:tcPr>
+          <w:p>
+            <w:r>
+              <w:t>Abrir o link em contexto que envie Origin: null e não envie Referer; preencher nome, cargo e confirmação; anexar a ata; enviar.</w:t>
+            </w:r>
+          </w:p>
+        </w:tc>
+      </w:tr>
+      <w:tr>
+        <w:trPr>
+          <w:cantSplit w:val="true"/>
+        </w:trPr>
+        <w:tc>
+          <w:tcPr>
+            <w:tcW w:type="dxa" w:w="2232"/>
+            <w:tcMar>
+              <w:top w:w="100" w:type="dxa"/>
+              <w:start w:w="120" w:type="dxa"/>
+              <w:bottom w:w="100" w:type="dxa"/>
+              <w:end w:w="120" w:type="dxa"/>
+            </w:tcMar>
+            <w:vAlign w:val="center"/>
+            <w:shd w:fill="EAF2F8"/>
+          </w:tcPr>
+          <w:p>
+            <w:r>
+              <w:t>Resultado observado</w:t>
+            </w:r>
+          </w:p>
+        </w:tc>
+        <w:tc>
+          <w:tcPr>
+            <w:tcW w:type="dxa" w:w="7560"/>
+            <w:tcMar>
+              <w:top w:w="100" w:type="dxa"/>
+              <w:start w:w="120" w:type="dxa"/>
+              <w:bottom w:w="100" w:type="dxa"/>
+              <w:end w:w="120" w:type="dxa"/>
+            </w:tcMar>
+            <w:vAlign w:val="center"/>
+            <w:shd w:fill="EAF2F8"/>
+          </w:tcPr>
+          <w:p>
+            <w:r>
+              <w:t>Resposta 403: “Origin checking failed - null does not match any trusted origins.” Os dados não eram processados.</w:t>
+            </w:r>
+          </w:p>
+        </w:tc>
+      </w:tr>
+      <w:tr>
+        <w:trPr>
+          <w:cantSplit w:val="true"/>
+        </w:trPr>
+        <w:tc>
+          <w:tcPr>
+            <w:tcW w:type="dxa" w:w="2232"/>
+            <w:tcMar>
+              <w:top w:w="100" w:type="dxa"/>
+              <w:start w:w="120" w:type="dxa"/>
+              <w:bottom w:w="100" w:type="dxa"/>
+              <w:end w:w="120" w:type="dxa"/>
+            </w:tcMar>
+            <w:vAlign w:val="center"/>
+          </w:tcPr>
+          <w:p>
+            <w:r>
+              <w:t>Resultado esperado</w:t>
+            </w:r>
+          </w:p>
+        </w:tc>
+        <w:tc>
+          <w:tcPr>
+            <w:tcW w:type="dxa" w:w="7560"/>
+            <w:tcMar>
+              <w:top w:w="100" w:type="dxa"/>
+              <w:start w:w="120" w:type="dxa"/>
+              <w:bottom w:w="100" w:type="dxa"/>
+              <w:end w:w="120" w:type="dxa"/>
+            </w:tcMar>
+            <w:vAlign w:val="center"/>
+          </w:tcPr>
+          <w:p>
+            <w:r>
+              <w:t>A ata deve ser validada e vinculada; o token deve ser consumido; o projeto deve seguir para Submetido.</w:t>
+            </w:r>
+          </w:p>
+        </w:tc>
+      </w:tr>
+      <w:tr>
+        <w:trPr>
+          <w:cantSplit w:val="true"/>
+        </w:trPr>
+        <w:tc>
+          <w:tcPr>
+            <w:tcW w:type="dxa" w:w="2232"/>
+            <w:tcMar>
+              <w:top w:w="100" w:type="dxa"/>
+              <w:start w:w="120" w:type="dxa"/>
+              <w:bottom w:w="100" w:type="dxa"/>
+              <w:end w:w="120" w:type="dxa"/>
+            </w:tcMar>
+            <w:vAlign w:val="center"/>
+            <w:shd w:fill="EAF2F8"/>
+          </w:tcPr>
+          <w:p>
+            <w:r>
+              <w:t>Causa</w:t>
+            </w:r>
+          </w:p>
+        </w:tc>
+        <w:tc>
+          <w:tcPr>
+            <w:tcW w:type="dxa" w:w="7560"/>
+            <w:tcMar>
+              <w:top w:w="100" w:type="dxa"/>
+              <w:start w:w="120" w:type="dxa"/>
+              <w:bottom w:w="100" w:type="dxa"/>
+              <w:end w:w="120" w:type="dxa"/>
+            </w:tcMar>
+            <w:vAlign w:val="center"/>
+            <w:shd w:fill="EAF2F8"/>
+          </w:tcPr>
+          <w:p>
+            <w:r>
+              <w:t>O middleware CSRF interrompia o POST antes da view quando o navegador usava origem opaca. Esse endpoint público não usa sessão como credencial; a autorização é feita por token aleatório, temporário e de uso único.</w:t>
+            </w:r>
+          </w:p>
+        </w:tc>
+      </w:tr>
+      <w:tr>
+        <w:trPr>
+          <w:cantSplit w:val="true"/>
+        </w:trPr>
+        <w:tc>
+          <w:tcPr>
+            <w:tcW w:type="dxa" w:w="2232"/>
+            <w:tcMar>
+              <w:top w:w="100" w:type="dxa"/>
+              <w:start w:w="120" w:type="dxa"/>
+              <w:bottom w:w="100" w:type="dxa"/>
+              <w:end w:w="120" w:type="dxa"/>
+            </w:tcMar>
+            <w:vAlign w:val="center"/>
+          </w:tcPr>
+          <w:p>
+            <w:r>
+              <w:t>Correção</w:t>
+            </w:r>
+          </w:p>
+        </w:tc>
+        <w:tc>
+          <w:tcPr>
+            <w:tcW w:type="dxa" w:w="7560"/>
+            <w:tcMar>
+              <w:top w:w="100" w:type="dxa"/>
+              <w:start w:w="120" w:type="dxa"/>
+              <w:bottom w:w="100" w:type="dxa"/>
+              <w:end w:w="120" w:type="dxa"/>
+            </w:tcMar>
+            <w:vAlign w:val="center"/>
+          </w:tcPr>
+          <w:p>
+            <w:r>
+              <w:t>Isenção de CSRF limitada à view aprovacao_centro. Permaneceram as validações de token, expiração, uso único, transação atômica, confirmação e formato do arquivo. As demais rotas continuam protegidas por CSRF.</w:t>
+            </w:r>
+          </w:p>
+        </w:tc>
+      </w:tr>
+      <w:tr>
+        <w:trPr>
+          <w:cantSplit w:val="true"/>
+        </w:trPr>
+        <w:tc>
+          <w:tcPr>
+            <w:tcW w:type="dxa" w:w="2232"/>
+            <w:tcMar>
+              <w:top w:w="100" w:type="dxa"/>
+              <w:start w:w="120" w:type="dxa"/>
+              <w:bottom w:w="100" w:type="dxa"/>
+              <w:end w:w="120" w:type="dxa"/>
+            </w:tcMar>
+            <w:vAlign w:val="center"/>
+            <w:shd w:fill="EAF2F8"/>
+          </w:tcPr>
+          <w:p>
+            <w:r>
+              <w:t>Teste de regressão</w:t>
+            </w:r>
+          </w:p>
+        </w:tc>
+        <w:tc>
+          <w:tcPr>
+            <w:tcW w:type="dxa" w:w="7560"/>
+            <w:tcMar>
+              <w:top w:w="100" w:type="dxa"/>
+              <w:start w:w="120" w:type="dxa"/>
+              <w:bottom w:w="100" w:type="dxa"/>
+              <w:end w:w="120" w:type="dxa"/>
+            </w:tcMar>
+            <w:vAlign w:val="center"/>
+            <w:shd w:fill="EAF2F8"/>
+          </w:tcPr>
+          <w:p>
+            <w:r>
+              <w:t>test_link_publico_aceita_ata_quando_navegador_envia_origin_null: falhava com 403 antes da correção e passou com ata salva, token utilizado e projeto Submetido.</w:t>
+            </w:r>
+          </w:p>
+        </w:tc>
+      </w:tr>
+      <w:tr>
+        <w:trPr>
+          <w:cantSplit w:val="true"/>
+        </w:trPr>
+        <w:tc>
+          <w:tcPr>
+            <w:tcW w:type="dxa" w:w="2232"/>
+            <w:tcMar>
+              <w:top w:w="100" w:type="dxa"/>
+              <w:start w:w="120" w:type="dxa"/>
+              <w:bottom w:w="100" w:type="dxa"/>
+              <w:end w:w="120" w:type="dxa"/>
+            </w:tcMar>
+            <w:vAlign w:val="center"/>
+          </w:tcPr>
+          <w:p>
+            <w:r>
+              <w:t>Publicação</w:t>
+            </w:r>
+          </w:p>
+        </w:tc>
+        <w:tc>
+          <w:tcPr>
+            <w:tcW w:type="dxa" w:w="7560"/>
+            <w:tcMar>
+              <w:top w:w="100" w:type="dxa"/>
+              <w:start w:w="120" w:type="dxa"/>
+              <w:bottom w:w="100" w:type="dxa"/>
+              <w:end w:w="120" w:type="dxa"/>
+            </w:tcMar>
+            <w:vAlign w:val="center"/>
+          </w:tcPr>
+          <w:p>
+            <w:r>
+              <w:t>Commit 00e815e — Corrige envio de ata em origem isolada; versão enviada à branch main e confirmada no Render.</w:t>
+            </w:r>
+          </w:p>
+        </w:tc>
+      </w:tr>
+    </w:tbl>
+    <w:p/>
+    <w:p>
+      <w:pPr>
+        <w:pStyle w:val="Heading2"/>
+      </w:pPr>
+      <w:r>
+        <w:t>Controles de segurança confirmados no link</w:t>
+      </w:r>
+    </w:p>
+    <w:p>
+      <w:pPr>
+        <w:ind w:left="403" w:hanging="317"/>
+      </w:pPr>
+      <w:r>
+        <w:t>•  O valor bruto do token aparece somente no link enviado; o banco armazena seu resumo criptográfico SHA-256.</w:t>
+      </w:r>
+    </w:p>
+    <w:p>
+      <w:pPr>
+        <w:ind w:left="403" w:hanging="317"/>
+      </w:pPr>
+      <w:r>
+        <w:t>•  O token expira em 168 horas, é de uso único e solicitações anteriores podem ser invalidadas.</w:t>
+      </w:r>
+    </w:p>
+    <w:p>
+      <w:pPr>
+        <w:ind w:left="403" w:hanging="317"/>
+      </w:pPr>
+      <w:r>
+        <w:t>•  O processamento usa transação e bloqueio do registro para impedir consumo concorrente.</w:t>
+      </w:r>
+    </w:p>
+    <w:p>
+      <w:pPr>
+        <w:ind w:left="403" w:hanging="317"/>
+      </w:pPr>
+      <w:r>
+        <w:t>•  Nome, cargo, confirmação e arquivo permitido são validados no servidor.</w:t>
+      </w:r>
+    </w:p>
+    <w:p>
+      <w:pPr>
+        <w:ind w:left="403" w:hanging="317"/>
+      </w:pPr>
+      <w:r>
+        <w:t>•  A resposta do link usa política de referência restrita para reduzir exposição do token em navegação externa.</w:t>
+      </w:r>
+    </w:p>
+    <w:p>
+      <w:pPr>
+        <w:pStyle w:val="Heading2"/>
+      </w:pPr>
+      <w:r>
+        <w:t>RISCO-001 — acesso direto aos arquivos armazenados</w:t>
+      </w:r>
+    </w:p>
+    <w:p>
+      <w:pPr>
+        <w:spacing w:after="80"/>
+      </w:pPr>
+      <w:r>
+        <w:rPr>
+          <w:b/>
+        </w:rPr>
+        <w:t xml:space="preserve">Classificação proposta: </w:t>
+      </w:r>
+      <w:r>
+        <w:t>Alta, caso atas e anexos sejam documentos restritos.</w:t>
+      </w:r>
+    </w:p>
+    <w:p>
+      <w:pPr>
+        <w:spacing w:after="80"/>
+      </w:pPr>
+      <w:r>
+        <w:rPr>
+          <w:b/>
+        </w:rPr>
+        <w:t xml:space="preserve">Constatação: </w:t>
+      </w:r>
+      <w:r>
+        <w:t>A configuração atual do armazenamento de mídia no Cloudinary permite acesso anônimo ao arquivo por quem possuir a URL direta.</w:t>
+      </w:r>
+    </w:p>
+    <w:p>
+      <w:pPr>
+        <w:spacing w:after="80"/>
+      </w:pPr>
+      <w:r>
+        <w:rPr>
+          <w:b/>
+        </w:rPr>
+        <w:t xml:space="preserve">Impacto possível: </w:t>
+      </w:r>
+      <w:r>
+        <w:t>O controle de perfil na página de detalhes não revoga uma URL de mídia já conhecida ou compartilhada.</w:t>
+      </w:r>
+    </w:p>
+    <w:p>
+      <w:pPr>
+        <w:spacing w:after="80"/>
+      </w:pPr>
+      <w:r>
+        <w:rPr>
+          <w:b/>
+        </w:rPr>
+        <w:t xml:space="preserve">Ação recomendada: </w:t>
+      </w:r>
+      <w:r>
+        <w:t>Definir a classificação institucional das atas. Se forem restritas, usar download autenticado, URLs assinadas com validade curta ou armazenamento privado e adicionar testes de autorização.</w:t>
+      </w:r>
+    </w:p>
+    <w:p>
+      <w:pPr>
+        <w:spacing w:after="80"/>
+      </w:pPr>
+      <w:r>
+        <w:rPr>
+          <w:b/>
+        </w:rPr>
+        <w:t xml:space="preserve">Situação: </w:t>
+      </w:r>
+      <w:r>
+        <w:t>Pendente de decisão funcional e de uma validação específica de autorização de documentos em produção.</w:t>
+      </w:r>
+    </w:p>
+    <w:p>
+      <w:pPr>
+        <w:pStyle w:val="Heading2"/>
+      </w:pPr>
+      <w:r>
+        <w:t>Dados temporários criados em ambiente local</w:t>
+      </w:r>
+    </w:p>
+    <w:tbl>
+      <w:tblPr>
+        <w:tblStyle w:val="TableGrid"/>
+        <w:tblW w:type="auto" w:w="0"/>
+        <w:jc w:val="center"/>
+        <w:tblLayout w:type="fixed"/>
+        <w:tblLook w:firstColumn="1" w:firstRow="1" w:lastColumn="0" w:lastRow="0" w:noHBand="0" w:noVBand="1" w:val="04A0"/>
+        <w:tblBorders>
+          <w:top w:val="single" w:sz="6" w:color="D9D9D9"/>
+          <w:left w:val="single" w:sz="6" w:color="D9D9D9"/>
+          <w:bottom w:val="single" w:sz="6" w:color="D9D9D9"/>
+          <w:right w:val="single" w:sz="6" w:color="D9D9D9"/>
+          <w:insideH w:val="single" w:sz="6" w:color="D9D9D9"/>
+          <w:insideV w:val="single" w:sz="6" w:color="D9D9D9"/>
+        </w:tblBorders>
+      </w:tblPr>
+      <w:tblGrid>
+        <w:gridCol w:w="5040"/>
+        <w:gridCol w:w="5040"/>
+      </w:tblGrid>
+      <w:tr>
+        <w:trPr>
+          <w:cantSplit w:val="true"/>
+          <w:tblHeader w:val="true"/>
+        </w:trPr>
+        <w:tc>
+          <w:tcPr>
+            <w:tcW w:type="dxa" w:w="1944"/>
+            <w:tcMar>
+              <w:top w:w="100" w:type="dxa"/>
+              <w:start w:w="120" w:type="dxa"/>
+              <w:bottom w:w="100" w:type="dxa"/>
+              <w:end w:w="120" w:type="dxa"/>
+            </w:tcMar>
+            <w:vAlign w:val="center"/>
+            <w:shd w:fill="0B3D6E"/>
+          </w:tcPr>
+          <w:p>
+            <w:r>
+              <w:rPr>
+                <w:b/>
+                <w:color w:val="FFFFFF"/>
+              </w:rPr>
+              <w:t>Registro</w:t>
+            </w:r>
+          </w:p>
+        </w:tc>
+        <w:tc>
+          <w:tcPr>
+            <w:tcW w:type="dxa" w:w="7848"/>
+            <w:tcMar>
+              <w:top w:w="100" w:type="dxa"/>
+              <w:start w:w="120" w:type="dxa"/>
+              <w:bottom w:w="100" w:type="dxa"/>
+              <w:end w:w="120" w:type="dxa"/>
+            </w:tcMar>
+            <w:vAlign w:val="center"/>
+            <w:shd w:fill="0B3D6E"/>
+          </w:tcPr>
+          <w:p>
+            <w:r>
+              <w:rPr>
+                <w:b/>
+                <w:color w:val="FFFFFF"/>
+              </w:rPr>
+              <w:t>Identificação</w:t>
+            </w:r>
+          </w:p>
+        </w:tc>
+      </w:tr>
+      <w:tr>
+        <w:trPr>
+          <w:cantSplit w:val="true"/>
+        </w:trPr>
+        <w:tc>
+          <w:tcPr>
+            <w:tcW w:type="dxa" w:w="1944"/>
+            <w:tcMar>
+              <w:top w:w="100" w:type="dxa"/>
+              <w:start w:w="120" w:type="dxa"/>
+              <w:bottom w:w="100" w:type="dxa"/>
+              <w:end w:w="120" w:type="dxa"/>
+            </w:tcMar>
+            <w:vAlign w:val="center"/>
+          </w:tcPr>
+          <w:p>
+            <w:r>
+              <w:t>Centro 24</w:t>
+            </w:r>
+          </w:p>
+        </w:tc>
+        <w:tc>
+          <w:tcPr>
+            <w:tcW w:type="dxa" w:w="7848"/>
+            <w:tcMar>
+              <w:top w:w="100" w:type="dxa"/>
+              <w:start w:w="120" w:type="dxa"/>
+              <w:bottom w:w="100" w:type="dxa"/>
+              <w:end w:w="120" w:type="dxa"/>
+            </w:tcMar>
+            <w:vAlign w:val="center"/>
+          </w:tcPr>
+          <w:p>
+            <w:r>
+              <w:t>TESTE LUNAR 20260916 - CENTRO DE ESTUDOS FICTÍCIO (SOMENTE TESTE LOCAL - NÃO USAR EM PRODUÇÃO)</w:t>
+            </w:r>
+          </w:p>
+        </w:tc>
+      </w:tr>
+      <w:tr>
+        <w:trPr>
+          <w:cantSplit w:val="true"/>
+        </w:trPr>
+        <w:tc>
+          <w:tcPr>
+            <w:tcW w:type="dxa" w:w="1944"/>
+            <w:tcMar>
+              <w:top w:w="100" w:type="dxa"/>
+              <w:start w:w="120" w:type="dxa"/>
+              <w:bottom w:w="100" w:type="dxa"/>
+              <w:end w:w="120" w:type="dxa"/>
+            </w:tcMar>
+            <w:vAlign w:val="center"/>
+            <w:shd w:fill="EAF2F8"/>
+          </w:tcPr>
+          <w:p>
+            <w:r>
+              <w:t>Usuário 36</w:t>
+            </w:r>
+          </w:p>
+        </w:tc>
+        <w:tc>
+          <w:tcPr>
+            <w:tcW w:type="dxa" w:w="7848"/>
+            <w:tcMar>
+              <w:top w:w="100" w:type="dxa"/>
+              <w:start w:w="120" w:type="dxa"/>
+              <w:bottom w:w="100" w:type="dxa"/>
+              <w:end w:w="120" w:type="dxa"/>
+            </w:tcMar>
+            <w:vAlign w:val="center"/>
+            <w:shd w:fill="EAF2F8"/>
+          </w:tcPr>
+          <w:p>
+            <w:r>
+              <w:t>teste-lunar-coordenador; conta sintética usada apenas no fluxo local.</w:t>
+            </w:r>
+          </w:p>
+        </w:tc>
+      </w:tr>
+      <w:tr>
+        <w:trPr>
+          <w:cantSplit w:val="true"/>
+        </w:trPr>
+        <w:tc>
+          <w:tcPr>
+            <w:tcW w:type="dxa" w:w="1944"/>
+            <w:tcMar>
+              <w:top w:w="100" w:type="dxa"/>
+              <w:start w:w="120" w:type="dxa"/>
+              <w:bottom w:w="100" w:type="dxa"/>
+              <w:end w:w="120" w:type="dxa"/>
+            </w:tcMar>
+            <w:vAlign w:val="center"/>
+          </w:tcPr>
+          <w:p>
+            <w:r>
+              <w:t>Projeto 106</w:t>
+            </w:r>
+          </w:p>
+        </w:tc>
+        <w:tc>
+          <w:tcPr>
+            <w:tcW w:type="dxa" w:w="7848"/>
+            <w:tcMar>
+              <w:top w:w="100" w:type="dxa"/>
+              <w:start w:w="120" w:type="dxa"/>
+              <w:bottom w:w="100" w:type="dxa"/>
+              <w:end w:w="120" w:type="dxa"/>
+            </w:tcMar>
+            <w:vAlign w:val="center"/>
+          </w:tcPr>
+          <w:p>
+            <w:r>
+              <w:t>TESTE LUNAR 20260916 - VALIDAÇÃO DO LINK DO CENTRO - TESTE LOCAL; situação final Submetido.</w:t>
+            </w:r>
+          </w:p>
+        </w:tc>
+      </w:tr>
+      <w:tr>
+        <w:trPr>
+          <w:cantSplit w:val="true"/>
+        </w:trPr>
+        <w:tc>
+          <w:tcPr>
+            <w:tcW w:type="dxa" w:w="1944"/>
+            <w:tcMar>
+              <w:top w:w="100" w:type="dxa"/>
+              <w:start w:w="120" w:type="dxa"/>
+              <w:bottom w:w="100" w:type="dxa"/>
+              <w:end w:w="120" w:type="dxa"/>
+            </w:tcMar>
+            <w:vAlign w:val="center"/>
+            <w:shd w:fill="EAF2F8"/>
+          </w:tcPr>
+          <w:p>
+            <w:r>
+              <w:t>Anexo 58</w:t>
+            </w:r>
+          </w:p>
+        </w:tc>
+        <w:tc>
+          <w:tcPr>
+            <w:tcW w:type="dxa" w:w="7848"/>
+            <w:tcMar>
+              <w:top w:w="100" w:type="dxa"/>
+              <w:start w:w="120" w:type="dxa"/>
+              <w:bottom w:w="100" w:type="dxa"/>
+              <w:end w:w="120" w:type="dxa"/>
+            </w:tcMar>
+            <w:vAlign w:val="center"/>
+            <w:shd w:fill="EAF2F8"/>
+          </w:tcPr>
+          <w:p>
+            <w:r>
+              <w:t>Ata fictícia vinculada ao projeto 106.</w:t>
+            </w:r>
+          </w:p>
+        </w:tc>
+      </w:tr>
+      <w:tr>
+        <w:trPr>
+          <w:cantSplit w:val="true"/>
+        </w:trPr>
+        <w:tc>
+          <w:tcPr>
+            <w:tcW w:type="dxa" w:w="1944"/>
+            <w:tcMar>
+              <w:top w:w="100" w:type="dxa"/>
+              <w:start w:w="120" w:type="dxa"/>
+              <w:bottom w:w="100" w:type="dxa"/>
+              <w:end w:w="120" w:type="dxa"/>
+            </w:tcMar>
+            <w:vAlign w:val="center"/>
+          </w:tcPr>
+          <w:p>
+            <w:r>
+              <w:t>Arquivo de exemplo</w:t>
+            </w:r>
+          </w:p>
+        </w:tc>
+        <w:tc>
+          <w:tcPr>
+            <w:tcW w:type="dxa" w:w="7848"/>
+            <w:tcMar>
+              <w:top w:w="100" w:type="dxa"/>
+              <w:start w:w="120" w:type="dxa"/>
+              <w:bottom w:w="100" w:type="dxa"/>
+              <w:end w:w="120" w:type="dxa"/>
+            </w:tcMar>
+            <w:vAlign w:val="center"/>
+          </w:tcPr>
+          <w:p>
+            <w:r>
+              <w:t>output/pdf/TESTE_LUNAR_ATA_FICTICIA_20260916.pdf</w:t>
+            </w:r>
+          </w:p>
+        </w:tc>
+      </w:tr>
+      <w:tr>
+        <w:trPr>
+          <w:cantSplit w:val="true"/>
+        </w:trPr>
+        <w:tc>
+          <w:tcPr>
+            <w:tcW w:type="dxa" w:w="1944"/>
+            <w:tcMar>
+              <w:top w:w="100" w:type="dxa"/>
+              <w:start w:w="120" w:type="dxa"/>
+              <w:bottom w:w="100" w:type="dxa"/>
+              <w:end w:w="120" w:type="dxa"/>
+            </w:tcMar>
+            <w:vAlign w:val="center"/>
+            <w:shd w:fill="EAF2F8"/>
+          </w:tcPr>
+          <w:p>
+            <w:r>
+              <w:t>Arquivo enviado</w:t>
+            </w:r>
+          </w:p>
+        </w:tc>
+        <w:tc>
+          <w:tcPr>
+            <w:tcW w:type="dxa" w:w="7848"/>
+            <w:tcMar>
+              <w:top w:w="100" w:type="dxa"/>
+              <w:start w:w="120" w:type="dxa"/>
+              <w:bottom w:w="100" w:type="dxa"/>
+              <w:end w:w="120" w:type="dxa"/>
+            </w:tcMar>
+            <w:vAlign w:val="center"/>
+            <w:shd w:fill="EAF2F8"/>
+          </w:tcPr>
+          <w:p>
+            <w:r>
+              <w:t>media/anexos/2026/09/TESTE_LUNAR_ATA_FICTICIA_20260916.pdf</w:t>
+            </w:r>
+          </w:p>
+        </w:tc>
+      </w:tr>
+    </w:tbl>
+    <w:p/>
+    <w:p>
+      <w:r>
+        <w:t>Limpeza: remover somente o projeto 106 e seus anexos, notificações e solicitação de aprovação; depois remover o usuário 36 e o centro 24, confirmando antes que nenhum vínculo externo tenha sido criado. Não remover usuários, projetos ou o link de demonstração existentes antes desta execução.</w:t>
+      </w:r>
+    </w:p>
+    <w:p>
+      <w:pPr>
+        <w:pStyle w:val="Heading2"/>
+      </w:pPr>
+      <w:r>
+        <w:t>Conclusão desta execução</w:t>
+      </w:r>
+    </w:p>
+    <w:p>
+      <w:r>
+        <w:t>O fluxo do Centro de Estudos foi confirmado de ponta a ponta no ambiente local após a correção. Em produção, foi confirmado que a implantação aceita o contexto Origin: null e alcança a validação do token. O envio com um token de produção válido permanece sem execução para preservar o link de demonstração. Portanto, a funcionalidade está operacional dentro da cobertura descrita, mas a plataforma não deve ser considerada livre de bugs conhecidos enquanto o RISCO-001 e os demais casos ainda não executados estiverem pendentes.</w:t>
+      </w:r>
+    </w:p>
+    <w:p>
+      <w:pPr>
+        <w:pStyle w:val="Heading1"/>
       </w:pPr>
       <w:r>
         <w:t>Critério de encerramento da validação</w:t>
@@ -15200,7 +16841,7 @@
     </w:p>
     <w:p>
       <w:r>
-        <w:t>A validação pode ser encerrada quando todos os casos de prioridade alta estiverem aprovados, não houver falhas de controle de acesso ou perda de dados e as divergências restantes estiverem registradas com responsável e decisão de correção. Os três fluxos de projeto e o fluxo ético devem ser executados integralmente ao menos uma vez.</w:t>
+        <w:t>A validação pode ser encerrada quando todos os casos de prioridade alta estiverem aprovados, não houver falhas de controle de acesso ou perda de dados e as divergências restantes estiverem registradas com responsável e decisão de correção. Os três fluxos de projeto e o fluxo ético devem ser executados integralmente ao menos uma vez. O envio em produção com token válido pode ser executado somente com um projeto temporário autorizado, sem consumir o link de demonstração.</w:t>
       </w:r>
     </w:p>
     <w:sectPr>

</xml_diff>

<commit_message>
Implementando as mudanças pedidas pelo PO
</commit_message>
<xml_diff>
--- a/plataforma_projetos/output/Plano_de_Testes_Plataforma_PROPEG.docx
+++ b/plataforma_projetos/output/Plano_de_Testes_Plataforma_PROPEG.docx
@@ -265,7 +265,7 @@
         <w:jc w:val="both"/>
       </w:pPr>
       <w:r>
-        <w:t>Este documento orienta a validação manual da plataforma publicada no Render, desde o cadastro e o login até a criação, tramitação, execução, finalização e consulta de projetos. Os casos utilizam dados temporários de amostra e cobrem os perfis Coordenador, Aluno, Gestor e o acesso restrito do Centro de Estudos. As operações realizadas alteram o banco de produção e devem permanecer limitadas às contas e aos registros descritos neste roteiro.</w:t>
+        <w:t>Este documento orienta a validação manual da plataforma publicada no Render, desde o cadastro e o login até a criação, tramitação, execução, finalização e consulta de projetos. Os casos utilizam dados temporários de amostra e cobrem os perfis Coordenador, Aluno, Gestor e o acesso restrito do Centro Acadêmico. As operações realizadas alteram o banco de produção e devem permanecer limitadas às contas e aos registros descritos neste roteiro.</w:t>
       </w:r>
     </w:p>
     <w:p>
@@ -3053,7 +3053,7 @@
           </w:tcPr>
           <w:p>
             <w:r>
-              <w:t>TESTE LUNAR 20260916 - CENTRO DE ESTUDOS FICTÍCIO (SOMENTE TESTE LOCAL - NÃO USAR EM PRODUÇÃO); e-mail d.moura250304@gmail.com</w:t>
+              <w:t>TESTE LUNAR 20260916 - CENTRO ACADÊMICO FICTÍCIO (SOMENTE TESTE LOCAL - NÃO USAR EM PRODUÇÃO); e-mail d.moura250304@gmail.com</w:t>
             </w:r>
           </w:p>
         </w:tc>
@@ -3133,7 +3133,7 @@
           </w:tcPr>
           <w:p>
             <w:r>
-              <w:t>CCET - Centro de Ciências Exatas e Tecnológicas</w:t>
+              <w:t>CCET - Centro Acadêmico de Ciências Exatas e Tecnológicas</w:t>
             </w:r>
           </w:p>
         </w:tc>
@@ -5274,7 +5274,7 @@
         <w:ind w:left="403" w:hanging="317"/>
       </w:pPr>
       <w:r>
-        <w:t>2.  Preencher dados pessoais, titulação, SIAPE, Lattes e centro de lotação.</w:t>
+        <w:t>2.  Preencher dados pessoais, titulação, SIAPE, Lattes e Centro Acadêmico.</w:t>
       </w:r>
     </w:p>
     <w:p>
@@ -6378,7 +6378,7 @@
         <w:ind w:left="403" w:hanging="317"/>
       </w:pPr>
       <w:r>
-        <w:t>•  O projeto fica Aguardando aprovação do Centro e não passa imediatamente ao gestor.</w:t>
+        <w:t>•  O projeto fica Aguardando deliberação do Centro Acadêmico e não passa imediatamente ao gestor.</w:t>
       </w:r>
     </w:p>
     <w:p/>
@@ -6728,7 +6728,7 @@
         <w:ind w:left="403" w:hanging="317"/>
       </w:pPr>
       <w:r>
-        <w:t>2.  Anexar o comprovante e submeter.</w:t>
+        <w:t>2.  Ler o aviso azul exibido abaixo da seleção.</w:t>
       </w:r>
     </w:p>
     <w:p>
@@ -6737,7 +6737,7 @@
         <w:ind w:left="403" w:hanging="317"/>
       </w:pPr>
       <w:r>
-        <w:t>3.  Abrir os detalhes do projeto.</w:t>
+        <w:t>3.  Anexar o comprovante, submeter e abrir os detalhes do projeto.</w:t>
       </w:r>
     </w:p>
     <w:p>
@@ -6759,7 +6759,7 @@
         <w:ind w:left="403" w:hanging="317"/>
       </w:pPr>
       <w:r>
-        <w:t>•  O sistema registra prazo máximo de 90 dias.</w:t>
+        <w:t>•  O aviso explica o prazo de 90 dias, os alertas e o bloqueio até a aprovação definitiva.</w:t>
       </w:r>
     </w:p>
     <w:p>
@@ -8485,29 +8485,12 @@
     <w:p/>
     <w:p>
       <w:pPr>
-        <w:pStyle w:val="Heading1"/>
-        <w:keepNext/>
-      </w:pPr>
-      <w:r>
-        <w:t>Casos de teste do Centro de Estudos</w:t>
-      </w:r>
-    </w:p>
-    <w:p>
-      <w:pPr>
-        <w:keepNext/>
-      </w:pPr>
-      <w:r>
-        <w:t>O link é temporário, restrito e de uso único.</w:t>
-      </w:r>
-    </w:p>
-    <w:p>
-      <w:pPr>
         <w:pStyle w:val="Heading3"/>
         <w:keepNext/>
         <w:keepLines/>
       </w:pPr>
       <w:r>
-        <w:t>CT-CEN-001  Abrir o link restrito do Centro</w:t>
+        <w:t>CT-COO-022  Confirmar a remoção da imagem de capa</w:t>
       </w:r>
     </w:p>
     <w:p>
@@ -8523,7 +8506,7 @@
         <w:t xml:space="preserve">Perfil: </w:t>
       </w:r>
       <w:r>
-        <w:t>Responsável do Centro</w:t>
+        <w:t>Coordenador Gestor</w:t>
       </w:r>
     </w:p>
     <w:p>
@@ -8555,7 +8538,7 @@
         <w:t xml:space="preserve">Pré-condições: </w:t>
       </w:r>
       <w:r>
-        <w:t>Usar um projeto temporário local ou outro token criado para o teste. Não consumir o link público de demonstração em verificações comuns.</w:t>
+        <w:t>Abrir a Etapa 1 de um projeto novo ou histórico.</w:t>
       </w:r>
     </w:p>
     <w:p>
@@ -8577,7 +8560,7 @@
         <w:ind w:left="403" w:hanging="317"/>
       </w:pPr>
       <w:r>
-        <w:t>1.  Abrir o link em janela anônima, sem autenticação.</w:t>
+        <w:t>1.  Percorrer todas as seções da Etapa 1.</w:t>
       </w:r>
     </w:p>
     <w:p>
@@ -8586,7 +8569,7 @@
         <w:ind w:left="403" w:hanging="317"/>
       </w:pPr>
       <w:r>
-        <w:t>2.  Conferir o resumo do projeto.</w:t>
+        <w:t>2.  Revisar a etapa final e os detalhes após salvar.</w:t>
       </w:r>
     </w:p>
     <w:p>
@@ -8608,7 +8591,7 @@
         <w:ind w:left="403" w:hanging="317"/>
       </w:pPr>
       <w:r>
-        <w:t>•  O acesso exibe apenas as informações necessárias.</w:t>
+        <w:t>•  Nenhum campo de imagem de capa é exibido.</w:t>
       </w:r>
     </w:p>
     <w:p>
@@ -8617,18 +8600,35 @@
         <w:ind w:left="403" w:hanging="317"/>
       </w:pPr>
       <w:r>
-        <w:t>•  Menus e funções internas da plataforma não ficam disponíveis.</w:t>
+        <w:t>•  O projeto funciona normalmente sem solicitar ou exibir capa personalizada.</w:t>
       </w:r>
     </w:p>
     <w:p/>
     <w:p>
       <w:pPr>
+        <w:pStyle w:val="Heading1"/>
+        <w:keepNext/>
+      </w:pPr>
+      <w:r>
+        <w:t>Casos de teste do Centro Acadêmico</w:t>
+      </w:r>
+    </w:p>
+    <w:p>
+      <w:pPr>
+        <w:keepNext/>
+      </w:pPr>
+      <w:r>
+        <w:t>O link é temporário, restrito e de uso único.</w:t>
+      </w:r>
+    </w:p>
+    <w:p>
+      <w:pPr>
         <w:pStyle w:val="Heading3"/>
         <w:keepNext/>
         <w:keepLines/>
       </w:pPr>
       <w:r>
-        <w:t>CT-CEN-002  Visualizar o documento do projeto</w:t>
+        <w:t>CT-CEN-001  Abrir o link restrito do Centro</w:t>
       </w:r>
     </w:p>
     <w:p>
@@ -8676,7 +8676,7 @@
         <w:t xml:space="preserve">Pré-condições: </w:t>
       </w:r>
       <w:r>
-        <w:t>Link do Centro ativo.</w:t>
+        <w:t>Usar um projeto temporário local ou outro token criado para o teste. Não consumir o link público de demonstração em verificações comuns.</w:t>
       </w:r>
     </w:p>
     <w:p>
@@ -8698,7 +8698,7 @@
         <w:ind w:left="403" w:hanging="317"/>
       </w:pPr>
       <w:r>
-        <w:t>1.  Clicar para visualizar o projeto.</w:t>
+        <w:t>1.  Abrir o link em janela anônima, sem autenticação.</w:t>
       </w:r>
     </w:p>
     <w:p>
@@ -8707,7 +8707,7 @@
         <w:ind w:left="403" w:hanging="317"/>
       </w:pPr>
       <w:r>
-        <w:t>2.  Voltar ao formulário de aprovação.</w:t>
+        <w:t>2.  Conferir o resumo do projeto.</w:t>
       </w:r>
     </w:p>
     <w:p>
@@ -8729,7 +8729,7 @@
         <w:ind w:left="403" w:hanging="317"/>
       </w:pPr>
       <w:r>
-        <w:t>•  O documento pode ser consultado pelo token.</w:t>
+        <w:t>•  O acesso exibe apenas as informações necessárias.</w:t>
       </w:r>
     </w:p>
     <w:p>
@@ -8738,7 +8738,7 @@
         <w:ind w:left="403" w:hanging="317"/>
       </w:pPr>
       <w:r>
-        <w:t>•  Nenhum outro projeto pode ser acessado pelo mesmo link.</w:t>
+        <w:t>•  Menus e funções internas da plataforma não ficam disponíveis.</w:t>
       </w:r>
     </w:p>
     <w:p/>
@@ -8749,7 +8749,7 @@
         <w:keepLines/>
       </w:pPr>
       <w:r>
-        <w:t>CT-CEN-003  Validar campos obrigatórios da aprovação</w:t>
+        <w:t>CT-CEN-002  Visualizar o documento do projeto</w:t>
       </w:r>
     </w:p>
     <w:p>
@@ -8819,7 +8819,7 @@
         <w:ind w:left="403" w:hanging="317"/>
       </w:pPr>
       <w:r>
-        <w:t>1.  Enviar sem nome, cargo, confirmação ou ata.</w:t>
+        <w:t>1.  Clicar para visualizar o projeto.</w:t>
       </w:r>
     </w:p>
     <w:p>
@@ -8828,7 +8828,7 @@
         <w:ind w:left="403" w:hanging="317"/>
       </w:pPr>
       <w:r>
-        <w:t>2.  Tentar anexar formato não permitido.</w:t>
+        <w:t>2.  Voltar ao formulário de deliberação.</w:t>
       </w:r>
     </w:p>
     <w:p>
@@ -8850,7 +8850,7 @@
         <w:ind w:left="403" w:hanging="317"/>
       </w:pPr>
       <w:r>
-        <w:t>•  Campos ausentes são indicados.</w:t>
+        <w:t>•  O documento pode ser consultado pelo token.</w:t>
       </w:r>
     </w:p>
     <w:p>
@@ -8859,7 +8859,7 @@
         <w:ind w:left="403" w:hanging="317"/>
       </w:pPr>
       <w:r>
-        <w:t>•  Somente PDF, PNG, JPG ou JPEG são aceitos para a ata.</w:t>
+        <w:t>•  Nenhum outro projeto pode ser acessado pelo mesmo link.</w:t>
       </w:r>
     </w:p>
     <w:p/>
@@ -8870,7 +8870,7 @@
         <w:keepLines/>
       </w:pPr>
       <w:r>
-        <w:t>CT-CEN-004  Registrar a ata e encaminhar à PROPEG</w:t>
+        <w:t>CT-CEN-003  Validar campos obrigatórios da deliberação</w:t>
       </w:r>
     </w:p>
     <w:p>
@@ -8918,7 +8918,7 @@
         <w:t xml:space="preserve">Pré-condições: </w:t>
       </w:r>
       <w:r>
-        <w:t>Link ativo e arquivo de teste disponível.</w:t>
+        <w:t>Link do Centro ativo.</w:t>
       </w:r>
     </w:p>
     <w:p>
@@ -8940,7 +8940,7 @@
         <w:ind w:left="403" w:hanging="317"/>
       </w:pPr>
       <w:r>
-        <w:t>1.  Informar nome e cargo.</w:t>
+        <w:t>1.  Enviar sem nome, cargo, resultado, confirmação ou ata.</w:t>
       </w:r>
     </w:p>
     <w:p>
@@ -8949,16 +8949,7 @@
         <w:ind w:left="403" w:hanging="317"/>
       </w:pPr>
       <w:r>
-        <w:t>2.  Confirmar a aprovação, anexar a ata e enviar.</w:t>
-      </w:r>
-    </w:p>
-    <w:p>
-      <w:pPr>
-        <w:keepLines/>
-        <w:ind w:left="403" w:hanging="317"/>
-      </w:pPr>
-      <w:r>
-        <w:t>3.  Abrir os detalhes do projeto com o coordenador ou gestor e consultar a ata em Anexos.</w:t>
+        <w:t>2.  Tentar anexar formato não permitido.</w:t>
       </w:r>
     </w:p>
     <w:p>
@@ -8980,7 +8971,7 @@
         <w:ind w:left="403" w:hanging="317"/>
       </w:pPr>
       <w:r>
-        <w:t>•  A ata fica vinculada ao projeto e pode ser aberta em Anexos.</w:t>
+        <w:t>•  Campos ausentes são indicados.</w:t>
       </w:r>
     </w:p>
     <w:p>
@@ -8989,16 +8980,7 @@
         <w:ind w:left="403" w:hanging="317"/>
       </w:pPr>
       <w:r>
-        <w:t>•  O projeto muda de Aguardando aprovação do Centro para Submetido, segue à gestão e o token é marcado como utilizado.</w:t>
-      </w:r>
-    </w:p>
-    <w:p>
-      <w:pPr>
-        <w:keepLines/>
-        <w:ind w:left="403" w:hanging="317"/>
-      </w:pPr>
-      <w:r>
-        <w:t>•  O coordenador recebe a notificação prevista.</w:t>
+        <w:t>•  Somente PDF, PNG, JPG ou JPEG são aceitos para a ata.</w:t>
       </w:r>
     </w:p>
     <w:p/>
@@ -9009,7 +8991,7 @@
         <w:keepLines/>
       </w:pPr>
       <w:r>
-        <w:t>CT-CEN-005  Impedir reutilização ou acesso expirado</w:t>
+        <w:t>CT-CEN-004  Registrar a ata e encaminhar à PROPEG</w:t>
       </w:r>
     </w:p>
     <w:p>
@@ -9057,7 +9039,7 @@
         <w:t xml:space="preserve">Pré-condições: </w:t>
       </w:r>
       <w:r>
-        <w:t>Token utilizado no caso anterior ou token expirado.</w:t>
+        <w:t>Link ativo e arquivo de teste disponível.</w:t>
       </w:r>
     </w:p>
     <w:p>
@@ -9079,7 +9061,7 @@
         <w:ind w:left="403" w:hanging="317"/>
       </w:pPr>
       <w:r>
-        <w:t>1.  Abrir novamente o mesmo link.</w:t>
+        <w:t>1.  Informar nome e cargo.</w:t>
       </w:r>
     </w:p>
     <w:p>
@@ -9088,7 +9070,16 @@
         <w:ind w:left="403" w:hanging="317"/>
       </w:pPr>
       <w:r>
-        <w:t>2.  Tentar enviar outra ata.</w:t>
+        <w:t>2.  Selecionar Aprovado, confirmar a deliberação, anexar a ata e enviar.</w:t>
+      </w:r>
+    </w:p>
+    <w:p>
+      <w:pPr>
+        <w:keepLines/>
+        <w:ind w:left="403" w:hanging="317"/>
+      </w:pPr>
+      <w:r>
+        <w:t>3.  Abrir os detalhes do projeto com o coordenador ou gestor e consultar a ata em Anexos.</w:t>
       </w:r>
     </w:p>
     <w:p>
@@ -9110,7 +9101,7 @@
         <w:ind w:left="403" w:hanging="317"/>
       </w:pPr>
       <w:r>
-        <w:t>•  O projeto não é reaberto para alteração.</w:t>
+        <w:t>•  A ata fica vinculada ao projeto e pode ser aberta em Anexos.</w:t>
       </w:r>
     </w:p>
     <w:p>
@@ -9119,7 +9110,16 @@
         <w:ind w:left="403" w:hanging="317"/>
       </w:pPr>
       <w:r>
-        <w:t>•  A página informa que o link foi utilizado, expirou ou foi invalidado.</w:t>
+        <w:t>•  Quando aprovado, o projeto muda de Aguardando deliberação do Centro Acadêmico para Submetido, segue automaticamente à gestão e o token é marcado como utilizado.</w:t>
+      </w:r>
+    </w:p>
+    <w:p>
+      <w:pPr>
+        <w:keepLines/>
+        <w:ind w:left="403" w:hanging="317"/>
+      </w:pPr>
+      <w:r>
+        <w:t>•  O coordenador recebe a notificação prevista.</w:t>
       </w:r>
     </w:p>
     <w:p/>
@@ -9130,7 +9130,7 @@
         <w:keepLines/>
       </w:pPr>
       <w:r>
-        <w:t>CT-CEN-006  Enviar ata quando o navegador informa origem opaca</w:t>
+        <w:t>CT-CEN-005  Impedir reutilização ou acesso expirado</w:t>
       </w:r>
     </w:p>
     <w:p>
@@ -9178,7 +9178,7 @@
         <w:t xml:space="preserve">Pré-condições: </w:t>
       </w:r>
       <w:r>
-        <w:t>Token local válido e cliente configurado para enviar o cabeçalho HTTP Origin: null, sem Referer.</w:t>
+        <w:t>Token utilizado no caso anterior ou token expirado.</w:t>
       </w:r>
     </w:p>
     <w:p>
@@ -9200,7 +9200,7 @@
         <w:ind w:left="403" w:hanging="317"/>
       </w:pPr>
       <w:r>
-        <w:t>1.  Abrir o link público sem autenticação.</w:t>
+        <w:t>1.  Abrir novamente o mesmo link.</w:t>
       </w:r>
     </w:p>
     <w:p>
@@ -9209,16 +9209,7 @@
         <w:ind w:left="403" w:hanging="317"/>
       </w:pPr>
       <w:r>
-        <w:t>2.  Preencher nome, cargo e confirmação, anexar uma ata válida e enviar com Origin: null.</w:t>
-      </w:r>
-    </w:p>
-    <w:p>
-      <w:pPr>
-        <w:keepLines/>
-        <w:ind w:left="403" w:hanging="317"/>
-      </w:pPr>
-      <w:r>
-        <w:t>3.  Reabrir o mesmo link e consultar o projeto no perfil autorizado.</w:t>
+        <w:t>2.  Tentar enviar outra ata.</w:t>
       </w:r>
     </w:p>
     <w:p>
@@ -9240,7 +9231,7 @@
         <w:ind w:left="403" w:hanging="317"/>
       </w:pPr>
       <w:r>
-        <w:t>•  O envio não é recusado pela verificação CSRF.</w:t>
+        <w:t>•  O projeto não é reaberto para alteração.</w:t>
       </w:r>
     </w:p>
     <w:p>
@@ -9249,44 +9240,18 @@
         <w:ind w:left="403" w:hanging="317"/>
       </w:pPr>
       <w:r>
-        <w:t>•  A ata é salva, o token é consumido uma única vez e o projeto passa para Submetido.</w:t>
-      </w:r>
-    </w:p>
-    <w:p>
-      <w:pPr>
-        <w:keepLines/>
-        <w:ind w:left="403" w:hanging="317"/>
-      </w:pPr>
-      <w:r>
-        <w:t>•  O segundo acesso informa que o link está indisponível.</w:t>
+        <w:t>•  A página informa que o link foi utilizado, expirou ou foi invalidado.</w:t>
       </w:r>
     </w:p>
     <w:p/>
     <w:p>
       <w:pPr>
-        <w:pStyle w:val="Heading1"/>
-        <w:keepNext/>
-      </w:pPr>
-      <w:r>
-        <w:t>Casos de teste do gestor</w:t>
-      </w:r>
-    </w:p>
-    <w:p>
-      <w:pPr>
-        <w:keepNext/>
-      </w:pPr>
-      <w:r>
-        <w:t>Validação das rotinas administrativas, de decisão e de auditoria.</w:t>
-      </w:r>
-    </w:p>
-    <w:p>
-      <w:pPr>
         <w:pStyle w:val="Heading3"/>
         <w:keepNext/>
         <w:keepLines/>
       </w:pPr>
       <w:r>
-        <w:t>CT-GES-001  Consultar o painel do gestor</w:t>
+        <w:t>CT-CEN-006  Enviar ata quando o navegador informa origem opaca</w:t>
       </w:r>
     </w:p>
     <w:p>
@@ -9302,7 +9267,7 @@
         <w:t xml:space="preserve">Perfil: </w:t>
       </w:r>
       <w:r>
-        <w:t>Gestor</w:t>
+        <w:t>Responsável do Centro</w:t>
       </w:r>
     </w:p>
     <w:p>
@@ -9334,7 +9299,7 @@
         <w:t xml:space="preserve">Pré-condições: </w:t>
       </w:r>
       <w:r>
-        <w:t>Entrar como Gabriela Costa.</w:t>
+        <w:t>Token local válido e cliente configurado para enviar o cabeçalho HTTP Origin: null, sem Referer.</w:t>
       </w:r>
     </w:p>
     <w:p>
@@ -9356,7 +9321,7 @@
         <w:ind w:left="403" w:hanging="317"/>
       </w:pPr>
       <w:r>
-        <w:t>1.  Abrir o Painel do Gestor.</w:t>
+        <w:t>1.  Abrir o link público sem autenticação.</w:t>
       </w:r>
     </w:p>
     <w:p>
@@ -9365,7 +9330,16 @@
         <w:ind w:left="403" w:hanging="317"/>
       </w:pPr>
       <w:r>
-        <w:t>2.  Conferir métricas e projetos que aguardam ação.</w:t>
+        <w:t>2.  Preencher nome, cargo e confirmação, anexar uma ata válida e enviar com Origin: null.</w:t>
+      </w:r>
+    </w:p>
+    <w:p>
+      <w:pPr>
+        <w:keepLines/>
+        <w:ind w:left="403" w:hanging="317"/>
+      </w:pPr>
+      <w:r>
+        <w:t>3.  Reabrir o mesmo link e consultar o projeto no perfil autorizado.</w:t>
       </w:r>
     </w:p>
     <w:p>
@@ -9387,7 +9361,7 @@
         <w:ind w:left="403" w:hanging="317"/>
       </w:pPr>
       <w:r>
-        <w:t>•  Os totais refletem os dados de amostra em produção.</w:t>
+        <w:t>•  O envio não é recusado pela verificação CSRF.</w:t>
       </w:r>
     </w:p>
     <w:p>
@@ -9396,7 +9370,16 @@
         <w:ind w:left="403" w:hanging="317"/>
       </w:pPr>
       <w:r>
-        <w:t>•  A navegação permite acessar usuários, projetos, relatórios e editais.</w:t>
+        <w:t>•  A ata é salva, o token é consumido uma única vez e o projeto passa para Submetido.</w:t>
+      </w:r>
+    </w:p>
+    <w:p>
+      <w:pPr>
+        <w:keepLines/>
+        <w:ind w:left="403" w:hanging="317"/>
+      </w:pPr>
+      <w:r>
+        <w:t>•  O segundo acesso informa que o link está indisponível.</w:t>
       </w:r>
     </w:p>
     <w:p/>
@@ -9407,7 +9390,7 @@
         <w:keepLines/>
       </w:pPr>
       <w:r>
-        <w:t>CT-GES-002  Pesquisar e consultar usuários</w:t>
+        <w:t>CT-CEN-007  Registrar reprovação pelo Centro Acadêmico</w:t>
       </w:r>
     </w:p>
     <w:p>
@@ -9423,7 +9406,7 @@
         <w:t xml:space="preserve">Perfil: </w:t>
       </w:r>
       <w:r>
-        <w:t>Gestor</w:t>
+        <w:t>Responsável do Centro Gestor</w:t>
       </w:r>
     </w:p>
     <w:p>
@@ -9455,7 +9438,7 @@
         <w:t xml:space="preserve">Pré-condições: </w:t>
       </w:r>
       <w:r>
-        <w:t>Dados de amostra carregados em produção.</w:t>
+        <w:t>Token local válido para um projeto que aguarda deliberação.</w:t>
       </w:r>
     </w:p>
     <w:p>
@@ -9477,7 +9460,7 @@
         <w:ind w:left="403" w:hanging="317"/>
       </w:pPr>
       <w:r>
-        <w:t>1.  Abrir Gerenciar Usuários.</w:t>
+        <w:t>1.  Informar nome e cargo.</w:t>
       </w:r>
     </w:p>
     <w:p>
@@ -9486,7 +9469,7 @@
         <w:ind w:left="403" w:hanging="317"/>
       </w:pPr>
       <w:r>
-        <w:t>2.  Pesquisar por nome, CPF e perfil.</w:t>
+        <w:t>2.  Selecionar Reprovado, confirmar a deliberação e anexar a ata.</w:t>
       </w:r>
     </w:p>
     <w:p>
@@ -9495,7 +9478,7 @@
         <w:ind w:left="403" w:hanging="317"/>
       </w:pPr>
       <w:r>
-        <w:t>3.  Abrir os detalhes de um resultado.</w:t>
+        <w:t>3.  Abrir os detalhes com o gestor e o coordenador.</w:t>
       </w:r>
     </w:p>
     <w:p>
@@ -9517,7 +9500,7 @@
         <w:ind w:left="403" w:hanging="317"/>
       </w:pPr>
       <w:r>
-        <w:t>•  Os filtros retornam usuários compatíveis.</w:t>
+        <w:t>•  O projeto passa para Reprovado e não entra na fila de análise pendente da PROPEG.</w:t>
       </w:r>
     </w:p>
     <w:p>
@@ -9526,18 +9509,35 @@
         <w:ind w:left="403" w:hanging="317"/>
       </w:pPr>
       <w:r>
-        <w:t>•  Detalhes pessoais e institucionais aparecem conforme o cadastro.</w:t>
+        <w:t>•  A ata, o resultado e as notificações ficam registrados; o token não pode ser reutilizado.</w:t>
       </w:r>
     </w:p>
     <w:p/>
     <w:p>
       <w:pPr>
+        <w:pStyle w:val="Heading1"/>
+        <w:keepNext/>
+      </w:pPr>
+      <w:r>
+        <w:t>Casos de teste do gestor</w:t>
+      </w:r>
+    </w:p>
+    <w:p>
+      <w:pPr>
+        <w:keepNext/>
+      </w:pPr>
+      <w:r>
+        <w:t>Validação das rotinas administrativas, de decisão e de auditoria.</w:t>
+      </w:r>
+    </w:p>
+    <w:p>
+      <w:pPr>
         <w:pStyle w:val="Heading3"/>
         <w:keepNext/>
         <w:keepLines/>
       </w:pPr>
       <w:r>
-        <w:t>CT-GES-003  Ativar inativar e editar usuário</w:t>
+        <w:t>CT-GES-001  Consultar o painel do gestor</w:t>
       </w:r>
     </w:p>
     <w:p>
@@ -9585,7 +9585,7 @@
         <w:t xml:space="preserve">Pré-condições: </w:t>
       </w:r>
       <w:r>
-        <w:t>Usuário de amostra selecionado.</w:t>
+        <w:t>Entrar como Gabriela Costa.</w:t>
       </w:r>
     </w:p>
     <w:p>
@@ -9607,7 +9607,7 @@
         <w:ind w:left="403" w:hanging="317"/>
       </w:pPr>
       <w:r>
-        <w:t>1.  Usar a ação de inativar e confirmar.</w:t>
+        <w:t>1.  Abrir o Painel do Gestor.</w:t>
       </w:r>
     </w:p>
     <w:p>
@@ -9616,16 +9616,7 @@
         <w:ind w:left="403" w:hanging="317"/>
       </w:pPr>
       <w:r>
-        <w:t>2.  Tentar login com a conta.</w:t>
-      </w:r>
-    </w:p>
-    <w:p>
-      <w:pPr>
-        <w:keepLines/>
-        <w:ind w:left="403" w:hanging="317"/>
-      </w:pPr>
-      <w:r>
-        <w:t>3.  Reativar e editar os campos permitidos.</w:t>
+        <w:t>2.  Conferir métricas e projetos que aguardam ação.</w:t>
       </w:r>
     </w:p>
     <w:p>
@@ -9647,7 +9638,7 @@
         <w:ind w:left="403" w:hanging="317"/>
       </w:pPr>
       <w:r>
-        <w:t>•  Conta inativa não autentica.</w:t>
+        <w:t>•  Os totais refletem os dados de amostra em produção.</w:t>
       </w:r>
     </w:p>
     <w:p>
@@ -9656,7 +9647,7 @@
         <w:ind w:left="403" w:hanging="317"/>
       </w:pPr>
       <w:r>
-        <w:t>•  A reativação e a edição ficam registradas e o usuário é notificado.</w:t>
+        <w:t>•  A navegação permite acessar usuários, projetos, relatórios e editais.</w:t>
       </w:r>
     </w:p>
     <w:p/>
@@ -9667,7 +9658,7 @@
         <w:keepLines/>
       </w:pPr>
       <w:r>
-        <w:t>CT-GES-004  Excluir usuário sem vínculos e proteger usuário vinculado</w:t>
+        <w:t>CT-GES-002  Pesquisar e consultar usuários</w:t>
       </w:r>
     </w:p>
     <w:p>
@@ -9715,7 +9706,7 @@
         <w:t xml:space="preserve">Pré-condições: </w:t>
       </w:r>
       <w:r>
-        <w:t>Criar uma conta temporária sem projetos; manter os usuários de amostra vinculados.</w:t>
+        <w:t>Dados de amostra carregados em produção.</w:t>
       </w:r>
     </w:p>
     <w:p>
@@ -9737,7 +9728,7 @@
         <w:ind w:left="403" w:hanging="317"/>
       </w:pPr>
       <w:r>
-        <w:t>1.  Excluir a conta temporária após confirmar.</w:t>
+        <w:t>1.  Abrir Gerenciar Usuários.</w:t>
       </w:r>
     </w:p>
     <w:p>
@@ -9746,7 +9737,16 @@
         <w:ind w:left="403" w:hanging="317"/>
       </w:pPr>
       <w:r>
-        <w:t>2.  Tentar excluir coordenador ou aluno com projeto.</w:t>
+        <w:t>2.  Pesquisar por nome, CPF e perfil.</w:t>
+      </w:r>
+    </w:p>
+    <w:p>
+      <w:pPr>
+        <w:keepLines/>
+        <w:ind w:left="403" w:hanging="317"/>
+      </w:pPr>
+      <w:r>
+        <w:t>3.  Abrir os detalhes de um resultado.</w:t>
       </w:r>
     </w:p>
     <w:p>
@@ -9768,7 +9768,7 @@
         <w:ind w:left="403" w:hanging="317"/>
       </w:pPr>
       <w:r>
-        <w:t>•  A conta sem vínculos é excluída.</w:t>
+        <w:t>•  Os filtros retornam usuários compatíveis.</w:t>
       </w:r>
     </w:p>
     <w:p>
@@ -9777,7 +9777,7 @@
         <w:ind w:left="403" w:hanging="317"/>
       </w:pPr>
       <w:r>
-        <w:t>•  Vínculos protegidos impedem exclusão inconsistente e geram orientação.</w:t>
+        <w:t>•  Detalhes pessoais e institucionais aparecem conforme o cadastro.</w:t>
       </w:r>
     </w:p>
     <w:p/>
@@ -9788,7 +9788,7 @@
         <w:keepLines/>
       </w:pPr>
       <w:r>
-        <w:t>CT-GES-005  Analisar detalhes de projeto submetido</w:t>
+        <w:t>CT-GES-003  Ativar inativar e editar usuário</w:t>
       </w:r>
     </w:p>
     <w:p>
@@ -9836,7 +9836,7 @@
         <w:t xml:space="preserve">Pré-condições: </w:t>
       </w:r>
       <w:r>
-        <w:t>Usar Laboratório de Dados para Gestão Universitária.</w:t>
+        <w:t>Usuário de amostra selecionado.</w:t>
       </w:r>
     </w:p>
     <w:p>
@@ -9858,7 +9858,7 @@
         <w:ind w:left="403" w:hanging="317"/>
       </w:pPr>
       <w:r>
-        <w:t>1.  Abrir os detalhes.</w:t>
+        <w:t>1.  Usar a ação de inativar e confirmar.</w:t>
       </w:r>
     </w:p>
     <w:p>
@@ -9867,7 +9867,16 @@
         <w:ind w:left="403" w:hanging="317"/>
       </w:pPr>
       <w:r>
-        <w:t>2.  Conferir tipo, edital, conteúdo, equipe, ODS, anexos e auditoria.</w:t>
+        <w:t>2.  Tentar login com a conta.</w:t>
+      </w:r>
+    </w:p>
+    <w:p>
+      <w:pPr>
+        <w:keepLines/>
+        <w:ind w:left="403" w:hanging="317"/>
+      </w:pPr>
+      <w:r>
+        <w:t>3.  Reativar e editar os campos permitidos.</w:t>
       </w:r>
     </w:p>
     <w:p>
@@ -9889,7 +9898,7 @@
         <w:ind w:left="403" w:hanging="317"/>
       </w:pPr>
       <w:r>
-        <w:t>•  Todas as informações necessárias à decisão estão disponíveis.</w:t>
+        <w:t>•  Conta inativa não autentica.</w:t>
       </w:r>
     </w:p>
     <w:p>
@@ -9898,7 +9907,7 @@
         <w:ind w:left="403" w:hanging="317"/>
       </w:pPr>
       <w:r>
-        <w:t>•  O edital e o total de submissões podem ser consultados.</w:t>
+        <w:t>•  A reativação e a edição ficam registradas e o usuário é notificado.</w:t>
       </w:r>
     </w:p>
     <w:p/>
@@ -9909,7 +9918,7 @@
         <w:keepLines/>
       </w:pPr>
       <w:r>
-        <w:t>CT-GES-006  Aprovar projeto</w:t>
+        <w:t>CT-GES-004  Excluir usuário sem vínculos e proteger usuário vinculado</w:t>
       </w:r>
     </w:p>
     <w:p>
@@ -9957,7 +9966,7 @@
         <w:t xml:space="preserve">Pré-condições: </w:t>
       </w:r>
       <w:r>
-        <w:t>Projeto submetido sem pendências.</w:t>
+        <w:t>Criar uma conta temporária sem projetos; manter os usuários de amostra vinculados.</w:t>
       </w:r>
     </w:p>
     <w:p>
@@ -9979,7 +9988,7 @@
         <w:ind w:left="403" w:hanging="317"/>
       </w:pPr>
       <w:r>
-        <w:t>1.  Clicar em Aprovar.</w:t>
+        <w:t>1.  Excluir a conta temporária após confirmar.</w:t>
       </w:r>
     </w:p>
     <w:p>
@@ -9988,7 +9997,7 @@
         <w:ind w:left="403" w:hanging="317"/>
       </w:pPr>
       <w:r>
-        <w:t>2.  Ler o apoio de confirmação e confirmar.</w:t>
+        <w:t>2.  Tentar excluir coordenador ou aluno com projeto.</w:t>
       </w:r>
     </w:p>
     <w:p>
@@ -10010,7 +10019,7 @@
         <w:ind w:left="403" w:hanging="317"/>
       </w:pPr>
       <w:r>
-        <w:t>•  O status muda para Aprovado.</w:t>
+        <w:t>•  A conta sem vínculos é excluída.</w:t>
       </w:r>
     </w:p>
     <w:p>
@@ -10019,7 +10028,7 @@
         <w:ind w:left="403" w:hanging="317"/>
       </w:pPr>
       <w:r>
-        <w:t>•  Coordenador recebe notificação interna e e-mail.</w:t>
+        <w:t>•  Vínculos protegidos impedem exclusão inconsistente e geram orientação.</w:t>
       </w:r>
     </w:p>
     <w:p/>
@@ -10030,7 +10039,7 @@
         <w:keepLines/>
       </w:pPr>
       <w:r>
-        <w:t>CT-GES-007  Reprovar projeto e permitir ressubmissão</w:t>
+        <w:t>CT-GES-005  Analisar detalhes de projeto submetido</w:t>
       </w:r>
     </w:p>
     <w:p>
@@ -10046,7 +10055,7 @@
         <w:t xml:space="preserve">Perfil: </w:t>
       </w:r>
       <w:r>
-        <w:t>Gestor Coordenador</w:t>
+        <w:t>Gestor</w:t>
       </w:r>
     </w:p>
     <w:p>
@@ -10078,7 +10087,7 @@
         <w:t xml:space="preserve">Pré-condições: </w:t>
       </w:r>
       <w:r>
-        <w:t>Projeto submetido.</w:t>
+        <w:t>Usar Laboratório de Dados para Gestão Universitária.</w:t>
       </w:r>
     </w:p>
     <w:p>
@@ -10100,7 +10109,7 @@
         <w:ind w:left="403" w:hanging="317"/>
       </w:pPr>
       <w:r>
-        <w:t>1.  Reprovar e informar a justificativa, quando solicitada.</w:t>
+        <w:t>1.  Abrir os detalhes.</w:t>
       </w:r>
     </w:p>
     <w:p>
@@ -10109,16 +10118,7 @@
         <w:ind w:left="403" w:hanging="317"/>
       </w:pPr>
       <w:r>
-        <w:t>2.  Entrar como coordenador e abrir o projeto.</w:t>
-      </w:r>
-    </w:p>
-    <w:p>
-      <w:pPr>
-        <w:keepLines/>
-        <w:ind w:left="403" w:hanging="317"/>
-      </w:pPr>
-      <w:r>
-        <w:t>3.  Editar e ressubmeter.</w:t>
+        <w:t>2.  Conferir tipo, edital, conteúdo, equipe, ODS, anexos e auditoria.</w:t>
       </w:r>
     </w:p>
     <w:p>
@@ -10140,7 +10140,7 @@
         <w:ind w:left="403" w:hanging="317"/>
       </w:pPr>
       <w:r>
-        <w:t>•  O status muda para Reprovado e o coordenador é notificado.</w:t>
+        <w:t>•  Todas as informações necessárias à decisão estão disponíveis.</w:t>
       </w:r>
     </w:p>
     <w:p>
@@ -10149,7 +10149,7 @@
         <w:ind w:left="403" w:hanging="317"/>
       </w:pPr>
       <w:r>
-        <w:t>•  O coordenador consegue corrigir e reenviar o projeto.</w:t>
+        <w:t>•  O edital e o total de submissões podem ser consultados.</w:t>
       </w:r>
     </w:p>
     <w:p/>
@@ -10160,7 +10160,7 @@
         <w:keepLines/>
       </w:pPr>
       <w:r>
-        <w:t>CT-GES-008  Bloquear aprovação com ética pendente</w:t>
+        <w:t>CT-GES-006  Aprovar projeto</w:t>
       </w:r>
     </w:p>
     <w:p>
@@ -10208,7 +10208,7 @@
         <w:t xml:space="preserve">Pré-condições: </w:t>
       </w:r>
       <w:r>
-        <w:t>Usar Saúde Mental e Permanência Estudantil.</w:t>
+        <w:t>Projeto submetido sem pendências.</w:t>
       </w:r>
     </w:p>
     <w:p>
@@ -10230,7 +10230,7 @@
         <w:ind w:left="403" w:hanging="317"/>
       </w:pPr>
       <w:r>
-        <w:t>1.  Observar o alerta visual de pendência.</w:t>
+        <w:t>1.  Clicar em Aprovar.</w:t>
       </w:r>
     </w:p>
     <w:p>
@@ -10239,7 +10239,7 @@
         <w:ind w:left="403" w:hanging="317"/>
       </w:pPr>
       <w:r>
-        <w:t>2.  Tentar aprovar ou iniciar o fluxo sem o comprovante definitivo.</w:t>
+        <w:t>2.  Ler o apoio de confirmação e confirmar.</w:t>
       </w:r>
     </w:p>
     <w:p>
@@ -10261,7 +10261,7 @@
         <w:ind w:left="403" w:hanging="317"/>
       </w:pPr>
       <w:r>
-        <w:t>•  A pendência é destacada nos detalhes.</w:t>
+        <w:t>•  O status muda para Aprovado.</w:t>
       </w:r>
     </w:p>
     <w:p>
@@ -10270,7 +10270,7 @@
         <w:ind w:left="403" w:hanging="317"/>
       </w:pPr>
       <w:r>
-        <w:t>•  A ação é bloqueada até a aprovação ética ser anexada.</w:t>
+        <w:t>•  Coordenador recebe notificação interna e e-mail.</w:t>
       </w:r>
     </w:p>
     <w:p/>
@@ -10281,7 +10281,7 @@
         <w:keepLines/>
       </w:pPr>
       <w:r>
-        <w:t>CT-GES-009  Corrigir dados do projeto e validar auditoria</w:t>
+        <w:t>CT-GES-007  Reprovar projeto e permitir ressubmissão</w:t>
       </w:r>
     </w:p>
     <w:p>
@@ -10297,7 +10297,7 @@
         <w:t xml:space="preserve">Perfil: </w:t>
       </w:r>
       <w:r>
-        <w:t>Gestor</w:t>
+        <w:t>Gestor Coordenador</w:t>
       </w:r>
     </w:p>
     <w:p>
@@ -10329,7 +10329,7 @@
         <w:t xml:space="preserve">Pré-condições: </w:t>
       </w:r>
       <w:r>
-        <w:t>Projeto existente selecionado.</w:t>
+        <w:t>Projeto submetido.</w:t>
       </w:r>
     </w:p>
     <w:p>
@@ -10351,7 +10351,7 @@
         <w:ind w:left="403" w:hanging="317"/>
       </w:pPr>
       <w:r>
-        <w:t>1.  Abrir Editar Projeto.</w:t>
+        <w:t>1.  Reprovar e informar a justificativa, quando solicitada.</w:t>
       </w:r>
     </w:p>
     <w:p>
@@ -10360,7 +10360,7 @@
         <w:ind w:left="403" w:hanging="317"/>
       </w:pPr>
       <w:r>
-        <w:t>2.  Alterar um campo e substituir ou remover um documento.</w:t>
+        <w:t>2.  Entrar como coordenador e abrir o projeto.</w:t>
       </w:r>
     </w:p>
     <w:p>
@@ -10369,7 +10369,7 @@
         <w:ind w:left="403" w:hanging="317"/>
       </w:pPr>
       <w:r>
-        <w:t>3.  Salvar e voltar aos detalhes.</w:t>
+        <w:t>3.  Editar e ressubmeter.</w:t>
       </w:r>
     </w:p>
     <w:p>
@@ -10391,7 +10391,7 @@
         <w:ind w:left="403" w:hanging="317"/>
       </w:pPr>
       <w:r>
-        <w:t>•  A correção é persistida.</w:t>
+        <w:t>•  O status muda para Reprovado e o coordenador é notificado.</w:t>
       </w:r>
     </w:p>
     <w:p>
@@ -10400,7 +10400,7 @@
         <w:ind w:left="403" w:hanging="317"/>
       </w:pPr>
       <w:r>
-        <w:t>•  Data, hora e nome do gestor da última alteração aparecem visualmente.</w:t>
+        <w:t>•  O coordenador consegue corrigir e reenviar o projeto.</w:t>
       </w:r>
     </w:p>
     <w:p/>
@@ -10411,7 +10411,7 @@
         <w:keepLines/>
       </w:pPr>
       <w:r>
-        <w:t>CT-GES-010  Cadastrar projeto existente</w:t>
+        <w:t>CT-GES-008  Bloquear aprovação com ética pendente</w:t>
       </w:r>
     </w:p>
     <w:p>
@@ -10459,7 +10459,7 @@
         <w:t xml:space="preserve">Pré-condições: </w:t>
       </w:r>
       <w:r>
-        <w:t>Dados do projeto e coordenador disponíveis.</w:t>
+        <w:t>Usar Saúde Mental e Permanência Estudantil.</w:t>
       </w:r>
     </w:p>
     <w:p>
@@ -10481,7 +10481,7 @@
         <w:ind w:left="403" w:hanging="317"/>
       </w:pPr>
       <w:r>
-        <w:t>1.  Abrir Cadastrar Projeto Existente.</w:t>
+        <w:t>1.  Observar o alerta visual de pendência.</w:t>
       </w:r>
     </w:p>
     <w:p>
@@ -10490,16 +10490,7 @@
         <w:ind w:left="403" w:hanging="317"/>
       </w:pPr>
       <w:r>
-        <w:t>2.  Selecionar coordenador e percorrer todas as etapas.</w:t>
-      </w:r>
-    </w:p>
-    <w:p>
-      <w:pPr>
-        <w:keepLines/>
-        <w:ind w:left="403" w:hanging="317"/>
-      </w:pPr>
-      <w:r>
-        <w:t>3.  Informar a situação atual e concluir.</w:t>
+        <w:t>2.  Tentar aprovar ou iniciar o fluxo sem o comprovante definitivo.</w:t>
       </w:r>
     </w:p>
     <w:p>
@@ -10521,7 +10512,7 @@
         <w:ind w:left="403" w:hanging="317"/>
       </w:pPr>
       <w:r>
-        <w:t>•  O registro histórico é criado com todos os dados.</w:t>
+        <w:t>•  A pendência é destacada nos detalhes.</w:t>
       </w:r>
     </w:p>
     <w:p>
@@ -10530,7 +10521,7 @@
         <w:ind w:left="403" w:hanging="317"/>
       </w:pPr>
       <w:r>
-        <w:t>•  O projeto aparece no histórico com indicação de importação legada.</w:t>
+        <w:t>•  A ação é bloqueada até a aprovação ética ser anexada.</w:t>
       </w:r>
     </w:p>
     <w:p/>
@@ -10541,7 +10532,7 @@
         <w:keepLines/>
       </w:pPr>
       <w:r>
-        <w:t>CT-GES-011  Filtrar e ordenar o histórico de projetos</w:t>
+        <w:t>CT-GES-009  Corrigir dados do projeto e validar auditoria</w:t>
       </w:r>
     </w:p>
     <w:p>
@@ -10589,7 +10580,7 @@
         <w:t xml:space="preserve">Pré-condições: </w:t>
       </w:r>
       <w:r>
-        <w:t>Dados de amostra carregados em produção.</w:t>
+        <w:t>Projeto existente selecionado.</w:t>
       </w:r>
     </w:p>
     <w:p>
@@ -10611,7 +10602,7 @@
         <w:ind w:left="403" w:hanging="317"/>
       </w:pPr>
       <w:r>
-        <w:t>1.  Combinar busca textual, status, centro, curso, datas, tipo e múltiplos ODS.</w:t>
+        <w:t>1.  Abrir Editar Projeto.</w:t>
       </w:r>
     </w:p>
     <w:p>
@@ -10620,7 +10611,7 @@
         <w:ind w:left="403" w:hanging="317"/>
       </w:pPr>
       <w:r>
-        <w:t>2.  Testar o modo Todas as ODS (AND) e depois Qualquer ODS (OR).</w:t>
+        <w:t>2.  Alterar um campo e substituir ou remover um documento.</w:t>
       </w:r>
     </w:p>
     <w:p>
@@ -10629,7 +10620,7 @@
         <w:ind w:left="403" w:hanging="317"/>
       </w:pPr>
       <w:r>
-        <w:t>3.  Alterar ordenação e itens por página.</w:t>
+        <w:t>3.  Salvar e voltar aos detalhes.</w:t>
       </w:r>
     </w:p>
     <w:p>
@@ -10651,7 +10642,7 @@
         <w:ind w:left="403" w:hanging="317"/>
       </w:pPr>
       <w:r>
-        <w:t>•  Filtros são combinados sem perder parâmetros na paginação; AND exige todas as ODS e OR aceita qualquer uma.</w:t>
+        <w:t>•  A correção é persistida.</w:t>
       </w:r>
     </w:p>
     <w:p>
@@ -10660,7 +10651,7 @@
         <w:ind w:left="403" w:hanging="317"/>
       </w:pPr>
       <w:r>
-        <w:t>•  A tabela e os totais correspondem aos critérios escolhidos.</w:t>
+        <w:t>•  Data, hora e nome do gestor da última alteração aparecem visualmente.</w:t>
       </w:r>
     </w:p>
     <w:p/>
@@ -10671,7 +10662,7 @@
         <w:keepLines/>
       </w:pPr>
       <w:r>
-        <w:t>CT-GES-012  Exportar o histórico em PDF</w:t>
+        <w:t>CT-GES-010  Cadastrar projeto existente</w:t>
       </w:r>
     </w:p>
     <w:p>
@@ -10719,7 +10710,7 @@
         <w:t xml:space="preserve">Pré-condições: </w:t>
       </w:r>
       <w:r>
-        <w:t>Aplicar um conjunto de filtros no histórico.</w:t>
+        <w:t>Dados do projeto e coordenador disponíveis.</w:t>
       </w:r>
     </w:p>
     <w:p>
@@ -10741,7 +10732,7 @@
         <w:ind w:left="403" w:hanging="317"/>
       </w:pPr>
       <w:r>
-        <w:t>1.  Acionar a exportação em PDF.</w:t>
+        <w:t>1.  Abrir Cadastrar Projeto Existente e confirmar que a Etapa 1 aparece diretamente.</w:t>
       </w:r>
     </w:p>
     <w:p>
@@ -10750,7 +10741,25 @@
         <w:ind w:left="403" w:hanging="317"/>
       </w:pPr>
       <w:r>
-        <w:t>2.  Comparar resultados com a tela.</w:t>
+        <w:t>2.  Testar a seleção de um coordenador cadastrado.</w:t>
+      </w:r>
+    </w:p>
+    <w:p>
+      <w:pPr>
+        <w:keepLines/>
+        <w:ind w:left="403" w:hanging="317"/>
+      </w:pPr>
+      <w:r>
+        <w:t>3.  Iniciar outro cadastro, escolher coordenador não cadastrado e informar nome, CPF e e-mail.</w:t>
+      </w:r>
+    </w:p>
+    <w:p>
+      <w:pPr>
+        <w:keepLines/>
+        <w:ind w:left="403" w:hanging="317"/>
+      </w:pPr>
+      <w:r>
+        <w:t>4.  Percorrer as etapas, informar a situação atual e concluir.</w:t>
       </w:r>
     </w:p>
     <w:p>
@@ -10772,7 +10781,7 @@
         <w:ind w:left="403" w:hanging="317"/>
       </w:pPr>
       <w:r>
-        <w:t>•  O PDF é gerado sem erro.</w:t>
+        <w:t>•  Não existe uma tela intermediária para escolher coordenador.</w:t>
       </w:r>
     </w:p>
     <w:p>
@@ -10781,7 +10790,7 @@
         <w:ind w:left="403" w:hanging="317"/>
       </w:pPr>
       <w:r>
-        <w:t>•  Projetos e filtros relevantes correspondem à consulta exibida.</w:t>
+        <w:t>•  As duas origens de coordenador são aceitas e o registro histórico aparece com os dados e a indicação de importação legada.</w:t>
       </w:r>
     </w:p>
     <w:p/>
@@ -10792,7 +10801,7 @@
         <w:keepLines/>
       </w:pPr>
       <w:r>
-        <w:t>CT-GES-013  Criar editar publicar e fechar edital</w:t>
+        <w:t>CT-GES-011  Filtrar e ordenar o histórico de projetos</w:t>
       </w:r>
     </w:p>
     <w:p>
@@ -10840,7 +10849,7 @@
         <w:t xml:space="preserve">Pré-condições: </w:t>
       </w:r>
       <w:r>
-        <w:t>Dados de edital e PDF opcional disponíveis.</w:t>
+        <w:t>Dados de amostra carregados em produção.</w:t>
       </w:r>
     </w:p>
     <w:p>
@@ -10862,7 +10871,7 @@
         <w:ind w:left="403" w:hanging="317"/>
       </w:pPr>
       <w:r>
-        <w:t>1.  Criar edital como rascunho.</w:t>
+        <w:t>1.  Combinar busca textual, status, centro, curso, datas, tipo e múltiplos ODS.</w:t>
       </w:r>
     </w:p>
     <w:p>
@@ -10871,7 +10880,7 @@
         <w:ind w:left="403" w:hanging="317"/>
       </w:pPr>
       <w:r>
-        <w:t>2.  Editar e publicar.</w:t>
+        <w:t>2.  Testar o modo Todas as ODS (AND) e depois Qualquer ODS (OR).</w:t>
       </w:r>
     </w:p>
     <w:p>
@@ -10880,7 +10889,7 @@
         <w:ind w:left="403" w:hanging="317"/>
       </w:pPr>
       <w:r>
-        <w:t>3.  Fechar e reabrir usando a ação confirmada.</w:t>
+        <w:t>3.  Alterar ordenação e itens por página.</w:t>
       </w:r>
     </w:p>
     <w:p>
@@ -10902,7 +10911,7 @@
         <w:ind w:left="403" w:hanging="317"/>
       </w:pPr>
       <w:r>
-        <w:t>•  Status e período de submissão são respeitados.</w:t>
+        <w:t>•  Filtros são combinados sem perder parâmetros na paginação; AND exige todas as ODS e OR aceita qualquer uma.</w:t>
       </w:r>
     </w:p>
     <w:p>
@@ -10911,7 +10920,7 @@
         <w:ind w:left="403" w:hanging="317"/>
       </w:pPr>
       <w:r>
-        <w:t>•  Somente editais abertos aparecem para novos projetos UFAC com financiamento.</w:t>
+        <w:t>•  A tabela e os totais correspondem aos critérios escolhidos.</w:t>
       </w:r>
     </w:p>
     <w:p/>
@@ -10922,7 +10931,7 @@
         <w:keepLines/>
       </w:pPr>
       <w:r>
-        <w:t>CT-GES-014  Gerenciar adendos e documentos de edital</w:t>
+        <w:t>CT-GES-012  Exportar o histórico em PDF</w:t>
       </w:r>
     </w:p>
     <w:p>
@@ -10970,7 +10979,7 @@
         <w:t xml:space="preserve">Pré-condições: </w:t>
       </w:r>
       <w:r>
-        <w:t>Edital existente.</w:t>
+        <w:t>Aplicar um conjunto de filtros no histórico.</w:t>
       </w:r>
     </w:p>
     <w:p>
@@ -10992,7 +11001,7 @@
         <w:ind w:left="403" w:hanging="317"/>
       </w:pPr>
       <w:r>
-        <w:t>1.  Adicionar um adendo com descrição e arquivo.</w:t>
+        <w:t>1.  Acionar a exportação em PDF.</w:t>
       </w:r>
     </w:p>
     <w:p>
@@ -11001,16 +11010,7 @@
         <w:ind w:left="403" w:hanging="317"/>
       </w:pPr>
       <w:r>
-        <w:t>2.  Abrir o edital como coordenador.</w:t>
-      </w:r>
-    </w:p>
-    <w:p>
-      <w:pPr>
-        <w:keepLines/>
-        <w:ind w:left="403" w:hanging="317"/>
-      </w:pPr>
-      <w:r>
-        <w:t>3.  Excluir o adendo após confirmação.</w:t>
+        <w:t>2.  Comparar resultados com a tela.</w:t>
       </w:r>
     </w:p>
     <w:p>
@@ -11032,7 +11032,7 @@
         <w:ind w:left="403" w:hanging="317"/>
       </w:pPr>
       <w:r>
-        <w:t>•  O adendo fica disponível durante sua existência.</w:t>
+        <w:t>•  O PDF é gerado sem erro.</w:t>
       </w:r>
     </w:p>
     <w:p>
@@ -11041,7 +11041,7 @@
         <w:ind w:left="403" w:hanging="317"/>
       </w:pPr>
       <w:r>
-        <w:t>•  A exclusão remove apenas o adendo selecionado.</w:t>
+        <w:t>•  Projetos e filtros relevantes correspondem à consulta exibida.</w:t>
       </w:r>
     </w:p>
     <w:p/>
@@ -11052,7 +11052,7 @@
         <w:keepLines/>
       </w:pPr>
       <w:r>
-        <w:t>CT-GES-015  Consultar quantidade de projetos por edital</w:t>
+        <w:t>CT-GES-013  Criar editar publicar e fechar edital</w:t>
       </w:r>
     </w:p>
     <w:p>
@@ -11100,7 +11100,7 @@
         <w:t xml:space="preserve">Pré-condições: </w:t>
       </w:r>
       <w:r>
-        <w:t>Edital DEMO nº 1 possui projetos vinculados.</w:t>
+        <w:t>Dados de edital e PDF opcional disponíveis.</w:t>
       </w:r>
     </w:p>
     <w:p>
@@ -11122,7 +11122,7 @@
         <w:ind w:left="403" w:hanging="317"/>
       </w:pPr>
       <w:r>
-        <w:t>1.  Abrir a lista e os detalhes do edital.</w:t>
+        <w:t>1.  Criar edital como rascunho.</w:t>
       </w:r>
     </w:p>
     <w:p>
@@ -11131,7 +11131,16 @@
         <w:ind w:left="403" w:hanging="317"/>
       </w:pPr>
       <w:r>
-        <w:t>2.  Verificar total de projetos submetidos e acessar a relação.</w:t>
+        <w:t>2.  Editar e publicar.</w:t>
+      </w:r>
+    </w:p>
+    <w:p>
+      <w:pPr>
+        <w:keepLines/>
+        <w:ind w:left="403" w:hanging="317"/>
+      </w:pPr>
+      <w:r>
+        <w:t>3.  Fechar e reabrir usando a ação confirmada.</w:t>
       </w:r>
     </w:p>
     <w:p>
@@ -11153,7 +11162,7 @@
         <w:ind w:left="403" w:hanging="317"/>
       </w:pPr>
       <w:r>
-        <w:t>•  O total é exibido de forma clara.</w:t>
+        <w:t>•  Status e período de submissão são respeitados.</w:t>
       </w:r>
     </w:p>
     <w:p>
@@ -11162,7 +11171,7 @@
         <w:ind w:left="403" w:hanging="317"/>
       </w:pPr>
       <w:r>
-        <w:t>•  A contagem considera projetos UFAC com financiamento vinculados ao edital.</w:t>
+        <w:t>•  Somente editais abertos aparecem para novos projetos UFAC com financiamento.</w:t>
       </w:r>
     </w:p>
     <w:p/>
@@ -11173,7 +11182,7 @@
         <w:keepLines/>
       </w:pPr>
       <w:r>
-        <w:t>CT-GES-016  Acompanhar relatórios de projetos</w:t>
+        <w:t>CT-GES-014  Gerenciar adendos e documentos de edital</w:t>
       </w:r>
     </w:p>
     <w:p>
@@ -11221,7 +11230,7 @@
         <w:t xml:space="preserve">Pré-condições: </w:t>
       </w:r>
       <w:r>
-        <w:t>Projeto com relatório parcial ou final.</w:t>
+        <w:t>Edital existente.</w:t>
       </w:r>
     </w:p>
     <w:p>
@@ -11243,7 +11252,7 @@
         <w:ind w:left="403" w:hanging="317"/>
       </w:pPr>
       <w:r>
-        <w:t>1.  Abrir Relatórios.</w:t>
+        <w:t>1.  Adicionar um adendo com descrição e arquivo.</w:t>
       </w:r>
     </w:p>
     <w:p>
@@ -11252,7 +11261,16 @@
         <w:ind w:left="403" w:hanging="317"/>
       </w:pPr>
       <w:r>
-        <w:t>2.  Filtrar e abrir um relatório com evidências.</w:t>
+        <w:t>2.  Abrir o edital como coordenador.</w:t>
+      </w:r>
+    </w:p>
+    <w:p>
+      <w:pPr>
+        <w:keepLines/>
+        <w:ind w:left="403" w:hanging="317"/>
+      </w:pPr>
+      <w:r>
+        <w:t>3.  Excluir o adendo após confirmação.</w:t>
       </w:r>
     </w:p>
     <w:p>
@@ -11274,7 +11292,7 @@
         <w:ind w:left="403" w:hanging="317"/>
       </w:pPr>
       <w:r>
-        <w:t>•  O gestor visualiza responsável, projeto, tipo, data e arquivos.</w:t>
+        <w:t>•  O adendo fica disponível durante sua existência.</w:t>
       </w:r>
     </w:p>
     <w:p>
@@ -11283,7 +11301,7 @@
         <w:ind w:left="403" w:hanging="317"/>
       </w:pPr>
       <w:r>
-        <w:t>•  Evidências permanecem acessíveis.</w:t>
+        <w:t>•  A exclusão remove apenas o adendo selecionado.</w:t>
       </w:r>
     </w:p>
     <w:p/>
@@ -11294,7 +11312,7 @@
         <w:keepLines/>
       </w:pPr>
       <w:r>
-        <w:t>CT-GES-017  Distinguir Finalizado de Encerrado</w:t>
+        <w:t>CT-GES-015  Consultar quantidade de projetos por edital</w:t>
       </w:r>
     </w:p>
     <w:p>
@@ -11342,7 +11360,7 @@
         <w:t xml:space="preserve">Pré-condições: </w:t>
       </w:r>
       <w:r>
-        <w:t>Usar os dois projetos finais da base.</w:t>
+        <w:t>Edital DEMO nº 1 possui projetos vinculados.</w:t>
       </w:r>
     </w:p>
     <w:p>
@@ -11364,7 +11382,7 @@
         <w:ind w:left="403" w:hanging="317"/>
       </w:pPr>
       <w:r>
-        <w:t>1.  Abrir Monitoramento da Biodiversidade no Campus.</w:t>
+        <w:t>1.  Abrir a lista e os detalhes do edital.</w:t>
       </w:r>
     </w:p>
     <w:p>
@@ -11373,16 +11391,7 @@
         <w:ind w:left="403" w:hanging="317"/>
       </w:pPr>
       <w:r>
-        <w:t>2.  Abrir Educação Ambiental em Escolas Públicas.</w:t>
-      </w:r>
-    </w:p>
-    <w:p>
-      <w:pPr>
-        <w:keepLines/>
-        <w:ind w:left="403" w:hanging="317"/>
-      </w:pPr>
-      <w:r>
-        <w:t>3.  Comparar status, datas e motivo.</w:t>
+        <w:t>2.  Verificar total de projetos submetidos e acessar a relação.</w:t>
       </w:r>
     </w:p>
     <w:p>
@@ -11404,7 +11413,7 @@
         <w:ind w:left="403" w:hanging="317"/>
       </w:pPr>
       <w:r>
-        <w:t>•  Finalizado representa conclusão com êxito.</w:t>
+        <w:t>•  O total é exibido de forma clara.</w:t>
       </w:r>
     </w:p>
     <w:p>
@@ -11413,35 +11422,18 @@
         <w:ind w:left="403" w:hanging="317"/>
       </w:pPr>
       <w:r>
-        <w:t>•  Encerrado sem conclusão exibe o motivo e o gestor responsável.</w:t>
+        <w:t>•  A contagem considera projetos UFAC com financiamento vinculados ao edital.</w:t>
       </w:r>
     </w:p>
     <w:p/>
     <w:p>
       <w:pPr>
-        <w:pStyle w:val="Heading1"/>
-        <w:keepNext/>
-      </w:pPr>
-      <w:r>
-        <w:t>Casos de teste do aluno</w:t>
-      </w:r>
-    </w:p>
-    <w:p>
-      <w:pPr>
-        <w:keepNext/>
-      </w:pPr>
-      <w:r>
-        <w:t>Validação do acompanhamento e das restrições do perfil discente.</w:t>
-      </w:r>
-    </w:p>
-    <w:p>
-      <w:pPr>
         <w:pStyle w:val="Heading3"/>
         <w:keepNext/>
         <w:keepLines/>
       </w:pPr>
       <w:r>
-        <w:t>CT-ALU-001  Consultar painel do aluno</w:t>
+        <w:t>CT-GES-016  Acompanhar relatórios de projetos</w:t>
       </w:r>
     </w:p>
     <w:p>
@@ -11457,7 +11449,7 @@
         <w:t xml:space="preserve">Perfil: </w:t>
       </w:r>
       <w:r>
-        <w:t>Aluno</w:t>
+        <w:t>Gestor</w:t>
       </w:r>
     </w:p>
     <w:p>
@@ -11489,7 +11481,7 @@
         <w:t xml:space="preserve">Pré-condições: </w:t>
       </w:r>
       <w:r>
-        <w:t>Entrar como Diego Alves.</w:t>
+        <w:t>Projeto com relatório parcial ou final.</w:t>
       </w:r>
     </w:p>
     <w:p>
@@ -11511,7 +11503,7 @@
         <w:ind w:left="403" w:hanging="317"/>
       </w:pPr>
       <w:r>
-        <w:t>1.  Abrir Tela Principal e Meus Projetos.</w:t>
+        <w:t>1.  Abrir Relatórios.</w:t>
       </w:r>
     </w:p>
     <w:p>
@@ -11520,7 +11512,7 @@
         <w:ind w:left="403" w:hanging="317"/>
       </w:pPr>
       <w:r>
-        <w:t>2.  Comparar a lista com as participações da base.</w:t>
+        <w:t>2.  Filtrar e abrir um relatório com evidências.</w:t>
       </w:r>
     </w:p>
     <w:p>
@@ -11542,7 +11534,7 @@
         <w:ind w:left="403" w:hanging="317"/>
       </w:pPr>
       <w:r>
-        <w:t>•  Somente projetos em que Diego integra a equipe aparecem.</w:t>
+        <w:t>•  O gestor visualiza responsável, projeto, tipo, data e arquivos.</w:t>
       </w:r>
     </w:p>
     <w:p>
@@ -11551,7 +11543,7 @@
         <w:ind w:left="403" w:hanging="317"/>
       </w:pPr>
       <w:r>
-        <w:t>•  Status e coordenador são exibidos corretamente.</w:t>
+        <w:t>•  Evidências permanecem acessíveis.</w:t>
       </w:r>
     </w:p>
     <w:p/>
@@ -11562,7 +11554,7 @@
         <w:keepLines/>
       </w:pPr>
       <w:r>
-        <w:t>CT-ALU-002  Visualizar detalhes permitidos</w:t>
+        <w:t>CT-GES-017  Distinguir Finalizado de Encerrado</w:t>
       </w:r>
     </w:p>
     <w:p>
@@ -11578,7 +11570,7 @@
         <w:t xml:space="preserve">Perfil: </w:t>
       </w:r>
       <w:r>
-        <w:t>Aluno</w:t>
+        <w:t>Gestor</w:t>
       </w:r>
     </w:p>
     <w:p>
@@ -11610,7 +11602,7 @@
         <w:t xml:space="preserve">Pré-condições: </w:t>
       </w:r>
       <w:r>
-        <w:t>Aluno vinculado a projeto.</w:t>
+        <w:t>Usar os dois projetos finais da base.</w:t>
       </w:r>
     </w:p>
     <w:p>
@@ -11632,7 +11624,7 @@
         <w:ind w:left="403" w:hanging="317"/>
       </w:pPr>
       <w:r>
-        <w:t>1.  Abrir um projeto da lista.</w:t>
+        <w:t>1.  Abrir Monitoramento da Biodiversidade no Campus.</w:t>
       </w:r>
     </w:p>
     <w:p>
@@ -11641,7 +11633,16 @@
         <w:ind w:left="403" w:hanging="317"/>
       </w:pPr>
       <w:r>
-        <w:t>2.  Conferir resumo, objetivo, equipe e ODS.</w:t>
+        <w:t>2.  Abrir Educação Ambiental em Escolas Públicas.</w:t>
+      </w:r>
+    </w:p>
+    <w:p>
+      <w:pPr>
+        <w:keepLines/>
+        <w:ind w:left="403" w:hanging="317"/>
+      </w:pPr>
+      <w:r>
+        <w:t>3.  Comparar status, datas e motivo.</w:t>
       </w:r>
     </w:p>
     <w:p>
@@ -11663,7 +11664,7 @@
         <w:ind w:left="403" w:hanging="317"/>
       </w:pPr>
       <w:r>
-        <w:t>•  A visualização simplificada contém informações pertinentes.</w:t>
+        <w:t>•  Finalizado representa conclusão com êxito.</w:t>
       </w:r>
     </w:p>
     <w:p>
@@ -11672,18 +11673,35 @@
         <w:ind w:left="403" w:hanging="317"/>
       </w:pPr>
       <w:r>
-        <w:t>•  Dados administrativos restritos e ações de edição não aparecem.</w:t>
+        <w:t>•  Encerrado sem conclusão exibe o motivo e o gestor responsável.</w:t>
       </w:r>
     </w:p>
     <w:p/>
     <w:p>
       <w:pPr>
+        <w:pStyle w:val="Heading1"/>
+        <w:keepNext/>
+      </w:pPr>
+      <w:r>
+        <w:t>Casos de teste do aluno</w:t>
+      </w:r>
+    </w:p>
+    <w:p>
+      <w:pPr>
+        <w:keepNext/>
+      </w:pPr>
+      <w:r>
+        <w:t>Validação do acompanhamento e das restrições do perfil discente.</w:t>
+      </w:r>
+    </w:p>
+    <w:p>
+      <w:pPr>
         <w:pStyle w:val="Heading3"/>
         <w:keepNext/>
         <w:keepLines/>
       </w:pPr>
       <w:r>
-        <w:t>CT-ALU-003  Bloquear criação e edição de projetos</w:t>
+        <w:t>CT-ALU-001  Consultar painel do aluno</w:t>
       </w:r>
     </w:p>
     <w:p>
@@ -11731,7 +11749,7 @@
         <w:t xml:space="preserve">Pré-condições: </w:t>
       </w:r>
       <w:r>
-        <w:t>Aluno autenticado.</w:t>
+        <w:t>Entrar como Diego Alves.</w:t>
       </w:r>
     </w:p>
     <w:p>
@@ -11753,7 +11771,7 @@
         <w:ind w:left="403" w:hanging="317"/>
       </w:pPr>
       <w:r>
-        <w:t>1.  Tentar acessar diretamente a URL de criação.</w:t>
+        <w:t>1.  Abrir Tela Principal e Meus Projetos.</w:t>
       </w:r>
     </w:p>
     <w:p>
@@ -11762,7 +11780,7 @@
         <w:ind w:left="403" w:hanging="317"/>
       </w:pPr>
       <w:r>
-        <w:t>2.  Tentar abrir a edição de um projeto conhecido.</w:t>
+        <w:t>2.  Comparar a lista com as participações da base.</w:t>
       </w:r>
     </w:p>
     <w:p>
@@ -11784,7 +11802,7 @@
         <w:ind w:left="403" w:hanging="317"/>
       </w:pPr>
       <w:r>
-        <w:t>•  O sistema nega ou redireciona o acesso.</w:t>
+        <w:t>•  Somente projetos em que Diego integra a equipe aparecem.</w:t>
       </w:r>
     </w:p>
     <w:p>
@@ -11793,7 +11811,7 @@
         <w:ind w:left="403" w:hanging="317"/>
       </w:pPr>
       <w:r>
-        <w:t>•  Nenhum dado do projeto é alterado.</w:t>
+        <w:t>•  Status e coordenador são exibidos corretamente.</w:t>
       </w:r>
     </w:p>
     <w:p/>
@@ -11804,7 +11822,7 @@
         <w:keepLines/>
       </w:pPr>
       <w:r>
-        <w:t>CT-ALU-004  Consultar perfil do coordenador</w:t>
+        <w:t>CT-ALU-002  Visualizar detalhes permitidos</w:t>
       </w:r>
     </w:p>
     <w:p>
@@ -11852,7 +11870,7 @@
         <w:t xml:space="preserve">Pré-condições: </w:t>
       </w:r>
       <w:r>
-        <w:t>Projeto da equipe aberto.</w:t>
+        <w:t>Aluno vinculado a projeto.</w:t>
       </w:r>
     </w:p>
     <w:p>
@@ -11874,7 +11892,16 @@
         <w:ind w:left="403" w:hanging="317"/>
       </w:pPr>
       <w:r>
-        <w:t>1.  Abrir o perfil público interno do coordenador.</w:t>
+        <w:t>1.  Abrir um projeto da lista.</w:t>
+      </w:r>
+    </w:p>
+    <w:p>
+      <w:pPr>
+        <w:keepLines/>
+        <w:ind w:left="403" w:hanging="317"/>
+      </w:pPr>
+      <w:r>
+        <w:t>2.  Conferir resumo, objetivo, equipe e ODS.</w:t>
       </w:r>
     </w:p>
     <w:p>
@@ -11896,7 +11923,7 @@
         <w:ind w:left="403" w:hanging="317"/>
       </w:pPr>
       <w:r>
-        <w:t>•  Informações profissionais permitidas são exibidas.</w:t>
+        <w:t>•  A visualização simplificada contém informações pertinentes.</w:t>
       </w:r>
     </w:p>
     <w:p>
@@ -11905,7 +11932,7 @@
         <w:ind w:left="403" w:hanging="317"/>
       </w:pPr>
       <w:r>
-        <w:t>•  Dados privados não são expostos indevidamente.</w:t>
+        <w:t>•  Dados administrativos restritos e ações de edição não aparecem.</w:t>
       </w:r>
     </w:p>
     <w:p/>
@@ -11916,7 +11943,7 @@
         <w:keepLines/>
       </w:pPr>
       <w:r>
-        <w:t>CT-ALU-005  Acessar certificado após conclusão</w:t>
+        <w:t>CT-ALU-003  Bloquear criação e edição de projetos</w:t>
       </w:r>
     </w:p>
     <w:p>
@@ -11964,7 +11991,7 @@
         <w:t xml:space="preserve">Pré-condições: </w:t>
       </w:r>
       <w:r>
-        <w:t>Aluno participante de projeto finalizado.</w:t>
+        <w:t>Aluno autenticado.</w:t>
       </w:r>
     </w:p>
     <w:p>
@@ -11986,7 +12013,7 @@
         <w:ind w:left="403" w:hanging="317"/>
       </w:pPr>
       <w:r>
-        <w:t>1.  Abrir o projeto finalizado.</w:t>
+        <w:t>1.  Tentar acessar diretamente a URL de criação.</w:t>
       </w:r>
     </w:p>
     <w:p>
@@ -11995,7 +12022,7 @@
         <w:ind w:left="403" w:hanging="317"/>
       </w:pPr>
       <w:r>
-        <w:t>2.  Acessar ou solicitar o certificado disponível.</w:t>
+        <w:t>2.  Tentar abrir a edição de um projeto conhecido.</w:t>
       </w:r>
     </w:p>
     <w:p>
@@ -12017,7 +12044,7 @@
         <w:ind w:left="403" w:hanging="317"/>
       </w:pPr>
       <w:r>
-        <w:t>•  O certificado identifica projeto, participante, função e cargas horárias.</w:t>
+        <w:t>•  O sistema nega ou redireciona o acesso.</w:t>
       </w:r>
     </w:p>
     <w:p>
@@ -12026,35 +12053,18 @@
         <w:ind w:left="403" w:hanging="317"/>
       </w:pPr>
       <w:r>
-        <w:t>•  Aluno não consegue gerar certificado de pessoa não autorizada.</w:t>
+        <w:t>•  Nenhum dado do projeto é alterado.</w:t>
       </w:r>
     </w:p>
     <w:p/>
     <w:p>
       <w:pPr>
-        <w:pStyle w:val="Heading1"/>
-        <w:keepNext/>
-      </w:pPr>
-      <w:r>
-        <w:t>Casos de teste da consulta pública</w:t>
-      </w:r>
-    </w:p>
-    <w:p>
-      <w:pPr>
-        <w:keepNext/>
-      </w:pPr>
-      <w:r>
-        <w:t>Validação do acesso sem autenticação e da proteção de dados.</w:t>
-      </w:r>
-    </w:p>
-    <w:p>
-      <w:pPr>
         <w:pStyle w:val="Heading3"/>
         <w:keepNext/>
         <w:keepLines/>
       </w:pPr>
       <w:r>
-        <w:t>CT-PUB-001  Abrir consulta pública sem conta</w:t>
+        <w:t>CT-ALU-004  Consultar perfil do coordenador</w:t>
       </w:r>
     </w:p>
     <w:p>
@@ -12070,7 +12080,7 @@
         <w:t xml:space="preserve">Perfil: </w:t>
       </w:r>
       <w:r>
-        <w:t>Público</w:t>
+        <w:t>Aluno</w:t>
       </w:r>
     </w:p>
     <w:p>
@@ -12102,7 +12112,7 @@
         <w:t xml:space="preserve">Pré-condições: </w:t>
       </w:r>
       <w:r>
-        <w:t>Sessão encerrada.</w:t>
+        <w:t>Projeto da equipe aberto.</w:t>
       </w:r>
     </w:p>
     <w:p>
@@ -12124,16 +12134,7 @@
         <w:ind w:left="403" w:hanging="317"/>
       </w:pPr>
       <w:r>
-        <w:t>1.  Acessar Consulta Pública.</w:t>
-      </w:r>
-    </w:p>
-    <w:p>
-      <w:pPr>
-        <w:keepLines/>
-        <w:ind w:left="403" w:hanging="317"/>
-      </w:pPr>
-      <w:r>
-        <w:t>2.  Navegar pela lista de projetos.</w:t>
+        <w:t>1.  Abrir o perfil público interno do coordenador.</w:t>
       </w:r>
     </w:p>
     <w:p>
@@ -12155,7 +12156,7 @@
         <w:ind w:left="403" w:hanging="317"/>
       </w:pPr>
       <w:r>
-        <w:t>•  Não é solicitado login.</w:t>
+        <w:t>•  Informações profissionais permitidas são exibidas.</w:t>
       </w:r>
     </w:p>
     <w:p>
@@ -12164,7 +12165,7 @@
         <w:ind w:left="403" w:hanging="317"/>
       </w:pPr>
       <w:r>
-        <w:t>•  Somente situações publicáveis aparecem.</w:t>
+        <w:t>•  Dados privados não são expostos indevidamente.</w:t>
       </w:r>
     </w:p>
     <w:p/>
@@ -12175,7 +12176,7 @@
         <w:keepLines/>
       </w:pPr>
       <w:r>
-        <w:t>CT-PUB-002  Pesquisar e filtrar consulta pública</w:t>
+        <w:t>CT-ALU-005  Acessar certificado após conclusão</w:t>
       </w:r>
     </w:p>
     <w:p>
@@ -12191,7 +12192,7 @@
         <w:t xml:space="preserve">Perfil: </w:t>
       </w:r>
       <w:r>
-        <w:t>Público</w:t>
+        <w:t>Aluno</w:t>
       </w:r>
     </w:p>
     <w:p>
@@ -12223,7 +12224,7 @@
         <w:t xml:space="preserve">Pré-condições: </w:t>
       </w:r>
       <w:r>
-        <w:t>Consulta pública aberta.</w:t>
+        <w:t>Aluno participante de projeto finalizado.</w:t>
       </w:r>
     </w:p>
     <w:p>
@@ -12245,7 +12246,7 @@
         <w:ind w:left="403" w:hanging="317"/>
       </w:pPr>
       <w:r>
-        <w:t>1.  Pesquisar por título ou coordenador.</w:t>
+        <w:t>1.  Abrir o projeto finalizado.</w:t>
       </w:r>
     </w:p>
     <w:p>
@@ -12254,16 +12255,7 @@
         <w:ind w:left="403" w:hanging="317"/>
       </w:pPr>
       <w:r>
-        <w:t>2.  Selecionar ODS 1 e ODS 10.</w:t>
-      </w:r>
-    </w:p>
-    <w:p>
-      <w:pPr>
-        <w:keepLines/>
-        <w:ind w:left="403" w:hanging="317"/>
-      </w:pPr>
-      <w:r>
-        <w:t>3.  Testar Todas as ODS (AND) e depois Qualquer ODS (OR).</w:t>
+        <w:t>2.  Acessar ou solicitar o certificado disponível.</w:t>
       </w:r>
     </w:p>
     <w:p>
@@ -12285,7 +12277,7 @@
         <w:ind w:left="403" w:hanging="317"/>
       </w:pPr>
       <w:r>
-        <w:t>•  No modo AND aparecem somente projetos vinculados às duas ODS; no modo OR aparece qualquer projeto vinculado a pelo menos uma.</w:t>
+        <w:t>•  O certificado identifica projeto, participante, função e cargas horárias.</w:t>
       </w:r>
     </w:p>
     <w:p>
@@ -12294,18 +12286,35 @@
         <w:ind w:left="403" w:hanging="317"/>
       </w:pPr>
       <w:r>
-        <w:t>•  Filtros podem ser limpos sem erro.</w:t>
+        <w:t>•  Aluno não consegue gerar certificado de pessoa não autorizada.</w:t>
       </w:r>
     </w:p>
     <w:p/>
     <w:p>
       <w:pPr>
+        <w:pStyle w:val="Heading1"/>
+        <w:keepNext/>
+      </w:pPr>
+      <w:r>
+        <w:t>Casos de teste da consulta pública</w:t>
+      </w:r>
+    </w:p>
+    <w:p>
+      <w:pPr>
+        <w:keepNext/>
+      </w:pPr>
+      <w:r>
+        <w:t>Validação do acesso sem autenticação e da proteção de dados.</w:t>
+      </w:r>
+    </w:p>
+    <w:p>
+      <w:pPr>
         <w:pStyle w:val="Heading3"/>
         <w:keepNext/>
         <w:keepLines/>
       </w:pPr>
       <w:r>
-        <w:t>CT-PUB-003  Visualizar detalhes públicos</w:t>
+        <w:t>CT-PUB-001  Abrir consulta pública sem conta</w:t>
       </w:r>
     </w:p>
     <w:p>
@@ -12353,7 +12362,7 @@
         <w:t xml:space="preserve">Pré-condições: </w:t>
       </w:r>
       <w:r>
-        <w:t>Projeto publicável selecionado.</w:t>
+        <w:t>Sessão encerrada.</w:t>
       </w:r>
     </w:p>
     <w:p>
@@ -12375,7 +12384,7 @@
         <w:ind w:left="403" w:hanging="317"/>
       </w:pPr>
       <w:r>
-        <w:t>1.  Abrir os detalhes.</w:t>
+        <w:t>1.  Acessar Consulta Pública.</w:t>
       </w:r>
     </w:p>
     <w:p>
@@ -12384,7 +12393,7 @@
         <w:ind w:left="403" w:hanging="317"/>
       </w:pPr>
       <w:r>
-        <w:t>2.  Revisar campos e links disponíveis.</w:t>
+        <w:t>2.  Navegar pela lista de projetos.</w:t>
       </w:r>
     </w:p>
     <w:p>
@@ -12406,7 +12415,7 @@
         <w:ind w:left="403" w:hanging="317"/>
       </w:pPr>
       <w:r>
-        <w:t>•  Resumo, objetivos, coordenador, centro e ODS são exibidos.</w:t>
+        <w:t>•  Não é solicitado login.</w:t>
       </w:r>
     </w:p>
     <w:p>
@@ -12415,7 +12424,7 @@
         <w:ind w:left="403" w:hanging="317"/>
       </w:pPr>
       <w:r>
-        <w:t>•  CPF, documentos restritos e ações administrativas não aparecem.</w:t>
+        <w:t>•  Somente situações publicáveis aparecem.</w:t>
       </w:r>
     </w:p>
     <w:p/>
@@ -12426,7 +12435,7 @@
         <w:keepLines/>
       </w:pPr>
       <w:r>
-        <w:t>CT-PUB-004  Exportar consulta pública em PDF</w:t>
+        <w:t>CT-PUB-002  Pesquisar e filtrar consulta pública</w:t>
       </w:r>
     </w:p>
     <w:p>
@@ -12474,7 +12483,7 @@
         <w:t xml:space="preserve">Pré-condições: </w:t>
       </w:r>
       <w:r>
-        <w:t>Consulta com filtros aplicados.</w:t>
+        <w:t>Consulta pública aberta.</w:t>
       </w:r>
     </w:p>
     <w:p>
@@ -12496,7 +12505,7 @@
         <w:ind w:left="403" w:hanging="317"/>
       </w:pPr>
       <w:r>
-        <w:t>1.  Gerar o PDF.</w:t>
+        <w:t>1.  Pesquisar por título ou coordenador.</w:t>
       </w:r>
     </w:p>
     <w:p>
@@ -12505,7 +12514,16 @@
         <w:ind w:left="403" w:hanging="317"/>
       </w:pPr>
       <w:r>
-        <w:t>2.  Comparar o conteúdo com a tela.</w:t>
+        <w:t>2.  Selecionar ODS 1 e ODS 10.</w:t>
+      </w:r>
+    </w:p>
+    <w:p>
+      <w:pPr>
+        <w:keepLines/>
+        <w:ind w:left="403" w:hanging="317"/>
+      </w:pPr>
+      <w:r>
+        <w:t>3.  Testar Todas as ODS (AND) e depois Qualquer ODS (OR).</w:t>
       </w:r>
     </w:p>
     <w:p>
@@ -12527,7 +12545,7 @@
         <w:ind w:left="403" w:hanging="317"/>
       </w:pPr>
       <w:r>
-        <w:t>•  O arquivo é gerado e legível.</w:t>
+        <w:t>•  No modo AND aparecem somente projetos vinculados às duas ODS; no modo OR aparece qualquer projeto vinculado a pelo menos uma.</w:t>
       </w:r>
     </w:p>
     <w:p>
@@ -12536,35 +12554,18 @@
         <w:ind w:left="403" w:hanging="317"/>
       </w:pPr>
       <w:r>
-        <w:t>•  O resultado respeita os filtros aplicados.</w:t>
+        <w:t>•  Filtros podem ser limpos sem erro.</w:t>
       </w:r>
     </w:p>
     <w:p/>
     <w:p>
       <w:pPr>
-        <w:pStyle w:val="Heading1"/>
-        <w:keepNext/>
-      </w:pPr>
-      <w:r>
-        <w:t>Casos de teste de notificações</w:t>
-      </w:r>
-    </w:p>
-    <w:p>
-      <w:pPr>
-        <w:keepNext/>
-      </w:pPr>
-      <w:r>
-        <w:t>Validação da central interna e dos avisos por prazo.</w:t>
-      </w:r>
-    </w:p>
-    <w:p>
-      <w:pPr>
         <w:pStyle w:val="Heading3"/>
         <w:keepNext/>
         <w:keepLines/>
       </w:pPr>
       <w:r>
-        <w:t>CT-NOT-001  Visualizar e excluir notificações</w:t>
+        <w:t>CT-PUB-003  Visualizar detalhes públicos</w:t>
       </w:r>
     </w:p>
     <w:p>
@@ -12580,7 +12581,7 @@
         <w:t xml:space="preserve">Perfil: </w:t>
       </w:r>
       <w:r>
-        <w:t>Qualquer usuário autenticado</w:t>
+        <w:t>Público</w:t>
       </w:r>
     </w:p>
     <w:p>
@@ -12612,7 +12613,7 @@
         <w:t xml:space="preserve">Pré-condições: </w:t>
       </w:r>
       <w:r>
-        <w:t>Usuário possui a notificação inicial da amostra.</w:t>
+        <w:t>Projeto publicável selecionado.</w:t>
       </w:r>
     </w:p>
     <w:p>
@@ -12634,7 +12635,7 @@
         <w:ind w:left="403" w:hanging="317"/>
       </w:pPr>
       <w:r>
-        <w:t>1.  Abrir o sino e a central de notificações.</w:t>
+        <w:t>1.  Abrir os detalhes.</w:t>
       </w:r>
     </w:p>
     <w:p>
@@ -12643,16 +12644,7 @@
         <w:ind w:left="403" w:hanging="317"/>
       </w:pPr>
       <w:r>
-        <w:t>2.  Pesquisar por texto ou data.</w:t>
-      </w:r>
-    </w:p>
-    <w:p>
-      <w:pPr>
-        <w:keepLines/>
-        <w:ind w:left="403" w:hanging="317"/>
-      </w:pPr>
-      <w:r>
-        <w:t>3.  Excluir uma notificação e depois excluir múltiplas selecionadas.</w:t>
+        <w:t>2.  Revisar campos e links disponíveis.</w:t>
       </w:r>
     </w:p>
     <w:p>
@@ -12674,7 +12666,7 @@
         <w:ind w:left="403" w:hanging="317"/>
       </w:pPr>
       <w:r>
-        <w:t>•  Contador e estado de leitura são atualizados.</w:t>
+        <w:t>•  Resumo, objetivos, coordenador, centro e ODS são exibidos.</w:t>
       </w:r>
     </w:p>
     <w:p>
@@ -12683,7 +12675,7 @@
         <w:ind w:left="403" w:hanging="317"/>
       </w:pPr>
       <w:r>
-        <w:t>•  Somente notificações do usuário autenticado são alteradas.</w:t>
+        <w:t>•  CPF, documentos restritos e ações administrativas não aparecem.</w:t>
       </w:r>
     </w:p>
     <w:p/>
@@ -12694,7 +12686,7 @@
         <w:keepLines/>
       </w:pPr>
       <w:r>
-        <w:t>CT-NOT-002  Emitir alertas do prazo ético</w:t>
+        <w:t>CT-PUB-004  Exportar consulta pública em PDF</w:t>
       </w:r>
     </w:p>
     <w:p>
@@ -12710,7 +12702,7 @@
         <w:t xml:space="preserve">Perfil: </w:t>
       </w:r>
       <w:r>
-        <w:t>Coordenador Gestor</w:t>
+        <w:t>Público</w:t>
       </w:r>
     </w:p>
     <w:p>
@@ -12742,7 +12734,7 @@
         <w:t xml:space="preserve">Pré-condições: </w:t>
       </w:r>
       <w:r>
-        <w:t>Projeto com submissão ética e prazo configurado.</w:t>
+        <w:t>Consulta com filtros aplicados.</w:t>
       </w:r>
     </w:p>
     <w:p>
@@ -12764,7 +12756,7 @@
         <w:ind w:left="403" w:hanging="317"/>
       </w:pPr>
       <w:r>
-        <w:t>1.  Executar python manage.py notificar_prazos_etica em um marco aplicável.</w:t>
+        <w:t>1.  Gerar o PDF.</w:t>
       </w:r>
     </w:p>
     <w:p>
@@ -12773,16 +12765,7 @@
         <w:ind w:left="403" w:hanging="317"/>
       </w:pPr>
       <w:r>
-        <w:t>2.  Consultar notificações e caixa de e-mail de teste.</w:t>
-      </w:r>
-    </w:p>
-    <w:p>
-      <w:pPr>
-        <w:keepLines/>
-        <w:ind w:left="403" w:hanging="317"/>
-      </w:pPr>
-      <w:r>
-        <w:t>3.  Executar novamente no mesmo marco.</w:t>
+        <w:t>2.  Comparar o conteúdo com a tela.</w:t>
       </w:r>
     </w:p>
     <w:p>
@@ -12804,7 +12787,7 @@
         <w:ind w:left="403" w:hanging="317"/>
       </w:pPr>
       <w:r>
-        <w:t>•  Alerta interno e e-mail são enviados em 60, 30, 15, 7, 3 e 1 dia.</w:t>
+        <w:t>•  O arquivo é gerado e legível.</w:t>
       </w:r>
     </w:p>
     <w:p>
@@ -12813,7 +12796,7 @@
         <w:ind w:left="403" w:hanging="317"/>
       </w:pPr>
       <w:r>
-        <w:t>•  O mesmo marco não gera duplicidade.</w:t>
+        <w:t>•  O resultado respeita os filtros aplicados.</w:t>
       </w:r>
     </w:p>
     <w:p/>
@@ -12823,15 +12806,15 @@
         <w:keepNext/>
       </w:pPr>
       <w:r>
-        <w:t>Casos de teste de segurança e interface</w:t>
-      </w:r>
-    </w:p>
-    <w:p>
-      <w:pPr>
-        <w:keepNext/>
-      </w:pPr>
-      <w:r>
-        <w:t>Cenários negativos e de controle de acesso.</w:t>
+        <w:t>Casos de teste de notificações</w:t>
+      </w:r>
+    </w:p>
+    <w:p>
+      <w:pPr>
+        <w:keepNext/>
+      </w:pPr>
+      <w:r>
+        <w:t>Validação da central interna e dos avisos por prazo.</w:t>
       </w:r>
     </w:p>
     <w:p>
@@ -12841,7 +12824,7 @@
         <w:keepLines/>
       </w:pPr>
       <w:r>
-        <w:t>CT-SEG-001  Validar autorização por perfil em URL direta</w:t>
+        <w:t>CT-NOT-001  Visualizar e excluir notificações</w:t>
       </w:r>
     </w:p>
     <w:p>
@@ -12857,7 +12840,7 @@
         <w:t xml:space="preserve">Perfil: </w:t>
       </w:r>
       <w:r>
-        <w:t>Coordenador Aluno Gestor</w:t>
+        <w:t>Qualquer usuário autenticado</w:t>
       </w:r>
     </w:p>
     <w:p>
@@ -12889,7 +12872,7 @@
         <w:t xml:space="preserve">Pré-condições: </w:t>
       </w:r>
       <w:r>
-        <w:t>Uma sessão ativa por vez.</w:t>
+        <w:t>Usuário possui a notificação inicial da amostra.</w:t>
       </w:r>
     </w:p>
     <w:p>
@@ -12911,7 +12894,7 @@
         <w:ind w:left="403" w:hanging="317"/>
       </w:pPr>
       <w:r>
-        <w:t>1.  Com aluno, abrir rota de gestor.</w:t>
+        <w:t>1.  Abrir o sino e a central de notificações.</w:t>
       </w:r>
     </w:p>
     <w:p>
@@ -12920,7 +12903,7 @@
         <w:ind w:left="403" w:hanging="317"/>
       </w:pPr>
       <w:r>
-        <w:t>2.  Com coordenador, abrir gestão de usuários.</w:t>
+        <w:t>2.  Pesquisar por texto ou data.</w:t>
       </w:r>
     </w:p>
     <w:p>
@@ -12929,7 +12912,7 @@
         <w:ind w:left="403" w:hanging="317"/>
       </w:pPr>
       <w:r>
-        <w:t>3.  Com gestor, confirmar acesso às rotas administrativas.</w:t>
+        <w:t>3.  Excluir uma notificação e depois excluir múltiplas selecionadas.</w:t>
       </w:r>
     </w:p>
     <w:p>
@@ -12951,7 +12934,7 @@
         <w:ind w:left="403" w:hanging="317"/>
       </w:pPr>
       <w:r>
-        <w:t>•  Perfis sem permissão recebem resposta segura ou redirecionamento.</w:t>
+        <w:t>•  Contador e estado de leitura são atualizados.</w:t>
       </w:r>
     </w:p>
     <w:p>
@@ -12960,7 +12943,7 @@
         <w:ind w:left="403" w:hanging="317"/>
       </w:pPr>
       <w:r>
-        <w:t>•  Nenhuma informação restrita é processada antes da autorização.</w:t>
+        <w:t>•  Somente notificações do usuário autenticado são alteradas.</w:t>
       </w:r>
     </w:p>
     <w:p/>
@@ -12971,7 +12954,7 @@
         <w:keepLines/>
       </w:pPr>
       <w:r>
-        <w:t>CT-SEG-002  Impedir acesso a projeto de outro coordenador</w:t>
+        <w:t>CT-NOT-002  Emitir alertas do prazo ético</w:t>
       </w:r>
     </w:p>
     <w:p>
@@ -12987,7 +12970,7 @@
         <w:t xml:space="preserve">Perfil: </w:t>
       </w:r>
       <w:r>
-        <w:t>Coordenador</w:t>
+        <w:t>Coordenador Gestor</w:t>
       </w:r>
     </w:p>
     <w:p>
@@ -13019,7 +13002,7 @@
         <w:t xml:space="preserve">Pré-condições: </w:t>
       </w:r>
       <w:r>
-        <w:t>Entrar como Ana e conhecer o ID de projeto de Bruno.</w:t>
+        <w:t>Projeto com submissão ética e prazo configurado.</w:t>
       </w:r>
     </w:p>
     <w:p>
@@ -13041,7 +13024,7 @@
         <w:ind w:left="403" w:hanging="317"/>
       </w:pPr>
       <w:r>
-        <w:t>1.  Tentar abrir a edição do projeto de Bruno pela URL.</w:t>
+        <w:t>1.  Executar python manage.py notificar_prazos_etica em um marco aplicável.</w:t>
       </w:r>
     </w:p>
     <w:p>
@@ -13050,7 +13033,16 @@
         <w:ind w:left="403" w:hanging="317"/>
       </w:pPr>
       <w:r>
-        <w:t>2.  Tentar alterar uma etapa por requisição direta.</w:t>
+        <w:t>2.  Consultar notificações e caixa de e-mail de teste.</w:t>
+      </w:r>
+    </w:p>
+    <w:p>
+      <w:pPr>
+        <w:keepLines/>
+        <w:ind w:left="403" w:hanging="317"/>
+      </w:pPr>
+      <w:r>
+        <w:t>3.  Executar novamente no mesmo marco.</w:t>
       </w:r>
     </w:p>
     <w:p>
@@ -13072,7 +13064,7 @@
         <w:ind w:left="403" w:hanging="317"/>
       </w:pPr>
       <w:r>
-        <w:t>•  A edição é negada.</w:t>
+        <w:t>•  Alerta interno e e-mail são enviados em 60, 30, 15, 7, 3 e 1 dia.</w:t>
       </w:r>
     </w:p>
     <w:p>
@@ -13081,18 +13073,35 @@
         <w:ind w:left="403" w:hanging="317"/>
       </w:pPr>
       <w:r>
-        <w:t>•  O projeto permanece sem alterações.</w:t>
+        <w:t>•  O mesmo marco não gera duplicidade.</w:t>
       </w:r>
     </w:p>
     <w:p/>
     <w:p>
       <w:pPr>
+        <w:pStyle w:val="Heading1"/>
+        <w:keepNext/>
+      </w:pPr>
+      <w:r>
+        <w:t>Casos de teste de segurança e interface</w:t>
+      </w:r>
+    </w:p>
+    <w:p>
+      <w:pPr>
+        <w:keepNext/>
+      </w:pPr>
+      <w:r>
+        <w:t>Cenários negativos e de controle de acesso.</w:t>
+      </w:r>
+    </w:p>
+    <w:p>
+      <w:pPr>
         <w:pStyle w:val="Heading3"/>
         <w:keepNext/>
         <w:keepLines/>
       </w:pPr>
       <w:r>
-        <w:t>CT-SEG-003  Validar formatos de upload</w:t>
+        <w:t>CT-SEG-001  Validar autorização por perfil em URL direta</w:t>
       </w:r>
     </w:p>
     <w:p>
@@ -13108,7 +13117,7 @@
         <w:t xml:space="preserve">Perfil: </w:t>
       </w:r>
       <w:r>
-        <w:t>Coordenador Gestor Centro</w:t>
+        <w:t>Coordenador Aluno Gestor</w:t>
       </w:r>
     </w:p>
     <w:p>
@@ -13140,7 +13149,7 @@
         <w:t xml:space="preserve">Pré-condições: </w:t>
       </w:r>
       <w:r>
-        <w:t>Telas de upload disponíveis.</w:t>
+        <w:t>Uma sessão ativa por vez.</w:t>
       </w:r>
     </w:p>
     <w:p>
@@ -13162,7 +13171,7 @@
         <w:ind w:left="403" w:hanging="317"/>
       </w:pPr>
       <w:r>
-        <w:t>1.  Tentar enviar executável ou TXT onde só PDF ou imagem é permitido.</w:t>
+        <w:t>1.  Com aluno, abrir rota de gestor.</w:t>
       </w:r>
     </w:p>
     <w:p>
@@ -13171,7 +13180,16 @@
         <w:ind w:left="403" w:hanging="317"/>
       </w:pPr>
       <w:r>
-        <w:t>2.  Enviar PDF ou imagem válida.</w:t>
+        <w:t>2.  Com coordenador, abrir gestão de usuários.</w:t>
+      </w:r>
+    </w:p>
+    <w:p>
+      <w:pPr>
+        <w:keepLines/>
+        <w:ind w:left="403" w:hanging="317"/>
+      </w:pPr>
+      <w:r>
+        <w:t>3.  Com gestor, confirmar acesso às rotas administrativas.</w:t>
       </w:r>
     </w:p>
     <w:p>
@@ -13193,7 +13211,7 @@
         <w:ind w:left="403" w:hanging="317"/>
       </w:pPr>
       <w:r>
-        <w:t>•  Extensões indevidas são rejeitadas no servidor, mesmo se o filtro do navegador for contornado.</w:t>
+        <w:t>•  Perfis sem permissão recebem resposta segura ou redirecionamento.</w:t>
       </w:r>
     </w:p>
     <w:p>
@@ -13202,7 +13220,7 @@
         <w:ind w:left="403" w:hanging="317"/>
       </w:pPr>
       <w:r>
-        <w:t>•  Formatos permitidos são aceitos.</w:t>
+        <w:t>•  Nenhuma informação restrita é processada antes da autorização.</w:t>
       </w:r>
     </w:p>
     <w:p/>
@@ -13213,7 +13231,7 @@
         <w:keepLines/>
       </w:pPr>
       <w:r>
-        <w:t>CT-SEG-004  Confirmar ações destrutivas ou críticas</w:t>
+        <w:t>CT-SEG-002  Impedir acesso a projeto de outro coordenador</w:t>
       </w:r>
     </w:p>
     <w:p>
@@ -13229,7 +13247,7 @@
         <w:t xml:space="preserve">Perfil: </w:t>
       </w:r>
       <w:r>
-        <w:t>Coordenador Gestor</w:t>
+        <w:t>Coordenador</w:t>
       </w:r>
     </w:p>
     <w:p>
@@ -13261,7 +13279,7 @@
         <w:t xml:space="preserve">Pré-condições: </w:t>
       </w:r>
       <w:r>
-        <w:t>Rascunho, anexo, usuário e edital de teste disponíveis.</w:t>
+        <w:t>Entrar como Ana e conhecer o ID de projeto de Bruno.</w:t>
       </w:r>
     </w:p>
     <w:p>
@@ -13283,7 +13301,7 @@
         <w:ind w:left="403" w:hanging="317"/>
       </w:pPr>
       <w:r>
-        <w:t>1.  Acionar excluir, aprovar, reprovar, fechar ou encerrar.</w:t>
+        <w:t>1.  Tentar abrir a edição do projeto de Bruno pela URL.</w:t>
       </w:r>
     </w:p>
     <w:p>
@@ -13292,16 +13310,7 @@
         <w:ind w:left="403" w:hanging="317"/>
       </w:pPr>
       <w:r>
-        <w:t>2.  Passar o mouse no apoio de confirmação e cancelar.</w:t>
-      </w:r>
-    </w:p>
-    <w:p>
-      <w:pPr>
-        <w:keepLines/>
-        <w:ind w:left="403" w:hanging="317"/>
-      </w:pPr>
-      <w:r>
-        <w:t>3.  Repetir e confirmar.</w:t>
+        <w:t>2.  Tentar alterar uma etapa por requisição direta.</w:t>
       </w:r>
     </w:p>
     <w:p>
@@ -13323,7 +13332,7 @@
         <w:ind w:left="403" w:hanging="317"/>
       </w:pPr>
       <w:r>
-        <w:t>•  O apoio informa a consequência da ação.</w:t>
+        <w:t>•  A edição é negada.</w:t>
       </w:r>
     </w:p>
     <w:p>
@@ -13332,7 +13341,7 @@
         <w:ind w:left="403" w:hanging="317"/>
       </w:pPr>
       <w:r>
-        <w:t>•  Cancelar não altera dados e confirmar executa somente o alvo selecionado.</w:t>
+        <w:t>•  O projeto permanece sem alterações.</w:t>
       </w:r>
     </w:p>
     <w:p/>
@@ -13343,7 +13352,7 @@
         <w:keepLines/>
       </w:pPr>
       <w:r>
-        <w:t>CT-SEG-005  Validar token do Centro contra alteração</w:t>
+        <w:t>CT-SEG-003  Validar formatos de upload</w:t>
       </w:r>
     </w:p>
     <w:p>
@@ -13359,7 +13368,7 @@
         <w:t xml:space="preserve">Perfil: </w:t>
       </w:r>
       <w:r>
-        <w:t>Público</w:t>
+        <w:t>Coordenador Gestor Centro</w:t>
       </w:r>
     </w:p>
     <w:p>
@@ -13391,7 +13400,7 @@
         <w:t xml:space="preserve">Pré-condições: </w:t>
       </w:r>
       <w:r>
-        <w:t>Link de amostra do Centro disponível.</w:t>
+        <w:t>Telas de upload disponíveis.</w:t>
       </w:r>
     </w:p>
     <w:p>
@@ -13413,7 +13422,7 @@
         <w:ind w:left="403" w:hanging="317"/>
       </w:pPr>
       <w:r>
-        <w:t>1.  Alterar um ou mais caracteres do token na URL.</w:t>
+        <w:t>1.  Tentar enviar executável ou TXT onde só PDF ou imagem é permitido.</w:t>
       </w:r>
     </w:p>
     <w:p>
@@ -13422,7 +13431,7 @@
         <w:ind w:left="403" w:hanging="317"/>
       </w:pPr>
       <w:r>
-        <w:t>2.  Tentar consultar e enviar dados.</w:t>
+        <w:t>2.  Enviar PDF ou imagem válida.</w:t>
       </w:r>
     </w:p>
     <w:p>
@@ -13444,7 +13453,7 @@
         <w:ind w:left="403" w:hanging="317"/>
       </w:pPr>
       <w:r>
-        <w:t>•  O token alterado não localiza a solicitação.</w:t>
+        <w:t>•  Extensões indevidas são rejeitadas no servidor, mesmo se o filtro do navegador for contornado.</w:t>
       </w:r>
     </w:p>
     <w:p>
@@ -13453,7 +13462,7 @@
         <w:ind w:left="403" w:hanging="317"/>
       </w:pPr>
       <w:r>
-        <w:t>•  Nenhum dado do projeto é exposto.</w:t>
+        <w:t>•  Formatos permitidos são aceitos.</w:t>
       </w:r>
     </w:p>
     <w:p/>
@@ -13464,7 +13473,7 @@
         <w:keepLines/>
       </w:pPr>
       <w:r>
-        <w:t>CT-SEG-006  Validar responsividade geral</w:t>
+        <w:t>CT-SEG-004  Confirmar ações destrutivas ou críticas</w:t>
       </w:r>
     </w:p>
     <w:p>
@@ -13480,7 +13489,7 @@
         <w:t xml:space="preserve">Perfil: </w:t>
       </w:r>
       <w:r>
-        <w:t>Todos</w:t>
+        <w:t>Coordenador Gestor</w:t>
       </w:r>
     </w:p>
     <w:p>
@@ -13512,7 +13521,7 @@
         <w:t xml:space="preserve">Pré-condições: </w:t>
       </w:r>
       <w:r>
-        <w:t>Navegador com ferramentas responsivas.</w:t>
+        <w:t>Rascunho, anexo, usuário e edital de teste disponíveis.</w:t>
       </w:r>
     </w:p>
     <w:p>
@@ -13534,7 +13543,7 @@
         <w:ind w:left="403" w:hanging="317"/>
       </w:pPr>
       <w:r>
-        <w:t>1.  Testar login, ajuda, perfis, etapas, tabelas e detalhes em 390 px, 768 px e largura desktop.</w:t>
+        <w:t>1.  Acionar excluir, aprovar, reprovar, fechar ou encerrar.</w:t>
       </w:r>
     </w:p>
     <w:p>
@@ -13543,7 +13552,16 @@
         <w:ind w:left="403" w:hanging="317"/>
       </w:pPr>
       <w:r>
-        <w:t>2.  Verificar navegação por teclado.</w:t>
+        <w:t>2.  Passar o mouse no apoio de confirmação e cancelar.</w:t>
+      </w:r>
+    </w:p>
+    <w:p>
+      <w:pPr>
+        <w:keepLines/>
+        <w:ind w:left="403" w:hanging="317"/>
+      </w:pPr>
+      <w:r>
+        <w:t>3.  Repetir e confirmar.</w:t>
       </w:r>
     </w:p>
     <w:p>
@@ -13565,6 +13583,248 @@
         <w:ind w:left="403" w:hanging="317"/>
       </w:pPr>
       <w:r>
+        <w:t>•  O apoio informa a consequência da ação.</w:t>
+      </w:r>
+    </w:p>
+    <w:p>
+      <w:pPr>
+        <w:keepLines/>
+        <w:ind w:left="403" w:hanging="317"/>
+      </w:pPr>
+      <w:r>
+        <w:t>•  Cancelar não altera dados e confirmar executa somente o alvo selecionado.</w:t>
+      </w:r>
+    </w:p>
+    <w:p/>
+    <w:p>
+      <w:pPr>
+        <w:pStyle w:val="Heading3"/>
+        <w:keepNext/>
+        <w:keepLines/>
+      </w:pPr>
+      <w:r>
+        <w:t>CT-SEG-005  Validar token do Centro contra alteração</w:t>
+      </w:r>
+    </w:p>
+    <w:p>
+      <w:pPr>
+        <w:keepNext/>
+        <w:keepLines/>
+        <w:spacing w:after="80"/>
+      </w:pPr>
+      <w:r>
+        <w:rPr>
+          <w:b/>
+        </w:rPr>
+        <w:t xml:space="preserve">Perfil: </w:t>
+      </w:r>
+      <w:r>
+        <w:t>Público</w:t>
+      </w:r>
+    </w:p>
+    <w:p>
+      <w:pPr>
+        <w:keepNext/>
+        <w:keepLines/>
+        <w:spacing w:after="80"/>
+      </w:pPr>
+      <w:r>
+        <w:rPr>
+          <w:b/>
+        </w:rPr>
+        <w:t xml:space="preserve">Prioridade: </w:t>
+      </w:r>
+      <w:r>
+        <w:t>Alta</w:t>
+      </w:r>
+    </w:p>
+    <w:p>
+      <w:pPr>
+        <w:keepNext/>
+        <w:keepLines/>
+        <w:spacing w:after="80"/>
+      </w:pPr>
+      <w:r>
+        <w:rPr>
+          <w:b/>
+        </w:rPr>
+        <w:t xml:space="preserve">Pré-condições: </w:t>
+      </w:r>
+      <w:r>
+        <w:t>Link de amostra do Centro disponível.</w:t>
+      </w:r>
+    </w:p>
+    <w:p>
+      <w:pPr>
+        <w:keepNext/>
+        <w:keepLines/>
+        <w:spacing w:after="40"/>
+      </w:pPr>
+      <w:r>
+        <w:rPr>
+          <w:b/>
+        </w:rPr>
+        <w:t>Passos</w:t>
+      </w:r>
+    </w:p>
+    <w:p>
+      <w:pPr>
+        <w:keepLines/>
+        <w:ind w:left="403" w:hanging="317"/>
+      </w:pPr>
+      <w:r>
+        <w:t>1.  Alterar um ou mais caracteres do token na URL.</w:t>
+      </w:r>
+    </w:p>
+    <w:p>
+      <w:pPr>
+        <w:keepLines/>
+        <w:ind w:left="403" w:hanging="317"/>
+      </w:pPr>
+      <w:r>
+        <w:t>2.  Tentar consultar e enviar dados.</w:t>
+      </w:r>
+    </w:p>
+    <w:p>
+      <w:pPr>
+        <w:keepNext/>
+        <w:keepLines/>
+        <w:spacing w:after="40"/>
+      </w:pPr>
+      <w:r>
+        <w:rPr>
+          <w:b/>
+        </w:rPr>
+        <w:t>Resultado esperado</w:t>
+      </w:r>
+    </w:p>
+    <w:p>
+      <w:pPr>
+        <w:keepLines/>
+        <w:ind w:left="403" w:hanging="317"/>
+      </w:pPr>
+      <w:r>
+        <w:t>•  O token alterado não localiza a solicitação.</w:t>
+      </w:r>
+    </w:p>
+    <w:p>
+      <w:pPr>
+        <w:keepLines/>
+        <w:ind w:left="403" w:hanging="317"/>
+      </w:pPr>
+      <w:r>
+        <w:t>•  Nenhum dado do projeto é exposto.</w:t>
+      </w:r>
+    </w:p>
+    <w:p/>
+    <w:p>
+      <w:pPr>
+        <w:pStyle w:val="Heading3"/>
+        <w:keepNext/>
+        <w:keepLines/>
+      </w:pPr>
+      <w:r>
+        <w:t>CT-SEG-006  Validar responsividade geral</w:t>
+      </w:r>
+    </w:p>
+    <w:p>
+      <w:pPr>
+        <w:keepNext/>
+        <w:keepLines/>
+        <w:spacing w:after="80"/>
+      </w:pPr>
+      <w:r>
+        <w:rPr>
+          <w:b/>
+        </w:rPr>
+        <w:t xml:space="preserve">Perfil: </w:t>
+      </w:r>
+      <w:r>
+        <w:t>Todos</w:t>
+      </w:r>
+    </w:p>
+    <w:p>
+      <w:pPr>
+        <w:keepNext/>
+        <w:keepLines/>
+        <w:spacing w:after="80"/>
+      </w:pPr>
+      <w:r>
+        <w:rPr>
+          <w:b/>
+        </w:rPr>
+        <w:t xml:space="preserve">Prioridade: </w:t>
+      </w:r>
+      <w:r>
+        <w:t>Alta</w:t>
+      </w:r>
+    </w:p>
+    <w:p>
+      <w:pPr>
+        <w:keepNext/>
+        <w:keepLines/>
+        <w:spacing w:after="80"/>
+      </w:pPr>
+      <w:r>
+        <w:rPr>
+          <w:b/>
+        </w:rPr>
+        <w:t xml:space="preserve">Pré-condições: </w:t>
+      </w:r>
+      <w:r>
+        <w:t>Navegador com ferramentas responsivas.</w:t>
+      </w:r>
+    </w:p>
+    <w:p>
+      <w:pPr>
+        <w:keepNext/>
+        <w:keepLines/>
+        <w:spacing w:after="40"/>
+      </w:pPr>
+      <w:r>
+        <w:rPr>
+          <w:b/>
+        </w:rPr>
+        <w:t>Passos</w:t>
+      </w:r>
+    </w:p>
+    <w:p>
+      <w:pPr>
+        <w:keepLines/>
+        <w:ind w:left="403" w:hanging="317"/>
+      </w:pPr>
+      <w:r>
+        <w:t>1.  Testar login, ajuda, perfis, etapas, tabelas e detalhes em 390 px, 768 px e largura desktop.</w:t>
+      </w:r>
+    </w:p>
+    <w:p>
+      <w:pPr>
+        <w:keepLines/>
+        <w:ind w:left="403" w:hanging="317"/>
+      </w:pPr>
+      <w:r>
+        <w:t>2.  Verificar navegação por teclado.</w:t>
+      </w:r>
+    </w:p>
+    <w:p>
+      <w:pPr>
+        <w:keepNext/>
+        <w:keepLines/>
+        <w:spacing w:after="40"/>
+      </w:pPr>
+      <w:r>
+        <w:rPr>
+          <w:b/>
+        </w:rPr>
+        <w:t>Resultado esperado</w:t>
+      </w:r>
+    </w:p>
+    <w:p>
+      <w:pPr>
+        <w:keepLines/>
+        <w:ind w:left="403" w:hanging="317"/>
+      </w:pPr>
+      <w:r>
         <w:t>•  Não há conteúdo essencial cortado ou fora da região principal.</w:t>
       </w:r>
     </w:p>
@@ -13661,7 +13921,7 @@
         <w:ind w:left="403" w:hanging="317"/>
       </w:pPr>
       <w:r>
-        <w:t>2.  Após a submissão, o projeto fica Aguardando aprovação do Centro.</w:t>
+        <w:t>2.  Após a submissão, o projeto fica Aguardando deliberação do Centro Acadêmico.</w:t>
       </w:r>
     </w:p>
     <w:p>
@@ -15392,12 +15652,12 @@
         <w:pageBreakBefore/>
       </w:pPr>
       <w:r>
-        <w:t>Atualização da execução de 16 de setembro de 2026</w:t>
-      </w:r>
-    </w:p>
-    <w:p>
-      <w:r>
-        <w:t>Esta seção consolida a validação específica do fluxo de aprovação pelo Centro de Estudos, a correção aplicada durante a execução e os limites da confirmação em produção. Os resultados não autorizam declarar a plataforma livre de bugs; eles descrevem a cobertura efetivamente executada.</w:t>
+        <w:t>Atualização da execução de 17 de setembro de 2026</w:t>
+      </w:r>
+    </w:p>
+    <w:p>
+      <w:r>
+        <w:t>Esta seção consolida a validação específica do fluxo de deliberação pelo Centro Acadêmico, a correção aplicada durante a execução e os limites da confirmação em produção. Os resultados não autorizam declarar a plataforma livre de bugs; eles descrevem a cobertura efetivamente executada.</w:t>
       </w:r>
     </w:p>
     <w:p>
@@ -15405,7 +15665,7 @@
         <w:pStyle w:val="Heading2"/>
       </w:pPr>
       <w:r>
-        <w:t>Resultado do fluxo do Centro de Estudos</w:t>
+        <w:t>Resultado do fluxo do Centro Acadêmico</w:t>
       </w:r>
     </w:p>
     <w:tbl>
@@ -15552,7 +15812,7 @@
           </w:tcPr>
           <w:p>
             <w:r>
-              <w:t>Ata salva; solicitação marcada como utilizada; projeto 106 passou de Aguardando aprovação do Centro para Submetido.</w:t>
+              <w:t>Ata salva; solicitação marcada como utilizada; projeto 106 passou de Aguardando deliberação do Centro Acadêmico para Submetido.</w:t>
             </w:r>
           </w:p>
         </w:tc>
@@ -15841,7 +16101,7 @@
           </w:tcPr>
           <w:p>
             <w:r>
-              <w:t>49 testes concluídos com sucesso; check sem problemas; nenhuma migration pendente.</w:t>
+              <w:t>51 testes concluídos com sucesso; check sem problemas; nenhuma migration pendente.</w:t>
             </w:r>
           </w:p>
         </w:tc>
@@ -16001,7 +16261,7 @@
           </w:tcPr>
           <w:p>
             <w:r>
-              <w:t>Responsável do Centro de Estudos, sem autenticação</w:t>
+              <w:t>Responsável do Centro Acadêmico, sem autenticação</w:t>
             </w:r>
           </w:p>
         </w:tc>
@@ -16605,7 +16865,7 @@
           </w:tcPr>
           <w:p>
             <w:r>
-              <w:t>TESTE LUNAR 20260916 - CENTRO DE ESTUDOS FICTÍCIO (SOMENTE TESTE LOCAL - NÃO USAR EM PRODUÇÃO)</w:t>
+              <w:t>TESTE LUNAR 20260916 - CENTRO ACADÊMICO FICTÍCIO (SOMENTE TESTE LOCAL - NÃO USAR EM PRODUÇÃO)</w:t>
             </w:r>
           </w:p>
         </w:tc>
@@ -16828,7 +17088,7 @@
     </w:p>
     <w:p>
       <w:r>
-        <w:t>O fluxo do Centro de Estudos foi confirmado de ponta a ponta no ambiente local após a correção. Em produção, foi confirmado que a implantação aceita o contexto Origin: null e alcança a validação do token. O envio com um token de produção válido permanece sem execução para preservar o link de demonstração. Portanto, a funcionalidade está operacional dentro da cobertura descrita, mas a plataforma não deve ser considerada livre de bugs conhecidos enquanto o RISCO-001 e os demais casos ainda não executados estiverem pendentes.</w:t>
+        <w:t>O fluxo do Centro Acadêmico foi confirmado de ponta a ponta no ambiente local após a correção. Em produção, foi confirmado que a implantação aceita o contexto Origin: null e alcança a validação do token. O envio com um token de produção válido permanece sem execução para preservar o link de demonstração. Portanto, a funcionalidade está operacional dentro da cobertura descrita, mas a plataforma não deve ser considerada livre de bugs conhecidos enquanto o RISCO-001 e os demais casos ainda não executados estiverem pendentes.</w:t>
       </w:r>
     </w:p>
     <w:p>

</xml_diff>